<commit_message>
PRR §27: add Prod region derivation as production state option (Scenario 1 geography via weighted PS_Prod; Scenario 2 region unchanged)
</commit_message>
<xml_diff>
--- a/docs/acrme_production_readiness_review_and_architecture.docx
+++ b/docs/acrme_production_readiness_review_and_architecture.docx
@@ -7225,7 +7225,7 @@
     </w:p>
     <w:bookmarkEnd w:id="69"/>
     <w:bookmarkEnd w:id="70"/>
-    <w:bookmarkStart w:id="122" w:name="part-ii-final-architecture"/>
+    <w:bookmarkStart w:id="125" w:name="part-ii-final-architecture"/>
     <w:p>
       <w:pPr>
         <w:pStyle w:val="Heading1"/>
@@ -9456,7 +9456,7 @@
     </w:p>
     <w:bookmarkEnd w:id="86"/>
     <w:bookmarkEnd w:id="87"/>
-    <w:bookmarkStart w:id="89" w:name="region-selection-architecture"/>
+    <w:bookmarkStart w:id="92" w:name="region-selection-architecture"/>
     <w:p>
       <w:pPr>
         <w:pStyle w:val="Heading2"/>
@@ -9465,6 +9465,182 @@
         <w:t xml:space="preserve">27. Region Selection Architecture</w:t>
       </w:r>
     </w:p>
+    <w:bookmarkStart w:id="90" w:name="X9c38ba01d024cfb766ba58908e92421d953c77b"/>
+    <w:p>
+      <w:pPr>
+        <w:pStyle w:val="Heading3"/>
+      </w:pPr>
+      <w:r>
+        <w:t xml:space="preserve">Prod region input modes (geography vs. region)</w:t>
+      </w:r>
+    </w:p>
+    <w:p>
+      <w:pPr>
+        <w:pStyle w:val="FirstParagraph"/>
+      </w:pPr>
+      <w:r>
+        <w:t xml:space="preserve">The Prod region is the anchor of every placement: NonProd and DR are selected sequentially</w:t>
+      </w:r>
+      <w:r>
+        <w:t xml:space="preserve"> </w:t>
+      </w:r>
+      <w:r>
+        <w:rPr>
+          <w:iCs/>
+          <w:i/>
+        </w:rPr>
+        <w:t xml:space="preserve">from</w:t>
+      </w:r>
+      <w:r>
+        <w:t xml:space="preserve"> </w:t>
+      </w:r>
+      <w:r>
+        <w:t xml:space="preserve">the fixed Prod region (Section 4,</w:t>
+      </w:r>
+      <w:r>
+        <w:t xml:space="preserve"> </w:t>
+      </w:r>
+      <w:r>
+        <w:t xml:space="preserve">“</w:t>
+      </w:r>
+      <w:r>
+        <w:t xml:space="preserve">Sequential placement</w:t>
+      </w:r>
+      <w:r>
+        <w:t xml:space="preserve">”</w:t>
+      </w:r>
+      <w:r>
+        <w:t xml:space="preserve">). A customer may supply the Prod anchor in one of two ways, and the engine treats each as a distinct entry mode. [Undocumented — architectural judgement]</w:t>
+      </w:r>
+    </w:p>
+    <w:p>
+      <w:pPr>
+        <w:pStyle w:val="BodyText"/>
+      </w:pPr>
+      <w:r>
+        <w:rPr>
+          <w:bCs/>
+          <w:b/>
+        </w:rPr>
+        <w:t xml:space="preserve">Scenario 1 — Customer chooses an Azure geography (not a region).</w:t>
+      </w:r>
+      <w:r>
+        <w:t xml:space="preserve"> </w:t>
+      </w:r>
+      <w:r>
+        <w:t xml:space="preserve">The engine derives the Prod region itself, using the</w:t>
+      </w:r>
+      <w:r>
+        <w:t xml:space="preserve"> </w:t>
+      </w:r>
+      <w:r>
+        <w:rPr>
+          <w:bCs/>
+          <w:b/>
+        </w:rPr>
+        <w:t xml:space="preserve">same capacity-weighted scoring model</w:t>
+      </w:r>
+      <w:r>
+        <w:t xml:space="preserve"> </w:t>
+      </w:r>
+      <w:r>
+        <w:t xml:space="preserve">that already selects NonProd and DR (</w:t>
+      </w:r>
+      <w:r>
+        <w:rPr>
+          <w:rStyle w:val="VerbatimChar"/>
+        </w:rPr>
+        <w:t xml:space="preserve">PS_Prod</w:t>
+      </w:r>
+      <w:r>
+        <w:t xml:space="preserve">, Section 28), but restricted to the set of</w:t>
+      </w:r>
+      <w:r>
+        <w:t xml:space="preserve"> </w:t>
+      </w:r>
+      <w:r>
+        <w:rPr>
+          <w:bCs/>
+          <w:b/>
+        </w:rPr>
+        <w:t xml:space="preserve">approved production regions within the chosen geography</w:t>
+      </w:r>
+      <w:r>
+        <w:t xml:space="preserve">. The derivation adds one candidate-set filter (geography containment) ahead of the existing scorer; it introduces no new formula. Once the engine has derived the Prod region, that region becomes the fixed anchor and the</w:t>
+      </w:r>
+      <w:r>
+        <w:t xml:space="preserve"> </w:t>
+      </w:r>
+      <w:r>
+        <w:rPr>
+          <w:bCs/>
+          <w:b/>
+        </w:rPr>
+        <w:t xml:space="preserve">existing</w:t>
+      </w:r>
+      <w:r>
+        <w:t xml:space="preserve"> </w:t>
+      </w:r>
+      <w:r>
+        <w:t xml:space="preserve">sequential NonProd → DR selection runs unchanged. [Undocumented — architectural judgement]</w:t>
+      </w:r>
+    </w:p>
+    <w:p>
+      <w:pPr>
+        <w:pStyle w:val="BodyText"/>
+      </w:pPr>
+      <w:r>
+        <w:rPr>
+          <w:bCs/>
+          <w:b/>
+        </w:rPr>
+        <w:t xml:space="preserve">Scenario 2 — Customer provides a specific Azure region.</w:t>
+      </w:r>
+      <w:r>
+        <w:t xml:space="preserve"> </w:t>
+      </w:r>
+      <w:r>
+        <w:t xml:space="preserve">No change from the design described elsewhere in this document. The supplied region is validated against the hard constraints (Section 27,</w:t>
+      </w:r>
+      <w:r>
+        <w:t xml:space="preserve"> </w:t>
+      </w:r>
+      <w:r>
+        <w:t xml:space="preserve">“</w:t>
+      </w:r>
+      <w:r>
+        <w:t xml:space="preserve">Hard constraints</w:t>
+      </w:r>
+      <w:r>
+        <w:t xml:space="preserve">”</w:t>
+      </w:r>
+      <w:r>
+        <w:t xml:space="preserve">) and, if eligible, becomes the Prod anchor directly.</w:t>
+      </w:r>
+      <w:r>
+        <w:t xml:space="preserve"> </w:t>
+      </w:r>
+      <w:r>
+        <w:rPr>
+          <w:rStyle w:val="VerbatimChar"/>
+        </w:rPr>
+        <w:t xml:space="preserve">PS_Prod</w:t>
+      </w:r>
+      <w:r>
+        <w:t xml:space="preserve"> </w:t>
+      </w:r>
+      <w:r>
+        <w:t xml:space="preserve">is used only for post-selection validation, exactly as today. Sequential NonProd → DR selection proceeds unchanged. [Derived]</w:t>
+      </w:r>
+    </w:p>
+    <w:p>
+      <w:pPr>
+        <w:pStyle w:val="BodyText"/>
+      </w:pPr>
+      <w:r>
+        <w:t xml:space="preserve">The two modes converge at the same point — a fixed, validated Prod region — after which the downstream design is identical. Scenario 1 adds a single pre-step (geography → weighted Prod region); Scenario 2 skips that pre-step. [Undocumented — architectural judgement]</w:t>
+      </w:r>
+    </w:p>
     <w:p>
       <w:pPr>
         <w:pStyle w:val="SourceCode"/>
@@ -9482,6 +9658,462 @@
         <w:rPr>
           <w:rStyle w:val="VerbatimChar"/>
         </w:rPr>
+        <w:t xml:space="preserve">    Input[Placement Request] --&gt; Mode{Prod input mode}</w:t>
+      </w:r>
+      <w:r>
+        <w:br/>
+      </w:r>
+      <w:r>
+        <w:rPr>
+          <w:rStyle w:val="VerbatimChar"/>
+        </w:rPr>
+        <w:t xml:space="preserve">    Mode -- Geography --&gt; GeoFilter[Filter to approved Prod regions in geography]</w:t>
+      </w:r>
+      <w:r>
+        <w:br/>
+      </w:r>
+      <w:r>
+        <w:rPr>
+          <w:rStyle w:val="VerbatimChar"/>
+        </w:rPr>
+        <w:t xml:space="preserve">    GeoFilter --&gt; GeoConstraints[Apply hard constraints to candidates]</w:t>
+      </w:r>
+      <w:r>
+        <w:br/>
+      </w:r>
+      <w:r>
+        <w:rPr>
+          <w:rStyle w:val="VerbatimChar"/>
+        </w:rPr>
+        <w:t xml:space="preserve">    GeoConstraints --&gt; GeoEligible{Eligible Prod candidates exist}</w:t>
+      </w:r>
+      <w:r>
+        <w:br/>
+      </w:r>
+      <w:r>
+        <w:rPr>
+          <w:rStyle w:val="VerbatimChar"/>
+        </w:rPr>
+        <w:t xml:space="preserve">    GeoEligible -- No --&gt; GeoReject[Reject: no eligible Prod region in geography]</w:t>
+      </w:r>
+      <w:r>
+        <w:br/>
+      </w:r>
+      <w:r>
+        <w:rPr>
+          <w:rStyle w:val="VerbatimChar"/>
+        </w:rPr>
+        <w:t xml:space="preserve">    GeoEligible -- Yes --&gt; GeoScore[Score candidates with PS_Prod]</w:t>
+      </w:r>
+      <w:r>
+        <w:br/>
+      </w:r>
+      <w:r>
+        <w:rPr>
+          <w:rStyle w:val="VerbatimChar"/>
+        </w:rPr>
+        <w:t xml:space="preserve">    GeoScore --&gt; GeoPick[argmax PS_Prod = derived Prod region]</w:t>
+      </w:r>
+      <w:r>
+        <w:br/>
+      </w:r>
+      <w:r>
+        <w:rPr>
+          <w:rStyle w:val="VerbatimChar"/>
+        </w:rPr>
+        <w:t xml:space="preserve">    GeoPick --&gt; Anchor[Fixed Prod anchor]</w:t>
+      </w:r>
+      <w:r>
+        <w:br/>
+      </w:r>
+      <w:r>
+        <w:rPr>
+          <w:rStyle w:val="VerbatimChar"/>
+        </w:rPr>
+        <w:t xml:space="preserve">    Mode -- Region --&gt; Validate[Validate supplied region]</w:t>
+      </w:r>
+      <w:r>
+        <w:br/>
+      </w:r>
+      <w:r>
+        <w:rPr>
+          <w:rStyle w:val="VerbatimChar"/>
+        </w:rPr>
+        <w:t xml:space="preserve">    Validate --&gt; RegionOk{Region eligible}</w:t>
+      </w:r>
+      <w:r>
+        <w:br/>
+      </w:r>
+      <w:r>
+        <w:rPr>
+          <w:rStyle w:val="VerbatimChar"/>
+        </w:rPr>
+        <w:t xml:space="preserve">    RegionOk -- No --&gt; RegionReject[Reject or request alternative]</w:t>
+      </w:r>
+      <w:r>
+        <w:br/>
+      </w:r>
+      <w:r>
+        <w:rPr>
+          <w:rStyle w:val="VerbatimChar"/>
+        </w:rPr>
+        <w:t xml:space="preserve">    RegionOk -- Yes --&gt; Anchor</w:t>
+      </w:r>
+      <w:r>
+        <w:br/>
+      </w:r>
+      <w:r>
+        <w:rPr>
+          <w:rStyle w:val="VerbatimChar"/>
+        </w:rPr>
+        <w:t xml:space="preserve">    Anchor --&gt; Sequential[Existing sequential NonProd then DR selection]</w:t>
+      </w:r>
+    </w:p>
+    <w:bookmarkStart w:id="88" w:name="approved-production-regions-by-geography"/>
+    <w:p>
+      <w:pPr>
+        <w:pStyle w:val="Heading4"/>
+      </w:pPr>
+      <w:r>
+        <w:t xml:space="preserve">Approved production regions by geography</w:t>
+      </w:r>
+    </w:p>
+    <w:p>
+      <w:pPr>
+        <w:pStyle w:val="FirstParagraph"/>
+      </w:pPr>
+      <w:r>
+        <w:t xml:space="preserve">Scenario 1 draws candidates from a governed, version-controlled allow-list — an approved-region set is a governance decision, not a live Azure capability query, so a region existing in Azure does not make it eligible for production. [Undocumented — architectural judgement] The engine never crosses the geography boundary the customer selected. [Derived]</w:t>
+      </w:r>
+    </w:p>
+    <w:tbl>
+      <w:tblPr>
+        <w:tblStyle w:val="Table"/>
+        <w:tblW w:type="pct" w:w="5000"/>
+        <w:tblLook w:firstRow="1" w:lastRow="0" w:firstColumn="0" w:lastColumn="0" w:noHBand="0" w:noVBand="0" w:val="0020"/>
+      </w:tblPr>
+      <w:tblGrid>
+        <w:gridCol w:w="3960"/>
+        <w:gridCol w:w="3960"/>
+      </w:tblGrid>
+      <w:tr>
+        <w:trPr>
+          <w:tblHeader w:val="true"/>
+        </w:trPr>
+        <w:tc>
+          <w:tcPr/>
+          <w:p>
+            <w:pPr>
+              <w:pStyle w:val="Compact"/>
+              <w:jc w:val="left"/>
+            </w:pPr>
+            <w:r>
+              <w:t xml:space="preserve">Geography</w:t>
+            </w:r>
+          </w:p>
+        </w:tc>
+        <w:tc>
+          <w:tcPr/>
+          <w:p>
+            <w:pPr>
+              <w:pStyle w:val="Compact"/>
+              <w:jc w:val="left"/>
+            </w:pPr>
+            <w:r>
+              <w:t xml:space="preserve">Approved production regions</w:t>
+            </w:r>
+          </w:p>
+        </w:tc>
+      </w:tr>
+      <w:tr>
+        <w:tc>
+          <w:tcPr/>
+          <w:p>
+            <w:pPr>
+              <w:pStyle w:val="Compact"/>
+              <w:jc w:val="left"/>
+            </w:pPr>
+            <w:r>
+              <w:t xml:space="preserve">North America</w:t>
+            </w:r>
+          </w:p>
+        </w:tc>
+        <w:tc>
+          <w:tcPr/>
+          <w:p>
+            <w:pPr>
+              <w:pStyle w:val="Compact"/>
+              <w:jc w:val="left"/>
+            </w:pPr>
+            <w:r>
+              <w:t xml:space="preserve">West US 3, Central US, East US 2, Canada Central</w:t>
+            </w:r>
+          </w:p>
+        </w:tc>
+      </w:tr>
+      <w:tr>
+        <w:tc>
+          <w:tcPr/>
+          <w:p>
+            <w:pPr>
+              <w:pStyle w:val="Compact"/>
+              <w:jc w:val="left"/>
+            </w:pPr>
+            <w:r>
+              <w:t xml:space="preserve">Europe</w:t>
+            </w:r>
+          </w:p>
+        </w:tc>
+        <w:tc>
+          <w:tcPr/>
+          <w:p>
+            <w:pPr>
+              <w:pStyle w:val="Compact"/>
+              <w:jc w:val="left"/>
+            </w:pPr>
+            <w:r>
+              <w:t xml:space="preserve">North Europe, West Europe, Belgium Central, Sweden Central</w:t>
+            </w:r>
+          </w:p>
+        </w:tc>
+      </w:tr>
+      <w:tr>
+        <w:tc>
+          <w:tcPr/>
+          <w:p>
+            <w:pPr>
+              <w:pStyle w:val="Compact"/>
+              <w:jc w:val="left"/>
+            </w:pPr>
+            <w:r>
+              <w:t xml:space="preserve">Middle East</w:t>
+            </w:r>
+          </w:p>
+        </w:tc>
+        <w:tc>
+          <w:tcPr/>
+          <w:p>
+            <w:pPr>
+              <w:pStyle w:val="Compact"/>
+              <w:jc w:val="left"/>
+            </w:pPr>
+            <w:r>
+              <w:t xml:space="preserve">Saudi Arabia Central, UAE North</w:t>
+            </w:r>
+          </w:p>
+        </w:tc>
+      </w:tr>
+      <w:tr>
+        <w:tc>
+          <w:tcPr/>
+          <w:p>
+            <w:pPr>
+              <w:pStyle w:val="Compact"/>
+              <w:jc w:val="left"/>
+            </w:pPr>
+            <w:r>
+              <w:t xml:space="preserve">Asia Pacific</w:t>
+            </w:r>
+          </w:p>
+        </w:tc>
+        <w:tc>
+          <w:tcPr/>
+          <w:p>
+            <w:pPr>
+              <w:pStyle w:val="Compact"/>
+              <w:jc w:val="left"/>
+            </w:pPr>
+            <w:r>
+              <w:t xml:space="preserve">East Asia, Southeast Asia, Japan East, Australia East, Australia Southeast</w:t>
+            </w:r>
+          </w:p>
+        </w:tc>
+      </w:tr>
+    </w:tbl>
+    <w:p>
+      <w:pPr>
+        <w:pStyle w:val="BodyText"/>
+      </w:pPr>
+      <w:r>
+        <w:t xml:space="preserve">The allow-list is stored in</w:t>
+      </w:r>
+      <w:r>
+        <w:t xml:space="preserve"> </w:t>
+      </w:r>
+      <w:r>
+        <w:rPr>
+          <w:rStyle w:val="VerbatimChar"/>
+        </w:rPr>
+        <w:t xml:space="preserve">PlacementPolicy</w:t>
+      </w:r>
+      <w:r>
+        <w:t xml:space="preserve"> </w:t>
+      </w:r>
+      <w:r>
+        <w:t xml:space="preserve">(config-as-code, versioned and auditable) so that changes flow through the same policy-versioning and replay path as the scoring weights. [Undocumented — architectural judgement]</w:t>
+      </w:r>
+    </w:p>
+    <w:bookmarkEnd w:id="88"/>
+    <w:bookmarkStart w:id="89" w:name="scenario-1-derivation-semantics"/>
+    <w:p>
+      <w:pPr>
+        <w:pStyle w:val="Heading4"/>
+      </w:pPr>
+      <w:r>
+        <w:t xml:space="preserve">Scenario 1 derivation — semantics</w:t>
+      </w:r>
+    </w:p>
+    <w:p>
+      <w:pPr>
+        <w:numPr>
+          <w:ilvl w:val="0"/>
+          <w:numId w:val="1034"/>
+        </w:numPr>
+        <w:pStyle w:val="Compact"/>
+      </w:pPr>
+      <w:r>
+        <w:rPr>
+          <w:bCs/>
+          <w:b/>
+        </w:rPr>
+        <w:t xml:space="preserve">Candidate set:</w:t>
+      </w:r>
+      <w:r>
+        <w:t xml:space="preserve"> </w:t>
+      </w:r>
+      <w:r>
+        <w:t xml:space="preserve">the approved regions for the chosen geography, minus any region excluded by the hard constraints (capacity floor, quota floor, zone availability, separation class, snapshot freshness). [Derived]</w:t>
+      </w:r>
+    </w:p>
+    <w:p>
+      <w:pPr>
+        <w:numPr>
+          <w:ilvl w:val="0"/>
+          <w:numId w:val="1034"/>
+        </w:numPr>
+        <w:pStyle w:val="Compact"/>
+      </w:pPr>
+      <w:r>
+        <w:rPr>
+          <w:bCs/>
+          <w:b/>
+        </w:rPr>
+        <w:t xml:space="preserve">Scoring:</w:t>
+      </w:r>
+      <w:r>
+        <w:t xml:space="preserve"> </w:t>
+      </w:r>
+      <w:r>
+        <w:t xml:space="preserve">each surviving candidate is scored with</w:t>
+      </w:r>
+      <w:r>
+        <w:t xml:space="preserve"> </w:t>
+      </w:r>
+      <w:r>
+        <w:rPr>
+          <w:rStyle w:val="VerbatimChar"/>
+        </w:rPr>
+        <w:t xml:space="preserve">PS_Prod</w:t>
+      </w:r>
+      <w:r>
+        <w:t xml:space="preserve"> </w:t>
+      </w:r>
+      <w:r>
+        <w:t xml:space="preserve">from the same versioned regional snapshot used for NonProd/DR, so the Prod anchor is chosen on live capacity, quota headroom, distribution fairness, DR-coverage readiness, and zone diversity — identical signals to the rest of the model. [Derived]</w:t>
+      </w:r>
+    </w:p>
+    <w:p>
+      <w:pPr>
+        <w:numPr>
+          <w:ilvl w:val="0"/>
+          <w:numId w:val="1034"/>
+        </w:numPr>
+        <w:pStyle w:val="Compact"/>
+      </w:pPr>
+      <w:r>
+        <w:rPr>
+          <w:bCs/>
+          <w:b/>
+        </w:rPr>
+        <w:t xml:space="preserve">Selection:</w:t>
+      </w:r>
+      <w:r>
+        <w:t xml:space="preserve"> </w:t>
+      </w:r>
+      <w:r>
+        <w:rPr>
+          <w:rStyle w:val="VerbatimChar"/>
+        </w:rPr>
+        <w:t xml:space="preserve">argmax(PS_Prod)</w:t>
+      </w:r>
+      <w:r>
+        <w:t xml:space="preserve"> </w:t>
+      </w:r>
+      <w:r>
+        <w:t xml:space="preserve">over the eligible candidates; ties broken deterministically by the approved-list order (the first-listed region acts as the deterministic cold-start default when no snapshot exists yet or all scores tie). [Undocumented — architectural judgement]</w:t>
+      </w:r>
+    </w:p>
+    <w:p>
+      <w:pPr>
+        <w:numPr>
+          <w:ilvl w:val="0"/>
+          <w:numId w:val="1034"/>
+        </w:numPr>
+        <w:pStyle w:val="Compact"/>
+      </w:pPr>
+      <w:r>
+        <w:rPr>
+          <w:bCs/>
+          <w:b/>
+        </w:rPr>
+        <w:t xml:space="preserve">Determinism and audit:</w:t>
+      </w:r>
+      <w:r>
+        <w:t xml:space="preserve"> </w:t>
+      </w:r>
+      <w:r>
+        <w:t xml:space="preserve">the derivation is deterministic given a snapshot; the derived Prod region, every candidate score, and the policy version are written to the operation record alongside the subsequent NonProd/DR scores, so the full three-environment decision is replayable. [Undocumented — architectural judgement]</w:t>
+      </w:r>
+    </w:p>
+    <w:p>
+      <w:pPr>
+        <w:numPr>
+          <w:ilvl w:val="0"/>
+          <w:numId w:val="1034"/>
+        </w:numPr>
+        <w:pStyle w:val="Compact"/>
+      </w:pPr>
+      <w:r>
+        <w:rPr>
+          <w:bCs/>
+          <w:b/>
+        </w:rPr>
+        <w:t xml:space="preserve">Exhaustion:</w:t>
+      </w:r>
+      <w:r>
+        <w:t xml:space="preserve"> </w:t>
+      </w:r>
+      <w:r>
+        <w:t xml:space="preserve">if no approved region in the geography is eligible, the request is rejected with a geography-scoped exhaustion error rather than silently falling back to a region outside the geography. [Derived]</w:t>
+      </w:r>
+    </w:p>
+    <w:p>
+      <w:pPr>
+        <w:pStyle w:val="SourceCode"/>
+      </w:pPr>
+      <w:r>
+        <w:rPr>
+          <w:rStyle w:val="VerbatimChar"/>
+        </w:rPr>
+        <w:t xml:space="preserve">flowchart TD</w:t>
+      </w:r>
+      <w:r>
+        <w:br/>
+      </w:r>
+      <w:r>
+        <w:rPr>
+          <w:rStyle w:val="VerbatimChar"/>
+        </w:rPr>
         <w:t xml:space="preserve">    Request[Placement Request] --&gt; Load[Load Versioned Snapshots]</w:t>
       </w:r>
       <w:r>
@@ -9602,7 +10234,9 @@
         <w:t xml:space="preserve">    Assignment --&gt; Reconcile[Confirm Azure and Engine State]</w:t>
       </w:r>
     </w:p>
-    <w:bookmarkStart w:id="88" w:name="hard-constraints"/>
+    <w:bookmarkEnd w:id="89"/>
+    <w:bookmarkEnd w:id="90"/>
+    <w:bookmarkStart w:id="91" w:name="hard-constraints"/>
     <w:p>
       <w:pPr>
         <w:pStyle w:val="Heading3"/>
@@ -9615,7 +10249,19 @@
       <w:pPr>
         <w:numPr>
           <w:ilvl w:val="0"/>
-          <w:numId w:val="1034"/>
+          <w:numId w:val="1035"/>
+        </w:numPr>
+        <w:pStyle w:val="Compact"/>
+      </w:pPr>
+      <w:r>
+        <w:t xml:space="preserve">In Scenario 1 (geography input), the derived Prod region must be a member of the approved production-region set for the customer’s chosen geography; the engine never selects a Prod region outside that geography. [Undocumented — architectural judgement]</w:t>
+      </w:r>
+    </w:p>
+    <w:p>
+      <w:pPr>
+        <w:numPr>
+          <w:ilvl w:val="0"/>
+          <w:numId w:val="1035"/>
         </w:numPr>
         <w:pStyle w:val="Compact"/>
       </w:pPr>
@@ -9627,7 +10273,7 @@
       <w:pPr>
         <w:numPr>
           <w:ilvl w:val="0"/>
-          <w:numId w:val="1034"/>
+          <w:numId w:val="1035"/>
         </w:numPr>
         <w:pStyle w:val="Compact"/>
       </w:pPr>
@@ -9639,7 +10285,7 @@
       <w:pPr>
         <w:numPr>
           <w:ilvl w:val="0"/>
-          <w:numId w:val="1034"/>
+          <w:numId w:val="1035"/>
         </w:numPr>
         <w:pStyle w:val="Compact"/>
       </w:pPr>
@@ -9651,7 +10297,7 @@
       <w:pPr>
         <w:numPr>
           <w:ilvl w:val="0"/>
-          <w:numId w:val="1034"/>
+          <w:numId w:val="1035"/>
         </w:numPr>
         <w:pStyle w:val="Compact"/>
       </w:pPr>
@@ -9663,7 +10309,7 @@
       <w:pPr>
         <w:numPr>
           <w:ilvl w:val="0"/>
-          <w:numId w:val="1034"/>
+          <w:numId w:val="1035"/>
         </w:numPr>
         <w:pStyle w:val="Compact"/>
       </w:pPr>
@@ -9675,7 +10321,7 @@
       <w:pPr>
         <w:numPr>
           <w:ilvl w:val="0"/>
-          <w:numId w:val="1034"/>
+          <w:numId w:val="1035"/>
         </w:numPr>
         <w:pStyle w:val="Compact"/>
       </w:pPr>
@@ -9687,362 +10333,362 @@
       <w:pPr>
         <w:numPr>
           <w:ilvl w:val="0"/>
-          <w:numId w:val="1034"/>
+          <w:numId w:val="1035"/>
         </w:numPr>
         <w:pStyle w:val="Compact"/>
       </w:pPr>
       <w:r>
         <w:t xml:space="preserve">A capacity hold must be acquired before assignment. [Undocumented — architectural judgement]</w:t>
-      </w:r>
-    </w:p>
-    <w:bookmarkEnd w:id="88"/>
-    <w:bookmarkEnd w:id="89"/>
-    <w:bookmarkStart w:id="92" w:name="placement-scoring-and-forecasting"/>
-    <w:p>
-      <w:pPr>
-        <w:pStyle w:val="Heading2"/>
-      </w:pPr>
-      <w:r>
-        <w:t xml:space="preserve">28. Placement Scoring and Forecasting</w:t>
-      </w:r>
-    </w:p>
-    <w:p>
-      <w:pPr>
-        <w:pStyle w:val="SourceCode"/>
-      </w:pPr>
-      <w:r>
-        <w:rPr>
-          <w:rStyle w:val="VerbatimChar"/>
-        </w:rPr>
-        <w:t xml:space="preserve">flowchart LR</w:t>
-      </w:r>
-      <w:r>
-        <w:br/>
-      </w:r>
-      <w:r>
-        <w:rPr>
-          <w:rStyle w:val="VerbatimChar"/>
-        </w:rPr>
-        <w:t xml:space="preserve">    Capacity[CRG Capacity Signal] --&gt; Formula[Placement Formula]</w:t>
-      </w:r>
-      <w:r>
-        <w:br/>
-      </w:r>
-      <w:r>
-        <w:rPr>
-          <w:rStyle w:val="VerbatimChar"/>
-        </w:rPr>
-        <w:t xml:space="preserve">    Quota[Quota Headroom Signal] --&gt; Formula</w:t>
-      </w:r>
-      <w:r>
-        <w:br/>
-      </w:r>
-      <w:r>
-        <w:rPr>
-          <w:rStyle w:val="VerbatimChar"/>
-        </w:rPr>
-        <w:t xml:space="preserve">    Distribution[Capacity Weighted Distribution] --&gt; Formula</w:t>
-      </w:r>
-      <w:r>
-        <w:br/>
-      </w:r>
-      <w:r>
-        <w:rPr>
-          <w:rStyle w:val="VerbatimChar"/>
-        </w:rPr>
-        <w:t xml:space="preserve">    DRHealth[DR Coverage Signal] --&gt; Formula</w:t>
-      </w:r>
-      <w:r>
-        <w:br/>
-      </w:r>
-      <w:r>
-        <w:rPr>
-          <w:rStyle w:val="VerbatimChar"/>
-        </w:rPr>
-        <w:t xml:space="preserve">    Zones[Zone Diversity Signal] --&gt; Formula</w:t>
-      </w:r>
-      <w:r>
-        <w:br/>
-      </w:r>
-      <w:r>
-        <w:rPr>
-          <w:rStyle w:val="VerbatimChar"/>
-        </w:rPr>
-        <w:t xml:space="preserve">    Formula --&gt; Clamp[Clamp Each Component]</w:t>
-      </w:r>
-      <w:r>
-        <w:br/>
-      </w:r>
-      <w:r>
-        <w:rPr>
-          <w:rStyle w:val="VerbatimChar"/>
-        </w:rPr>
-        <w:t xml:space="preserve">    Clamp --&gt; Score[Score from Zero to One]</w:t>
-      </w:r>
-      <w:r>
-        <w:br/>
-      </w:r>
-      <w:r>
-        <w:rPr>
-          <w:rStyle w:val="VerbatimChar"/>
-        </w:rPr>
-        <w:t xml:space="preserve">    Score --&gt; Audit[Persist Inputs and Policy Version]</w:t>
-      </w:r>
-    </w:p>
-    <w:bookmarkStart w:id="90" w:name="corrected-scoring-model"/>
-    <w:p>
-      <w:pPr>
-        <w:pStyle w:val="Heading3"/>
-      </w:pPr>
-      <w:r>
-        <w:t xml:space="preserve">Corrected scoring model</w:t>
-      </w:r>
-    </w:p>
-    <w:p>
-      <w:pPr>
-        <w:pStyle w:val="FirstParagraph"/>
-      </w:pPr>
-      <w:r>
-        <w:t xml:space="preserve">The original default weights are retained for pilot comparison:</w:t>
-      </w:r>
-    </w:p>
-    <w:p>
-      <w:pPr>
-        <w:pStyle w:val="BodyText"/>
-      </w:pPr>
-      <w:r>
-        <w:rPr>
-          <w:rStyle w:val="VerbatimChar"/>
-        </w:rPr>
-        <w:t xml:space="preserve">alpha = 0.30, beta = 0.20, gamma = 0.25, delta = 0.15, epsilon = 0.10</w:t>
-      </w:r>
-    </w:p>
-    <w:p>
-      <w:pPr>
-        <w:pStyle w:val="BodyText"/>
-      </w:pPr>
-      <w:r>
-        <w:t xml:space="preserve">[Assumed]</w:t>
-      </w:r>
-    </w:p>
-    <w:p>
-      <w:pPr>
-        <w:pStyle w:val="BodyText"/>
-      </w:pPr>
-      <w:r>
-        <w:t xml:space="preserve">Each raw ratio must be clamped:</w:t>
-      </w:r>
-    </w:p>
-    <w:p>
-      <w:pPr>
-        <w:pStyle w:val="BodyText"/>
-      </w:pPr>
-      <w:r>
-        <w:rPr>
-          <w:rStyle w:val="VerbatimChar"/>
-        </w:rPr>
-        <w:t xml:space="preserve">Clamp(x) = max(0, min(1, x))</w:t>
-      </w:r>
-    </w:p>
-    <w:p>
-      <w:pPr>
-        <w:pStyle w:val="BodyText"/>
-      </w:pPr>
-      <w:r>
-        <w:t xml:space="preserve">[Undocumented — architectural judgement]</w:t>
-      </w:r>
-    </w:p>
-    <w:p>
-      <w:pPr>
-        <w:pStyle w:val="BodyText"/>
-      </w:pPr>
-      <w:r>
-        <w:t xml:space="preserve">The NonProd formula should not duplicate the same signal under alpha and delta. [Undocumented — architectural judgement] For pilot implementation:</w:t>
-      </w:r>
-    </w:p>
-    <w:p>
-      <w:pPr>
-        <w:pStyle w:val="BodyText"/>
-      </w:pPr>
-      <w:r>
-        <w:rPr>
-          <w:rStyle w:val="VerbatimChar"/>
-        </w:rPr>
-        <w:t xml:space="preserve">PS_NonProd = 0.35 Capacity + 0.25 Quota + 0.25 Distribution + 0.05 DR_Overflow_Integrity + 0.10 Zones</w:t>
-      </w:r>
-    </w:p>
-    <w:p>
-      <w:pPr>
-        <w:pStyle w:val="BodyText"/>
-      </w:pPr>
-      <w:r>
-        <w:t xml:space="preserve">[Undocumented — architectural judgement]</w:t>
-      </w:r>
-    </w:p>
-    <w:p>
-      <w:pPr>
-        <w:pStyle w:val="BodyText"/>
-      </w:pPr>
-      <w:r>
-        <w:t xml:space="preserve">The revised weights are proposed, not empirically validated. [Assumed]</w:t>
-      </w:r>
-    </w:p>
-    <w:p>
-      <w:pPr>
-        <w:pStyle w:val="BodyText"/>
-      </w:pPr>
-      <w:r>
-        <w:t xml:space="preserve">Distribution should use demand units rather than customer count:</w:t>
-      </w:r>
-    </w:p>
-    <w:p>
-      <w:pPr>
-        <w:pStyle w:val="BodyText"/>
-      </w:pPr>
-      <w:r>
-        <w:rPr>
-          <w:rStyle w:val="VerbatimChar"/>
-        </w:rPr>
-        <w:t xml:space="preserve">Distribution = 1 - Region_Assigned_Demand / Total_Assigned_Demand</w:t>
-      </w:r>
-    </w:p>
-    <w:p>
-      <w:pPr>
-        <w:pStyle w:val="BodyText"/>
-      </w:pPr>
-      <w:r>
-        <w:t xml:space="preserve">[Undocumented — architectural judgement]</w:t>
-      </w:r>
-    </w:p>
-    <w:bookmarkEnd w:id="90"/>
-    <w:bookmarkStart w:id="91" w:name="forecast-formula"/>
-    <w:p>
-      <w:pPr>
-        <w:pStyle w:val="Heading3"/>
-      </w:pPr>
-      <w:r>
-        <w:t xml:space="preserve">Forecast formula</w:t>
-      </w:r>
-    </w:p>
-    <w:p>
-      <w:pPr>
-        <w:pStyle w:val="FirstParagraph"/>
-      </w:pPr>
-      <w:r>
-        <w:rPr>
-          <w:rStyle w:val="VerbatimChar"/>
-        </w:rPr>
-        <w:t xml:space="preserve">Forecast_Quantity = ceil(Forecast_Peak × (1 + Growth_Buffer) + DR_Buffer)</w:t>
-      </w:r>
-    </w:p>
-    <w:p>
-      <w:pPr>
-        <w:pStyle w:val="BodyText"/>
-      </w:pPr>
-      <w:r>
-        <w:t xml:space="preserve">[Derived]</w:t>
-      </w:r>
-    </w:p>
-    <w:p>
-      <w:pPr>
-        <w:pStyle w:val="BodyText"/>
-      </w:pPr>
-      <w:r>
-        <w:t xml:space="preserve">Variables:</w:t>
-      </w:r>
-    </w:p>
-    <w:p>
-      <w:pPr>
-        <w:numPr>
-          <w:ilvl w:val="0"/>
-          <w:numId w:val="1035"/>
-        </w:numPr>
-        <w:pStyle w:val="Compact"/>
-      </w:pPr>
-      <w:r>
-        <w:rPr>
-          <w:rStyle w:val="VerbatimChar"/>
-        </w:rPr>
-        <w:t xml:space="preserve">Forecast_Peak</w:t>
-      </w:r>
-      <w:r>
-        <w:t xml:space="preserve">: predicted peak associated VM demand in the horizon. [Derived]</w:t>
-      </w:r>
-    </w:p>
-    <w:p>
-      <w:pPr>
-        <w:numPr>
-          <w:ilvl w:val="0"/>
-          <w:numId w:val="1035"/>
-        </w:numPr>
-        <w:pStyle w:val="Compact"/>
-      </w:pPr>
-      <w:r>
-        <w:rPr>
-          <w:rStyle w:val="VerbatimChar"/>
-        </w:rPr>
-        <w:t xml:space="preserve">Growth_Buffer</w:t>
-      </w:r>
-      <w:r>
-        <w:t xml:space="preserve">: policy percentage for forecast uncertainty. [Assumed]</w:t>
-      </w:r>
-    </w:p>
-    <w:p>
-      <w:pPr>
-        <w:numPr>
-          <w:ilvl w:val="0"/>
-          <w:numId w:val="1035"/>
-        </w:numPr>
-        <w:pStyle w:val="Compact"/>
-      </w:pPr>
-      <w:r>
-        <w:rPr>
-          <w:rStyle w:val="VerbatimChar"/>
-        </w:rPr>
-        <w:t xml:space="preserve">DR_Buffer</w:t>
-      </w:r>
-      <w:r>
-        <w:t xml:space="preserve">: additional units required by the approved recovery policy. [Assumed]</w:t>
-      </w:r>
-    </w:p>
-    <w:p>
-      <w:pPr>
-        <w:numPr>
-          <w:ilvl w:val="0"/>
-          <w:numId w:val="1035"/>
-        </w:numPr>
-        <w:pStyle w:val="Compact"/>
-      </w:pPr>
-      <w:r>
-        <w:rPr>
-          <w:rStyle w:val="VerbatimChar"/>
-        </w:rPr>
-        <w:t xml:space="preserve">Forecast_Horizon</w:t>
-      </w:r>
-      <w:r>
-        <w:t xml:space="preserve">: 30, 60, or 90 days in the original design. [Assumed]</w:t>
-      </w:r>
-    </w:p>
-    <w:p>
-      <w:pPr>
-        <w:pStyle w:val="FirstParagraph"/>
-      </w:pPr>
-      <w:r>
-        <w:t xml:space="preserve">Forecast recommendations remain advisory until model accuracy and false-positive rates are measured. [Undocumented — architectural judgement]</w:t>
       </w:r>
     </w:p>
     <w:bookmarkEnd w:id="91"/>
     <w:bookmarkEnd w:id="92"/>
-    <w:bookmarkStart w:id="96" w:name="state-model-and-concurrency-controls"/>
+    <w:bookmarkStart w:id="95" w:name="placement-scoring-and-forecasting"/>
     <w:p>
       <w:pPr>
         <w:pStyle w:val="Heading2"/>
       </w:pPr>
       <w:r>
+        <w:t xml:space="preserve">28. Placement Scoring and Forecasting</w:t>
+      </w:r>
+    </w:p>
+    <w:p>
+      <w:pPr>
+        <w:pStyle w:val="SourceCode"/>
+      </w:pPr>
+      <w:r>
+        <w:rPr>
+          <w:rStyle w:val="VerbatimChar"/>
+        </w:rPr>
+        <w:t xml:space="preserve">flowchart LR</w:t>
+      </w:r>
+      <w:r>
+        <w:br/>
+      </w:r>
+      <w:r>
+        <w:rPr>
+          <w:rStyle w:val="VerbatimChar"/>
+        </w:rPr>
+        <w:t xml:space="preserve">    Capacity[CRG Capacity Signal] --&gt; Formula[Placement Formula]</w:t>
+      </w:r>
+      <w:r>
+        <w:br/>
+      </w:r>
+      <w:r>
+        <w:rPr>
+          <w:rStyle w:val="VerbatimChar"/>
+        </w:rPr>
+        <w:t xml:space="preserve">    Quota[Quota Headroom Signal] --&gt; Formula</w:t>
+      </w:r>
+      <w:r>
+        <w:br/>
+      </w:r>
+      <w:r>
+        <w:rPr>
+          <w:rStyle w:val="VerbatimChar"/>
+        </w:rPr>
+        <w:t xml:space="preserve">    Distribution[Capacity Weighted Distribution] --&gt; Formula</w:t>
+      </w:r>
+      <w:r>
+        <w:br/>
+      </w:r>
+      <w:r>
+        <w:rPr>
+          <w:rStyle w:val="VerbatimChar"/>
+        </w:rPr>
+        <w:t xml:space="preserve">    DRHealth[DR Coverage Signal] --&gt; Formula</w:t>
+      </w:r>
+      <w:r>
+        <w:br/>
+      </w:r>
+      <w:r>
+        <w:rPr>
+          <w:rStyle w:val="VerbatimChar"/>
+        </w:rPr>
+        <w:t xml:space="preserve">    Zones[Zone Diversity Signal] --&gt; Formula</w:t>
+      </w:r>
+      <w:r>
+        <w:br/>
+      </w:r>
+      <w:r>
+        <w:rPr>
+          <w:rStyle w:val="VerbatimChar"/>
+        </w:rPr>
+        <w:t xml:space="preserve">    Formula --&gt; Clamp[Clamp Each Component]</w:t>
+      </w:r>
+      <w:r>
+        <w:br/>
+      </w:r>
+      <w:r>
+        <w:rPr>
+          <w:rStyle w:val="VerbatimChar"/>
+        </w:rPr>
+        <w:t xml:space="preserve">    Clamp --&gt; Score[Score from Zero to One]</w:t>
+      </w:r>
+      <w:r>
+        <w:br/>
+      </w:r>
+      <w:r>
+        <w:rPr>
+          <w:rStyle w:val="VerbatimChar"/>
+        </w:rPr>
+        <w:t xml:space="preserve">    Score --&gt; Audit[Persist Inputs and Policy Version]</w:t>
+      </w:r>
+    </w:p>
+    <w:bookmarkStart w:id="93" w:name="corrected-scoring-model"/>
+    <w:p>
+      <w:pPr>
+        <w:pStyle w:val="Heading3"/>
+      </w:pPr>
+      <w:r>
+        <w:t xml:space="preserve">Corrected scoring model</w:t>
+      </w:r>
+    </w:p>
+    <w:p>
+      <w:pPr>
+        <w:pStyle w:val="FirstParagraph"/>
+      </w:pPr>
+      <w:r>
+        <w:t xml:space="preserve">The original default weights are retained for pilot comparison:</w:t>
+      </w:r>
+    </w:p>
+    <w:p>
+      <w:pPr>
+        <w:pStyle w:val="BodyText"/>
+      </w:pPr>
+      <w:r>
+        <w:rPr>
+          <w:rStyle w:val="VerbatimChar"/>
+        </w:rPr>
+        <w:t xml:space="preserve">alpha = 0.30, beta = 0.20, gamma = 0.25, delta = 0.15, epsilon = 0.10</w:t>
+      </w:r>
+    </w:p>
+    <w:p>
+      <w:pPr>
+        <w:pStyle w:val="BodyText"/>
+      </w:pPr>
+      <w:r>
+        <w:t xml:space="preserve">[Assumed]</w:t>
+      </w:r>
+    </w:p>
+    <w:p>
+      <w:pPr>
+        <w:pStyle w:val="BodyText"/>
+      </w:pPr>
+      <w:r>
+        <w:t xml:space="preserve">Each raw ratio must be clamped:</w:t>
+      </w:r>
+    </w:p>
+    <w:p>
+      <w:pPr>
+        <w:pStyle w:val="BodyText"/>
+      </w:pPr>
+      <w:r>
+        <w:rPr>
+          <w:rStyle w:val="VerbatimChar"/>
+        </w:rPr>
+        <w:t xml:space="preserve">Clamp(x) = max(0, min(1, x))</w:t>
+      </w:r>
+    </w:p>
+    <w:p>
+      <w:pPr>
+        <w:pStyle w:val="BodyText"/>
+      </w:pPr>
+      <w:r>
+        <w:t xml:space="preserve">[Undocumented — architectural judgement]</w:t>
+      </w:r>
+    </w:p>
+    <w:p>
+      <w:pPr>
+        <w:pStyle w:val="BodyText"/>
+      </w:pPr>
+      <w:r>
+        <w:t xml:space="preserve">The NonProd formula should not duplicate the same signal under alpha and delta. [Undocumented — architectural judgement] For pilot implementation:</w:t>
+      </w:r>
+    </w:p>
+    <w:p>
+      <w:pPr>
+        <w:pStyle w:val="BodyText"/>
+      </w:pPr>
+      <w:r>
+        <w:rPr>
+          <w:rStyle w:val="VerbatimChar"/>
+        </w:rPr>
+        <w:t xml:space="preserve">PS_NonProd = 0.35 Capacity + 0.25 Quota + 0.25 Distribution + 0.05 DR_Overflow_Integrity + 0.10 Zones</w:t>
+      </w:r>
+    </w:p>
+    <w:p>
+      <w:pPr>
+        <w:pStyle w:val="BodyText"/>
+      </w:pPr>
+      <w:r>
+        <w:t xml:space="preserve">[Undocumented — architectural judgement]</w:t>
+      </w:r>
+    </w:p>
+    <w:p>
+      <w:pPr>
+        <w:pStyle w:val="BodyText"/>
+      </w:pPr>
+      <w:r>
+        <w:t xml:space="preserve">The revised weights are proposed, not empirically validated. [Assumed]</w:t>
+      </w:r>
+    </w:p>
+    <w:p>
+      <w:pPr>
+        <w:pStyle w:val="BodyText"/>
+      </w:pPr>
+      <w:r>
+        <w:t xml:space="preserve">Distribution should use demand units rather than customer count:</w:t>
+      </w:r>
+    </w:p>
+    <w:p>
+      <w:pPr>
+        <w:pStyle w:val="BodyText"/>
+      </w:pPr>
+      <w:r>
+        <w:rPr>
+          <w:rStyle w:val="VerbatimChar"/>
+        </w:rPr>
+        <w:t xml:space="preserve">Distribution = 1 - Region_Assigned_Demand / Total_Assigned_Demand</w:t>
+      </w:r>
+    </w:p>
+    <w:p>
+      <w:pPr>
+        <w:pStyle w:val="BodyText"/>
+      </w:pPr>
+      <w:r>
+        <w:t xml:space="preserve">[Undocumented — architectural judgement]</w:t>
+      </w:r>
+    </w:p>
+    <w:bookmarkEnd w:id="93"/>
+    <w:bookmarkStart w:id="94" w:name="forecast-formula"/>
+    <w:p>
+      <w:pPr>
+        <w:pStyle w:val="Heading3"/>
+      </w:pPr>
+      <w:r>
+        <w:t xml:space="preserve">Forecast formula</w:t>
+      </w:r>
+    </w:p>
+    <w:p>
+      <w:pPr>
+        <w:pStyle w:val="FirstParagraph"/>
+      </w:pPr>
+      <w:r>
+        <w:rPr>
+          <w:rStyle w:val="VerbatimChar"/>
+        </w:rPr>
+        <w:t xml:space="preserve">Forecast_Quantity = ceil(Forecast_Peak × (1 + Growth_Buffer) + DR_Buffer)</w:t>
+      </w:r>
+    </w:p>
+    <w:p>
+      <w:pPr>
+        <w:pStyle w:val="BodyText"/>
+      </w:pPr>
+      <w:r>
+        <w:t xml:space="preserve">[Derived]</w:t>
+      </w:r>
+    </w:p>
+    <w:p>
+      <w:pPr>
+        <w:pStyle w:val="BodyText"/>
+      </w:pPr>
+      <w:r>
+        <w:t xml:space="preserve">Variables:</w:t>
+      </w:r>
+    </w:p>
+    <w:p>
+      <w:pPr>
+        <w:numPr>
+          <w:ilvl w:val="0"/>
+          <w:numId w:val="1036"/>
+        </w:numPr>
+        <w:pStyle w:val="Compact"/>
+      </w:pPr>
+      <w:r>
+        <w:rPr>
+          <w:rStyle w:val="VerbatimChar"/>
+        </w:rPr>
+        <w:t xml:space="preserve">Forecast_Peak</w:t>
+      </w:r>
+      <w:r>
+        <w:t xml:space="preserve">: predicted peak associated VM demand in the horizon. [Derived]</w:t>
+      </w:r>
+    </w:p>
+    <w:p>
+      <w:pPr>
+        <w:numPr>
+          <w:ilvl w:val="0"/>
+          <w:numId w:val="1036"/>
+        </w:numPr>
+        <w:pStyle w:val="Compact"/>
+      </w:pPr>
+      <w:r>
+        <w:rPr>
+          <w:rStyle w:val="VerbatimChar"/>
+        </w:rPr>
+        <w:t xml:space="preserve">Growth_Buffer</w:t>
+      </w:r>
+      <w:r>
+        <w:t xml:space="preserve">: policy percentage for forecast uncertainty. [Assumed]</w:t>
+      </w:r>
+    </w:p>
+    <w:p>
+      <w:pPr>
+        <w:numPr>
+          <w:ilvl w:val="0"/>
+          <w:numId w:val="1036"/>
+        </w:numPr>
+        <w:pStyle w:val="Compact"/>
+      </w:pPr>
+      <w:r>
+        <w:rPr>
+          <w:rStyle w:val="VerbatimChar"/>
+        </w:rPr>
+        <w:t xml:space="preserve">DR_Buffer</w:t>
+      </w:r>
+      <w:r>
+        <w:t xml:space="preserve">: additional units required by the approved recovery policy. [Assumed]</w:t>
+      </w:r>
+    </w:p>
+    <w:p>
+      <w:pPr>
+        <w:numPr>
+          <w:ilvl w:val="0"/>
+          <w:numId w:val="1036"/>
+        </w:numPr>
+        <w:pStyle w:val="Compact"/>
+      </w:pPr>
+      <w:r>
+        <w:rPr>
+          <w:rStyle w:val="VerbatimChar"/>
+        </w:rPr>
+        <w:t xml:space="preserve">Forecast_Horizon</w:t>
+      </w:r>
+      <w:r>
+        <w:t xml:space="preserve">: 30, 60, or 90 days in the original design. [Assumed]</w:t>
+      </w:r>
+    </w:p>
+    <w:p>
+      <w:pPr>
+        <w:pStyle w:val="FirstParagraph"/>
+      </w:pPr>
+      <w:r>
+        <w:t xml:space="preserve">Forecast recommendations remain advisory until model accuracy and false-positive rates are measured. [Undocumented — architectural judgement]</w:t>
+      </w:r>
+    </w:p>
+    <w:bookmarkEnd w:id="94"/>
+    <w:bookmarkEnd w:id="95"/>
+    <w:bookmarkStart w:id="99" w:name="state-model-and-concurrency-controls"/>
+    <w:p>
+      <w:pPr>
+        <w:pStyle w:val="Heading2"/>
+      </w:pPr>
+      <w:r>
         <w:t xml:space="preserve">29. State Model and Concurrency Controls</w:t>
       </w:r>
     </w:p>
-    <w:bookmarkStart w:id="93" w:name="engine-state-machine"/>
+    <w:bookmarkStart w:id="96" w:name="engine-state-machine"/>
     <w:p>
       <w:pPr>
         <w:pStyle w:val="Heading3"/>
@@ -10169,8 +10815,8 @@
         <w:t xml:space="preserve">The engine state machine is a production blocker until this model is implemented with conditional writes, transition guards, and recovery tests. [Undocumented — architectural judgement]</w:t>
       </w:r>
     </w:p>
-    <w:bookmarkEnd w:id="93"/>
-    <w:bookmarkStart w:id="94" w:name="state-entity"/>
+    <w:bookmarkEnd w:id="96"/>
+    <w:bookmarkStart w:id="97" w:name="state-entity"/>
     <w:p>
       <w:pPr>
         <w:pStyle w:val="Heading3"/>
@@ -10200,7 +10846,7 @@
       <w:pPr>
         <w:numPr>
           <w:ilvl w:val="0"/>
-          <w:numId w:val="1036"/>
+          <w:numId w:val="1037"/>
         </w:numPr>
         <w:pStyle w:val="Compact"/>
       </w:pPr>
@@ -10212,7 +10858,7 @@
       <w:pPr>
         <w:numPr>
           <w:ilvl w:val="0"/>
-          <w:numId w:val="1036"/>
+          <w:numId w:val="1037"/>
         </w:numPr>
         <w:pStyle w:val="Compact"/>
       </w:pPr>
@@ -10224,7 +10870,7 @@
       <w:pPr>
         <w:numPr>
           <w:ilvl w:val="0"/>
-          <w:numId w:val="1036"/>
+          <w:numId w:val="1037"/>
         </w:numPr>
         <w:pStyle w:val="Compact"/>
       </w:pPr>
@@ -10236,7 +10882,7 @@
       <w:pPr>
         <w:numPr>
           <w:ilvl w:val="0"/>
-          <w:numId w:val="1036"/>
+          <w:numId w:val="1037"/>
         </w:numPr>
         <w:pStyle w:val="Compact"/>
       </w:pPr>
@@ -10248,7 +10894,7 @@
       <w:pPr>
         <w:numPr>
           <w:ilvl w:val="0"/>
-          <w:numId w:val="1036"/>
+          <w:numId w:val="1037"/>
         </w:numPr>
         <w:pStyle w:val="Compact"/>
       </w:pPr>
@@ -10260,7 +10906,7 @@
       <w:pPr>
         <w:numPr>
           <w:ilvl w:val="0"/>
-          <w:numId w:val="1036"/>
+          <w:numId w:val="1037"/>
         </w:numPr>
         <w:pStyle w:val="Compact"/>
       </w:pPr>
@@ -10272,7 +10918,7 @@
       <w:pPr>
         <w:numPr>
           <w:ilvl w:val="0"/>
-          <w:numId w:val="1036"/>
+          <w:numId w:val="1037"/>
         </w:numPr>
         <w:pStyle w:val="Compact"/>
       </w:pPr>
@@ -10284,7 +10930,7 @@
       <w:pPr>
         <w:numPr>
           <w:ilvl w:val="0"/>
-          <w:numId w:val="1036"/>
+          <w:numId w:val="1037"/>
         </w:numPr>
         <w:pStyle w:val="Compact"/>
       </w:pPr>
@@ -10296,7 +10942,7 @@
       <w:pPr>
         <w:numPr>
           <w:ilvl w:val="0"/>
-          <w:numId w:val="1036"/>
+          <w:numId w:val="1037"/>
         </w:numPr>
         <w:pStyle w:val="Compact"/>
       </w:pPr>
@@ -10308,7 +10954,7 @@
       <w:pPr>
         <w:numPr>
           <w:ilvl w:val="0"/>
-          <w:numId w:val="1036"/>
+          <w:numId w:val="1037"/>
         </w:numPr>
         <w:pStyle w:val="Compact"/>
       </w:pPr>
@@ -10320,7 +10966,7 @@
       <w:pPr>
         <w:numPr>
           <w:ilvl w:val="0"/>
-          <w:numId w:val="1036"/>
+          <w:numId w:val="1037"/>
         </w:numPr>
         <w:pStyle w:val="Compact"/>
       </w:pPr>
@@ -10336,8 +10982,8 @@
         <w:t xml:space="preserve">[Undocumented — architectural judgement]</w:t>
       </w:r>
     </w:p>
-    <w:bookmarkEnd w:id="94"/>
-    <w:bookmarkStart w:id="95" w:name="capacity-holds"/>
+    <w:bookmarkEnd w:id="97"/>
+    <w:bookmarkStart w:id="98" w:name="capacity-holds"/>
     <w:p>
       <w:pPr>
         <w:pStyle w:val="Heading3"/>
@@ -10354,9 +11000,9 @@
         <w:t xml:space="preserve">Before returning a committed assignment, the engine creates a hold keyed by region, SKU, zone, environment, and policy version. [Undocumented — architectural judgement] The hold uses optimistic concurrency and expires if Azure provisioning does not begin. [Undocumented — architectural judgement] This closes concurrent placement race B-7. [Derived]</w:t>
       </w:r>
     </w:p>
-    <w:bookmarkEnd w:id="95"/>
-    <w:bookmarkEnd w:id="96"/>
-    <w:bookmarkStart w:id="97" w:name="steady-state-capacity-lifecycle"/>
+    <w:bookmarkEnd w:id="98"/>
+    <w:bookmarkEnd w:id="99"/>
+    <w:bookmarkStart w:id="100" w:name="steady-state-capacity-lifecycle"/>
     <w:p>
       <w:pPr>
         <w:pStyle w:val="Heading2"/>
@@ -10385,7 +11031,7 @@
       <w:pPr>
         <w:numPr>
           <w:ilvl w:val="0"/>
-          <w:numId w:val="1037"/>
+          <w:numId w:val="1038"/>
         </w:numPr>
         <w:pStyle w:val="Compact"/>
       </w:pPr>
@@ -10397,7 +11043,7 @@
       <w:pPr>
         <w:numPr>
           <w:ilvl w:val="0"/>
-          <w:numId w:val="1037"/>
+          <w:numId w:val="1038"/>
         </w:numPr>
         <w:pStyle w:val="Compact"/>
       </w:pPr>
@@ -10409,7 +11055,7 @@
       <w:pPr>
         <w:numPr>
           <w:ilvl w:val="0"/>
-          <w:numId w:val="1037"/>
+          <w:numId w:val="1038"/>
         </w:numPr>
         <w:pStyle w:val="Compact"/>
       </w:pPr>
@@ -10433,7 +11079,7 @@
       <w:pPr>
         <w:numPr>
           <w:ilvl w:val="0"/>
-          <w:numId w:val="1037"/>
+          <w:numId w:val="1038"/>
         </w:numPr>
         <w:pStyle w:val="Compact"/>
       </w:pPr>
@@ -10445,7 +11091,7 @@
       <w:pPr>
         <w:numPr>
           <w:ilvl w:val="0"/>
-          <w:numId w:val="1037"/>
+          <w:numId w:val="1038"/>
         </w:numPr>
         <w:pStyle w:val="Compact"/>
       </w:pPr>
@@ -10457,7 +11103,7 @@
       <w:pPr>
         <w:numPr>
           <w:ilvl w:val="0"/>
-          <w:numId w:val="1037"/>
+          <w:numId w:val="1038"/>
         </w:numPr>
         <w:pStyle w:val="Compact"/>
       </w:pPr>
@@ -10469,7 +11115,7 @@
       <w:pPr>
         <w:numPr>
           <w:ilvl w:val="0"/>
-          <w:numId w:val="1037"/>
+          <w:numId w:val="1038"/>
         </w:numPr>
         <w:pStyle w:val="Compact"/>
       </w:pPr>
@@ -10481,7 +11127,7 @@
       <w:pPr>
         <w:numPr>
           <w:ilvl w:val="0"/>
-          <w:numId w:val="1037"/>
+          <w:numId w:val="1038"/>
         </w:numPr>
         <w:pStyle w:val="Compact"/>
       </w:pPr>
@@ -10493,7 +11139,7 @@
       <w:pPr>
         <w:numPr>
           <w:ilvl w:val="0"/>
-          <w:numId w:val="1037"/>
+          <w:numId w:val="1038"/>
         </w:numPr>
         <w:pStyle w:val="Compact"/>
       </w:pPr>
@@ -10505,7 +11151,7 @@
       <w:pPr>
         <w:numPr>
           <w:ilvl w:val="0"/>
-          <w:numId w:val="1037"/>
+          <w:numId w:val="1038"/>
         </w:numPr>
         <w:pStyle w:val="Compact"/>
       </w:pPr>
@@ -10529,8 +11175,8 @@
         <w:t xml:space="preserve">Auto-decrease is excluded from Phase 1 because it can remove future capacity and interact with running VMs. [Undocumented — architectural judgement]</w:t>
       </w:r>
     </w:p>
-    <w:bookmarkEnd w:id="97"/>
-    <w:bookmarkStart w:id="98" w:name="dr-activation-architecture"/>
+    <w:bookmarkEnd w:id="100"/>
+    <w:bookmarkStart w:id="101" w:name="dr-activation-architecture"/>
     <w:p>
       <w:pPr>
         <w:pStyle w:val="Heading2"/>
@@ -10711,8 +11357,8 @@
         <w:t xml:space="preserve">DR activation does not automatically authorize Tier 2 or Tier 3. [Undocumented — architectural judgement] It establishes the operating mode in which separately governed emergency operations may be evaluated. [Undocumented — architectural judgement]</w:t>
       </w:r>
     </w:p>
-    <w:bookmarkEnd w:id="98"/>
-    <w:bookmarkStart w:id="99" w:name="tier-escalation-architecture"/>
+    <w:bookmarkEnd w:id="101"/>
+    <w:bookmarkStart w:id="102" w:name="tier-escalation-architecture"/>
     <w:p>
       <w:pPr>
         <w:pStyle w:val="Heading2"/>
@@ -10856,8 +11502,8 @@
         <w:t xml:space="preserve">Tier 3 is not automated in Phase 1. [Undocumented — architectural judgement]</w:t>
       </w:r>
     </w:p>
-    <w:bookmarkEnd w:id="99"/>
-    <w:bookmarkStart w:id="102" w:name="aks-and-vmss-integration-architecture"/>
+    <w:bookmarkEnd w:id="102"/>
+    <w:bookmarkStart w:id="105" w:name="aks-and-vmss-integration-architecture"/>
     <w:p>
       <w:pPr>
         <w:pStyle w:val="Heading2"/>
@@ -10866,7 +11512,7 @@
         <w:t xml:space="preserve">33. AKS and VMSS Integration Architecture</w:t>
       </w:r>
     </w:p>
-    <w:bookmarkStart w:id="100" w:name="aks-controls"/>
+    <w:bookmarkStart w:id="103" w:name="aks-controls"/>
     <w:p>
       <w:pPr>
         <w:pStyle w:val="Heading3"/>
@@ -10879,7 +11525,7 @@
       <w:pPr>
         <w:numPr>
           <w:ilvl w:val="0"/>
-          <w:numId w:val="1038"/>
+          <w:numId w:val="1039"/>
         </w:numPr>
         <w:pStyle w:val="Compact"/>
       </w:pPr>
@@ -10891,7 +11537,7 @@
       <w:pPr>
         <w:numPr>
           <w:ilvl w:val="0"/>
-          <w:numId w:val="1038"/>
+          <w:numId w:val="1039"/>
         </w:numPr>
         <w:pStyle w:val="Compact"/>
       </w:pPr>
@@ -10903,7 +11549,7 @@
       <w:pPr>
         <w:numPr>
           <w:ilvl w:val="0"/>
-          <w:numId w:val="1038"/>
+          <w:numId w:val="1039"/>
         </w:numPr>
         <w:pStyle w:val="Compact"/>
       </w:pPr>
@@ -10915,7 +11561,7 @@
       <w:pPr>
         <w:numPr>
           <w:ilvl w:val="0"/>
-          <w:numId w:val="1038"/>
+          <w:numId w:val="1039"/>
         </w:numPr>
         <w:pStyle w:val="Compact"/>
       </w:pPr>
@@ -10927,7 +11573,7 @@
       <w:pPr>
         <w:numPr>
           <w:ilvl w:val="0"/>
-          <w:numId w:val="1038"/>
+          <w:numId w:val="1039"/>
         </w:numPr>
         <w:pStyle w:val="Compact"/>
       </w:pPr>
@@ -10935,8 +11581,8 @@
         <w:t xml:space="preserve">A failed scale-out must not trigger unbounded retries. [Undocumented — architectural judgement]</w:t>
       </w:r>
     </w:p>
-    <w:bookmarkEnd w:id="100"/>
-    <w:bookmarkStart w:id="101" w:name="vmss-controls"/>
+    <w:bookmarkEnd w:id="103"/>
+    <w:bookmarkStart w:id="104" w:name="vmss-controls"/>
     <w:p>
       <w:pPr>
         <w:pStyle w:val="Heading3"/>
@@ -11219,9 +11865,9 @@
         <w:t xml:space="preserve">[Undocumented — architectural judgement]</w:t>
       </w:r>
     </w:p>
-    <w:bookmarkEnd w:id="101"/>
-    <w:bookmarkEnd w:id="102"/>
-    <w:bookmarkStart w:id="105" w:name="data-architecture"/>
+    <w:bookmarkEnd w:id="104"/>
+    <w:bookmarkEnd w:id="105"/>
+    <w:bookmarkStart w:id="108" w:name="data-architecture"/>
     <w:p>
       <w:pPr>
         <w:pStyle w:val="Heading2"/>
@@ -11230,7 +11876,7 @@
         <w:t xml:space="preserve">34. Data Architecture</w:t>
       </w:r>
     </w:p>
-    <w:bookmarkStart w:id="103" w:name="authoritative-entities"/>
+    <w:bookmarkStart w:id="106" w:name="authoritative-entities"/>
     <w:p>
       <w:pPr>
         <w:pStyle w:val="Heading3"/>
@@ -11243,7 +11889,7 @@
       <w:pPr>
         <w:numPr>
           <w:ilvl w:val="0"/>
-          <w:numId w:val="1039"/>
+          <w:numId w:val="1040"/>
         </w:numPr>
         <w:pStyle w:val="Compact"/>
       </w:pPr>
@@ -11255,7 +11901,7 @@
       <w:pPr>
         <w:numPr>
           <w:ilvl w:val="0"/>
-          <w:numId w:val="1039"/>
+          <w:numId w:val="1040"/>
         </w:numPr>
         <w:pStyle w:val="Compact"/>
       </w:pPr>
@@ -11267,7 +11913,7 @@
       <w:pPr>
         <w:numPr>
           <w:ilvl w:val="0"/>
-          <w:numId w:val="1039"/>
+          <w:numId w:val="1040"/>
         </w:numPr>
         <w:pStyle w:val="Compact"/>
       </w:pPr>
@@ -11279,7 +11925,7 @@
       <w:pPr>
         <w:numPr>
           <w:ilvl w:val="0"/>
-          <w:numId w:val="1039"/>
+          <w:numId w:val="1040"/>
         </w:numPr>
         <w:pStyle w:val="Compact"/>
       </w:pPr>
@@ -11291,7 +11937,7 @@
       <w:pPr>
         <w:numPr>
           <w:ilvl w:val="0"/>
-          <w:numId w:val="1039"/>
+          <w:numId w:val="1040"/>
         </w:numPr>
         <w:pStyle w:val="Compact"/>
       </w:pPr>
@@ -11303,7 +11949,7 @@
       <w:pPr>
         <w:numPr>
           <w:ilvl w:val="0"/>
-          <w:numId w:val="1039"/>
+          <w:numId w:val="1040"/>
         </w:numPr>
         <w:pStyle w:val="Compact"/>
       </w:pPr>
@@ -11315,7 +11961,7 @@
       <w:pPr>
         <w:numPr>
           <w:ilvl w:val="0"/>
-          <w:numId w:val="1039"/>
+          <w:numId w:val="1040"/>
         </w:numPr>
         <w:pStyle w:val="Compact"/>
       </w:pPr>
@@ -11327,7 +11973,7 @@
       <w:pPr>
         <w:numPr>
           <w:ilvl w:val="0"/>
-          <w:numId w:val="1039"/>
+          <w:numId w:val="1040"/>
         </w:numPr>
         <w:pStyle w:val="Compact"/>
       </w:pPr>
@@ -11339,7 +11985,7 @@
       <w:pPr>
         <w:numPr>
           <w:ilvl w:val="0"/>
-          <w:numId w:val="1039"/>
+          <w:numId w:val="1040"/>
         </w:numPr>
         <w:pStyle w:val="Compact"/>
       </w:pPr>
@@ -11351,7 +11997,7 @@
       <w:pPr>
         <w:numPr>
           <w:ilvl w:val="0"/>
-          <w:numId w:val="1039"/>
+          <w:numId w:val="1040"/>
         </w:numPr>
         <w:pStyle w:val="Compact"/>
       </w:pPr>
@@ -11363,7 +12009,7 @@
       <w:pPr>
         <w:numPr>
           <w:ilvl w:val="0"/>
-          <w:numId w:val="1039"/>
+          <w:numId w:val="1040"/>
         </w:numPr>
         <w:pStyle w:val="Compact"/>
       </w:pPr>
@@ -11375,7 +12021,7 @@
       <w:pPr>
         <w:numPr>
           <w:ilvl w:val="0"/>
-          <w:numId w:val="1039"/>
+          <w:numId w:val="1040"/>
         </w:numPr>
         <w:pStyle w:val="Compact"/>
       </w:pPr>
@@ -11387,7 +12033,7 @@
       <w:pPr>
         <w:numPr>
           <w:ilvl w:val="0"/>
-          <w:numId w:val="1039"/>
+          <w:numId w:val="1040"/>
         </w:numPr>
         <w:pStyle w:val="Compact"/>
       </w:pPr>
@@ -11399,7 +12045,7 @@
       <w:pPr>
         <w:numPr>
           <w:ilvl w:val="0"/>
-          <w:numId w:val="1039"/>
+          <w:numId w:val="1040"/>
         </w:numPr>
         <w:pStyle w:val="Compact"/>
       </w:pPr>
@@ -11411,7 +12057,7 @@
       <w:pPr>
         <w:numPr>
           <w:ilvl w:val="0"/>
-          <w:numId w:val="1039"/>
+          <w:numId w:val="1040"/>
         </w:numPr>
         <w:pStyle w:val="Compact"/>
       </w:pPr>
@@ -11423,7 +12069,7 @@
       <w:pPr>
         <w:numPr>
           <w:ilvl w:val="0"/>
-          <w:numId w:val="1039"/>
+          <w:numId w:val="1040"/>
         </w:numPr>
         <w:pStyle w:val="Compact"/>
       </w:pPr>
@@ -11435,7 +12081,7 @@
       <w:pPr>
         <w:numPr>
           <w:ilvl w:val="0"/>
-          <w:numId w:val="1039"/>
+          <w:numId w:val="1040"/>
         </w:numPr>
         <w:pStyle w:val="Compact"/>
       </w:pPr>
@@ -11451,8 +12097,8 @@
         <w:t xml:space="preserve">[Derived]</w:t>
       </w:r>
     </w:p>
-    <w:bookmarkEnd w:id="103"/>
-    <w:bookmarkStart w:id="104" w:name="open-gap-closures"/>
+    <w:bookmarkEnd w:id="106"/>
+    <w:bookmarkStart w:id="107" w:name="open-gap-closures"/>
     <w:p>
       <w:pPr>
         <w:pStyle w:val="Heading3"/>
@@ -11551,9 +12197,9 @@
         <w:t xml:space="preserve">in the canonical API, schema, authorization model, audit model, and backlog before implementation begins. [Undocumented — architectural judgement]</w:t>
       </w:r>
     </w:p>
-    <w:bookmarkEnd w:id="104"/>
-    <w:bookmarkEnd w:id="105"/>
-    <w:bookmarkStart w:id="107" w:name="api-architecture"/>
+    <w:bookmarkEnd w:id="107"/>
+    <w:bookmarkEnd w:id="108"/>
+    <w:bookmarkStart w:id="110" w:name="api-architecture"/>
     <w:p>
       <w:pPr>
         <w:pStyle w:val="Heading2"/>
@@ -11570,7 +12216,7 @@
         <w:t xml:space="preserve">All state-changing endpoints return an operation resource rather than implying synchronous Azure completion. [Undocumented — architectural judgement]</w:t>
       </w:r>
     </w:p>
-    <w:bookmarkStart w:id="106" w:name="core-endpoints"/>
+    <w:bookmarkStart w:id="109" w:name="core-endpoints"/>
     <w:p>
       <w:pPr>
         <w:pStyle w:val="Heading3"/>
@@ -11583,7 +12229,7 @@
       <w:pPr>
         <w:numPr>
           <w:ilvl w:val="0"/>
-          <w:numId w:val="1040"/>
+          <w:numId w:val="1041"/>
         </w:numPr>
         <w:pStyle w:val="Compact"/>
       </w:pPr>
@@ -11598,7 +12244,7 @@
       <w:pPr>
         <w:numPr>
           <w:ilvl w:val="0"/>
-          <w:numId w:val="1040"/>
+          <w:numId w:val="1041"/>
         </w:numPr>
         <w:pStyle w:val="Compact"/>
       </w:pPr>
@@ -11613,7 +12259,7 @@
       <w:pPr>
         <w:numPr>
           <w:ilvl w:val="0"/>
-          <w:numId w:val="1040"/>
+          <w:numId w:val="1041"/>
         </w:numPr>
         <w:pStyle w:val="Compact"/>
       </w:pPr>
@@ -11628,7 +12274,7 @@
       <w:pPr>
         <w:numPr>
           <w:ilvl w:val="0"/>
-          <w:numId w:val="1040"/>
+          <w:numId w:val="1041"/>
         </w:numPr>
         <w:pStyle w:val="Compact"/>
       </w:pPr>
@@ -11643,7 +12289,7 @@
       <w:pPr>
         <w:numPr>
           <w:ilvl w:val="0"/>
-          <w:numId w:val="1040"/>
+          <w:numId w:val="1041"/>
         </w:numPr>
         <w:pStyle w:val="Compact"/>
       </w:pPr>
@@ -11658,7 +12304,7 @@
       <w:pPr>
         <w:numPr>
           <w:ilvl w:val="0"/>
-          <w:numId w:val="1040"/>
+          <w:numId w:val="1041"/>
         </w:numPr>
         <w:pStyle w:val="Compact"/>
       </w:pPr>
@@ -11673,7 +12319,7 @@
       <w:pPr>
         <w:numPr>
           <w:ilvl w:val="0"/>
-          <w:numId w:val="1040"/>
+          <w:numId w:val="1041"/>
         </w:numPr>
         <w:pStyle w:val="Compact"/>
       </w:pPr>
@@ -11688,7 +12334,7 @@
       <w:pPr>
         <w:numPr>
           <w:ilvl w:val="0"/>
-          <w:numId w:val="1040"/>
+          <w:numId w:val="1041"/>
         </w:numPr>
         <w:pStyle w:val="Compact"/>
       </w:pPr>
@@ -11698,12 +12344,65 @@
         </w:rPr>
         <w:t xml:space="preserve">/placement/select-regions</w:t>
       </w:r>
-    </w:p>
-    <w:p>
-      <w:pPr>
-        <w:numPr>
-          <w:ilvl w:val="0"/>
-          <w:numId w:val="1040"/>
+      <w:r>
+        <w:t xml:space="preserve"> </w:t>
+      </w:r>
+      <w:r>
+        <w:t xml:space="preserve">— accepts</w:t>
+      </w:r>
+      <w:r>
+        <w:t xml:space="preserve"> </w:t>
+      </w:r>
+      <w:r>
+        <w:rPr>
+          <w:bCs/>
+          <w:b/>
+        </w:rPr>
+        <w:t xml:space="preserve">either</w:t>
+      </w:r>
+      <w:r>
+        <w:t xml:space="preserve"> </w:t>
+      </w:r>
+      <w:r>
+        <w:t xml:space="preserve">a specific Prod region (Scenario 2)</w:t>
+      </w:r>
+      <w:r>
+        <w:t xml:space="preserve"> </w:t>
+      </w:r>
+      <w:r>
+        <w:rPr>
+          <w:bCs/>
+          <w:b/>
+        </w:rPr>
+        <w:t xml:space="preserve">or</w:t>
+      </w:r>
+      <w:r>
+        <w:t xml:space="preserve"> </w:t>
+      </w:r>
+      <w:r>
+        <w:t xml:space="preserve">an Azure geography (Scenario 1); when a geography is supplied the engine derives the Prod region via</w:t>
+      </w:r>
+      <w:r>
+        <w:t xml:space="preserve"> </w:t>
+      </w:r>
+      <w:r>
+        <w:rPr>
+          <w:rStyle w:val="VerbatimChar"/>
+        </w:rPr>
+        <w:t xml:space="preserve">PS_Prod</w:t>
+      </w:r>
+      <w:r>
+        <w:t xml:space="preserve"> </w:t>
+      </w:r>
+      <w:r>
+        <w:t xml:space="preserve">over the geography’s approved regions before running sequential NonProd/DR selection (Section 27). [Undocumented — architectural judgement]</w:t>
+      </w:r>
+    </w:p>
+    <w:p>
+      <w:pPr>
+        <w:numPr>
+          <w:ilvl w:val="0"/>
+          <w:numId w:val="1041"/>
         </w:numPr>
         <w:pStyle w:val="Compact"/>
       </w:pPr>
@@ -11718,7 +12417,7 @@
       <w:pPr>
         <w:numPr>
           <w:ilvl w:val="0"/>
-          <w:numId w:val="1040"/>
+          <w:numId w:val="1041"/>
         </w:numPr>
         <w:pStyle w:val="Compact"/>
       </w:pPr>
@@ -11733,7 +12432,7 @@
       <w:pPr>
         <w:numPr>
           <w:ilvl w:val="0"/>
-          <w:numId w:val="1040"/>
+          <w:numId w:val="1041"/>
         </w:numPr>
         <w:pStyle w:val="Compact"/>
       </w:pPr>
@@ -11748,7 +12447,7 @@
       <w:pPr>
         <w:numPr>
           <w:ilvl w:val="0"/>
-          <w:numId w:val="1040"/>
+          <w:numId w:val="1041"/>
         </w:numPr>
         <w:pStyle w:val="Compact"/>
       </w:pPr>
@@ -11763,7 +12462,7 @@
       <w:pPr>
         <w:numPr>
           <w:ilvl w:val="0"/>
-          <w:numId w:val="1040"/>
+          <w:numId w:val="1041"/>
         </w:numPr>
         <w:pStyle w:val="Compact"/>
       </w:pPr>
@@ -11778,7 +12477,7 @@
       <w:pPr>
         <w:numPr>
           <w:ilvl w:val="0"/>
-          <w:numId w:val="1040"/>
+          <w:numId w:val="1041"/>
         </w:numPr>
         <w:pStyle w:val="Compact"/>
       </w:pPr>
@@ -11809,7 +12508,7 @@
       <w:pPr>
         <w:numPr>
           <w:ilvl w:val="0"/>
-          <w:numId w:val="1041"/>
+          <w:numId w:val="1042"/>
         </w:numPr>
         <w:pStyle w:val="Compact"/>
       </w:pPr>
@@ -11821,7 +12520,7 @@
       <w:pPr>
         <w:numPr>
           <w:ilvl w:val="0"/>
-          <w:numId w:val="1041"/>
+          <w:numId w:val="1042"/>
         </w:numPr>
         <w:pStyle w:val="Compact"/>
       </w:pPr>
@@ -11833,7 +12532,7 @@
       <w:pPr>
         <w:numPr>
           <w:ilvl w:val="0"/>
-          <w:numId w:val="1041"/>
+          <w:numId w:val="1042"/>
         </w:numPr>
         <w:pStyle w:val="Compact"/>
       </w:pPr>
@@ -11845,7 +12544,7 @@
       <w:pPr>
         <w:numPr>
           <w:ilvl w:val="0"/>
-          <w:numId w:val="1041"/>
+          <w:numId w:val="1042"/>
         </w:numPr>
         <w:pStyle w:val="Compact"/>
       </w:pPr>
@@ -11857,7 +12556,7 @@
       <w:pPr>
         <w:numPr>
           <w:ilvl w:val="0"/>
-          <w:numId w:val="1041"/>
+          <w:numId w:val="1042"/>
         </w:numPr>
         <w:pStyle w:val="Compact"/>
       </w:pPr>
@@ -11869,7 +12568,7 @@
       <w:pPr>
         <w:numPr>
           <w:ilvl w:val="0"/>
-          <w:numId w:val="1041"/>
+          <w:numId w:val="1042"/>
         </w:numPr>
         <w:pStyle w:val="Compact"/>
       </w:pPr>
@@ -11881,7 +12580,7 @@
       <w:pPr>
         <w:numPr>
           <w:ilvl w:val="0"/>
-          <w:numId w:val="1041"/>
+          <w:numId w:val="1042"/>
         </w:numPr>
         <w:pStyle w:val="Compact"/>
       </w:pPr>
@@ -11893,7 +12592,7 @@
       <w:pPr>
         <w:numPr>
           <w:ilvl w:val="0"/>
-          <w:numId w:val="1041"/>
+          <w:numId w:val="1042"/>
         </w:numPr>
         <w:pStyle w:val="Compact"/>
       </w:pPr>
@@ -11909,9 +12608,9 @@
         <w:t xml:space="preserve">[Undocumented — architectural judgement]</w:t>
       </w:r>
     </w:p>
-    <w:bookmarkEnd w:id="106"/>
-    <w:bookmarkEnd w:id="107"/>
-    <w:bookmarkStart w:id="110" w:name="rbac-and-managed-identity-model"/>
+    <w:bookmarkEnd w:id="109"/>
+    <w:bookmarkEnd w:id="110"/>
+    <w:bookmarkStart w:id="113" w:name="rbac-and-managed-identity-model"/>
     <w:p>
       <w:pPr>
         <w:pStyle w:val="Heading2"/>
@@ -11920,7 +12619,7 @@
         <w:t xml:space="preserve">36. RBAC and Managed Identity Model</w:t>
       </w:r>
     </w:p>
-    <w:bookmarkStart w:id="108" w:name="rbac-matrix"/>
+    <w:bookmarkStart w:id="111" w:name="rbac-matrix"/>
     <w:p>
       <w:pPr>
         <w:pStyle w:val="Heading3"/>
@@ -12453,8 +13152,8 @@
         <w:t xml:space="preserve">[Undocumented — architectural judgement]</w:t>
       </w:r>
     </w:p>
-    <w:bookmarkEnd w:id="108"/>
-    <w:bookmarkStart w:id="109" w:name="managed-identity-scope"/>
+    <w:bookmarkEnd w:id="111"/>
+    <w:bookmarkStart w:id="112" w:name="managed-identity-scope"/>
     <w:p>
       <w:pPr>
         <w:pStyle w:val="Heading3"/>
@@ -12479,9 +13178,9 @@
         <w:t xml:space="preserve">If the minimum custom action set cannot be established, Tier 3 remains blocked. [Undocumented — architectural judgement]</w:t>
       </w:r>
     </w:p>
-    <w:bookmarkEnd w:id="109"/>
-    <w:bookmarkEnd w:id="110"/>
-    <w:bookmarkStart w:id="114" w:name="observability-dashboards-and-alerts"/>
+    <w:bookmarkEnd w:id="112"/>
+    <w:bookmarkEnd w:id="113"/>
+    <w:bookmarkStart w:id="117" w:name="observability-dashboards-and-alerts"/>
     <w:p>
       <w:pPr>
         <w:pStyle w:val="Heading2"/>
@@ -12490,7 +13189,7 @@
         <w:t xml:space="preserve">37. Observability, Dashboards, and Alerts</w:t>
       </w:r>
     </w:p>
-    <w:bookmarkStart w:id="111" w:name="proposed-sli-and-slo-targets"/>
+    <w:bookmarkStart w:id="114" w:name="proposed-sli-and-slo-targets"/>
     <w:p>
       <w:pPr>
         <w:pStyle w:val="Heading3"/>
@@ -12755,8 +13454,8 @@
         </w:tc>
       </w:tr>
     </w:tbl>
-    <w:bookmarkEnd w:id="111"/>
-    <w:bookmarkStart w:id="112" w:name="dashboards"/>
+    <w:bookmarkEnd w:id="114"/>
+    <w:bookmarkStart w:id="115" w:name="dashboards"/>
     <w:p>
       <w:pPr>
         <w:pStyle w:val="Heading3"/>
@@ -12769,7 +13468,7 @@
       <w:pPr>
         <w:numPr>
           <w:ilvl w:val="0"/>
-          <w:numId w:val="1042"/>
+          <w:numId w:val="1043"/>
         </w:numPr>
         <w:pStyle w:val="Compact"/>
       </w:pPr>
@@ -12781,7 +13480,7 @@
       <w:pPr>
         <w:numPr>
           <w:ilvl w:val="0"/>
-          <w:numId w:val="1042"/>
+          <w:numId w:val="1043"/>
         </w:numPr>
         <w:pStyle w:val="Compact"/>
       </w:pPr>
@@ -12793,7 +13492,7 @@
       <w:pPr>
         <w:numPr>
           <w:ilvl w:val="0"/>
-          <w:numId w:val="1042"/>
+          <w:numId w:val="1043"/>
         </w:numPr>
         <w:pStyle w:val="Compact"/>
       </w:pPr>
@@ -12805,7 +13504,7 @@
       <w:pPr>
         <w:numPr>
           <w:ilvl w:val="0"/>
-          <w:numId w:val="1042"/>
+          <w:numId w:val="1043"/>
         </w:numPr>
         <w:pStyle w:val="Compact"/>
       </w:pPr>
@@ -12817,7 +13516,7 @@
       <w:pPr>
         <w:numPr>
           <w:ilvl w:val="0"/>
-          <w:numId w:val="1042"/>
+          <w:numId w:val="1043"/>
         </w:numPr>
         <w:pStyle w:val="Compact"/>
       </w:pPr>
@@ -12829,7 +13528,7 @@
       <w:pPr>
         <w:numPr>
           <w:ilvl w:val="0"/>
-          <w:numId w:val="1042"/>
+          <w:numId w:val="1043"/>
         </w:numPr>
         <w:pStyle w:val="Compact"/>
       </w:pPr>
@@ -12841,7 +13540,7 @@
       <w:pPr>
         <w:numPr>
           <w:ilvl w:val="0"/>
-          <w:numId w:val="1042"/>
+          <w:numId w:val="1043"/>
         </w:numPr>
         <w:pStyle w:val="Compact"/>
       </w:pPr>
@@ -12853,7 +13552,7 @@
       <w:pPr>
         <w:numPr>
           <w:ilvl w:val="0"/>
-          <w:numId w:val="1042"/>
+          <w:numId w:val="1043"/>
         </w:numPr>
         <w:pStyle w:val="Compact"/>
       </w:pPr>
@@ -12865,7 +13564,7 @@
       <w:pPr>
         <w:numPr>
           <w:ilvl w:val="0"/>
-          <w:numId w:val="1042"/>
+          <w:numId w:val="1043"/>
         </w:numPr>
         <w:pStyle w:val="Compact"/>
       </w:pPr>
@@ -12877,7 +13576,7 @@
       <w:pPr>
         <w:numPr>
           <w:ilvl w:val="0"/>
-          <w:numId w:val="1042"/>
+          <w:numId w:val="1043"/>
         </w:numPr>
         <w:pStyle w:val="Compact"/>
       </w:pPr>
@@ -12893,8 +13592,8 @@
         <w:t xml:space="preserve">[Undocumented — architectural judgement]</w:t>
       </w:r>
     </w:p>
-    <w:bookmarkEnd w:id="112"/>
-    <w:bookmarkStart w:id="113" w:name="alert-catalog"/>
+    <w:bookmarkEnd w:id="115"/>
+    <w:bookmarkStart w:id="116" w:name="alert-catalog"/>
     <w:p>
       <w:pPr>
         <w:pStyle w:val="Heading3"/>
@@ -13534,9 +14233,9 @@
         <w:t xml:space="preserve">[Undocumented — architectural judgement]</w:t>
       </w:r>
     </w:p>
-    <w:bookmarkEnd w:id="113"/>
-    <w:bookmarkEnd w:id="114"/>
-    <w:bookmarkStart w:id="120" w:name="well-architected-framework-assessment"/>
+    <w:bookmarkEnd w:id="116"/>
+    <w:bookmarkEnd w:id="117"/>
+    <w:bookmarkStart w:id="123" w:name="well-architected-framework-assessment"/>
     <w:p>
       <w:pPr>
         <w:pStyle w:val="Heading2"/>
@@ -13545,7 +14244,7 @@
         <w:t xml:space="preserve">38. Well-Architected Framework Assessment</w:t>
       </w:r>
     </w:p>
-    <w:bookmarkStart w:id="115" w:name="reliability"/>
+    <w:bookmarkStart w:id="118" w:name="reliability"/>
     <w:p>
       <w:pPr>
         <w:pStyle w:val="Heading3"/>
@@ -13562,8 +14261,8 @@
         <w:t xml:space="preserve">The architecture uses persisted sagas, idempotency, conditional state transitions, manual fallback, and adaptive reconciliation. [Undocumented — architectural judgement] Reliability remains constrained by preview dependencies, unknown propagation, and untested end-to-end DR. [Derived]</w:t>
       </w:r>
     </w:p>
-    <w:bookmarkEnd w:id="115"/>
-    <w:bookmarkStart w:id="116" w:name="performance-efficiency"/>
+    <w:bookmarkEnd w:id="118"/>
+    <w:bookmarkStart w:id="119" w:name="performance-efficiency"/>
     <w:p>
       <w:pPr>
         <w:pStyle w:val="Heading3"/>
@@ -13580,8 +14279,8 @@
         <w:t xml:space="preserve">Cached reads support low-latency recommendations, but fresh validation is required before commit. [Undocumented — architectural judgement] The design trades some placement latency for correctness on safety-critical operations. [Undocumented — architectural judgement]</w:t>
       </w:r>
     </w:p>
-    <w:bookmarkEnd w:id="116"/>
-    <w:bookmarkStart w:id="117" w:name="cost-optimization"/>
+    <w:bookmarkEnd w:id="119"/>
+    <w:bookmarkStart w:id="120" w:name="cost-optimization"/>
     <w:p>
       <w:pPr>
         <w:pStyle w:val="Heading3"/>
@@ -13624,8 +14323,8 @@
         <w:t xml:space="preserve">FinOps engineering must validate the reservation discount scope for every provider–consumer subscription pair before cost modelling is presented to customers. [Derived] Cost models that assume the consumer subscription benefits from the provider’s RI discount without validating scope configuration will overstate the cost benefit of the shared CRG arrangement. [Derived] This constraint must be reviewed during customer onboarding and documented in the capacity reservation cost summary. [Undocumented — architectural judgement]</w:t>
       </w:r>
     </w:p>
-    <w:bookmarkEnd w:id="117"/>
-    <w:bookmarkStart w:id="118" w:name="security"/>
+    <w:bookmarkEnd w:id="120"/>
+    <w:bookmarkStart w:id="121" w:name="security"/>
     <w:p>
       <w:pPr>
         <w:pStyle w:val="Heading3"/>
@@ -13642,8 +14341,8 @@
         <w:t xml:space="preserve">Split identities, customer consent, narrow custom roles, approval separation, and immutable audit reduce privilege concentration. [Undocumented — architectural judgement] G-14 remains the primary unresolved security blocker. [Derived]</w:t>
       </w:r>
     </w:p>
-    <w:bookmarkEnd w:id="118"/>
-    <w:bookmarkStart w:id="119" w:name="operational-excellence"/>
+    <w:bookmarkEnd w:id="121"/>
+    <w:bookmarkStart w:id="122" w:name="operational-excellence"/>
     <w:p>
       <w:pPr>
         <w:pStyle w:val="Heading3"/>
@@ -13660,9 +14359,9 @@
         <w:t xml:space="preserve">Versioned policy, replayable scoring, dry runs, structured operations, and runbooks improve auditability. [Undocumented — architectural judgement] Operational maturity must be demonstrated through exercises rather than inferred from documentation. [Undocumented — architectural judgement]</w:t>
       </w:r>
     </w:p>
-    <w:bookmarkEnd w:id="119"/>
-    <w:bookmarkEnd w:id="120"/>
-    <w:bookmarkStart w:id="121" w:name="gap-closure-plan"/>
+    <w:bookmarkEnd w:id="122"/>
+    <w:bookmarkEnd w:id="123"/>
+    <w:bookmarkStart w:id="124" w:name="gap-closure-plan"/>
     <w:p>
       <w:pPr>
         <w:pStyle w:val="Heading2"/>
@@ -14230,9 +14929,9 @@
         </w:tc>
       </w:tr>
     </w:tbl>
-    <w:bookmarkEnd w:id="121"/>
-    <w:bookmarkEnd w:id="122"/>
-    <w:bookmarkStart w:id="147" w:name="part-iii-supporting-artifacts"/>
+    <w:bookmarkEnd w:id="124"/>
+    <w:bookmarkEnd w:id="125"/>
+    <w:bookmarkStart w:id="150" w:name="part-iii-supporting-artifacts"/>
     <w:p>
       <w:pPr>
         <w:pStyle w:val="Heading1"/>
@@ -14241,7 +14940,7 @@
         <w:t xml:space="preserve">Part III — Supporting Artifacts</w:t>
       </w:r>
     </w:p>
-    <w:bookmarkStart w:id="123" w:name="complete-risk-register"/>
+    <w:bookmarkStart w:id="126" w:name="complete-risk-register"/>
     <w:p>
       <w:pPr>
         <w:pStyle w:val="Heading2"/>
@@ -18139,8 +18838,8 @@
         </w:tc>
       </w:tr>
     </w:tbl>
-    <w:bookmarkEnd w:id="123"/>
-    <w:bookmarkStart w:id="129" w:name="operational-runbooks"/>
+    <w:bookmarkEnd w:id="126"/>
+    <w:bookmarkStart w:id="132" w:name="operational-runbooks"/>
     <w:p>
       <w:pPr>
         <w:pStyle w:val="Heading2"/>
@@ -18149,7 +18848,7 @@
         <w:t xml:space="preserve">41. Operational Runbooks</w:t>
       </w:r>
     </w:p>
-    <w:bookmarkStart w:id="124" w:name="runbook-a-capacity-exhaustion"/>
+    <w:bookmarkStart w:id="127" w:name="runbook-a-capacity-exhaustion"/>
     <w:p>
       <w:pPr>
         <w:pStyle w:val="Heading3"/>
@@ -18162,7 +18861,7 @@
       <w:pPr>
         <w:numPr>
           <w:ilvl w:val="0"/>
-          <w:numId w:val="1043"/>
+          <w:numId w:val="1044"/>
         </w:numPr>
         <w:pStyle w:val="Compact"/>
       </w:pPr>
@@ -18174,7 +18873,7 @@
       <w:pPr>
         <w:numPr>
           <w:ilvl w:val="0"/>
-          <w:numId w:val="1043"/>
+          <w:numId w:val="1044"/>
         </w:numPr>
         <w:pStyle w:val="Compact"/>
       </w:pPr>
@@ -18186,7 +18885,7 @@
       <w:pPr>
         <w:numPr>
           <w:ilvl w:val="0"/>
-          <w:numId w:val="1043"/>
+          <w:numId w:val="1044"/>
         </w:numPr>
         <w:pStyle w:val="Compact"/>
       </w:pPr>
@@ -18198,7 +18897,7 @@
       <w:pPr>
         <w:numPr>
           <w:ilvl w:val="0"/>
-          <w:numId w:val="1043"/>
+          <w:numId w:val="1044"/>
         </w:numPr>
         <w:pStyle w:val="Compact"/>
       </w:pPr>
@@ -18210,7 +18909,7 @@
       <w:pPr>
         <w:numPr>
           <w:ilvl w:val="0"/>
-          <w:numId w:val="1043"/>
+          <w:numId w:val="1044"/>
         </w:numPr>
         <w:pStyle w:val="Compact"/>
       </w:pPr>
@@ -18222,7 +18921,7 @@
       <w:pPr>
         <w:numPr>
           <w:ilvl w:val="0"/>
-          <w:numId w:val="1043"/>
+          <w:numId w:val="1044"/>
         </w:numPr>
         <w:pStyle w:val="Compact"/>
       </w:pPr>
@@ -18234,7 +18933,7 @@
       <w:pPr>
         <w:numPr>
           <w:ilvl w:val="0"/>
-          <w:numId w:val="1043"/>
+          <w:numId w:val="1044"/>
         </w:numPr>
         <w:pStyle w:val="Compact"/>
       </w:pPr>
@@ -18242,8 +18941,8 @@
         <w:t xml:space="preserve">Re-evaluate after confirmed state change; do not rely on elapsed time alone. [Undocumented — architectural judgement]</w:t>
       </w:r>
     </w:p>
-    <w:bookmarkEnd w:id="124"/>
-    <w:bookmarkStart w:id="125" w:name="runbook-b-forced-unsharing-request"/>
+    <w:bookmarkEnd w:id="127"/>
+    <w:bookmarkStart w:id="128" w:name="runbook-b-forced-unsharing-request"/>
     <w:p>
       <w:pPr>
         <w:pStyle w:val="Heading3"/>
@@ -18256,7 +18955,7 @@
       <w:pPr>
         <w:numPr>
           <w:ilvl w:val="0"/>
-          <w:numId w:val="1044"/>
+          <w:numId w:val="1045"/>
         </w:numPr>
         <w:pStyle w:val="Compact"/>
       </w:pPr>
@@ -18268,7 +18967,7 @@
       <w:pPr>
         <w:numPr>
           <w:ilvl w:val="0"/>
-          <w:numId w:val="1044"/>
+          <w:numId w:val="1045"/>
         </w:numPr>
         <w:pStyle w:val="Compact"/>
       </w:pPr>
@@ -18280,7 +18979,7 @@
       <w:pPr>
         <w:numPr>
           <w:ilvl w:val="0"/>
-          <w:numId w:val="1044"/>
+          <w:numId w:val="1045"/>
         </w:numPr>
         <w:pStyle w:val="Compact"/>
       </w:pPr>
@@ -18292,7 +18991,7 @@
       <w:pPr>
         <w:numPr>
           <w:ilvl w:val="0"/>
-          <w:numId w:val="1044"/>
+          <w:numId w:val="1045"/>
         </w:numPr>
         <w:pStyle w:val="Compact"/>
       </w:pPr>
@@ -18304,7 +19003,7 @@
       <w:pPr>
         <w:numPr>
           <w:ilvl w:val="0"/>
-          <w:numId w:val="1044"/>
+          <w:numId w:val="1045"/>
         </w:numPr>
         <w:pStyle w:val="Compact"/>
       </w:pPr>
@@ -18316,7 +19015,7 @@
       <w:pPr>
         <w:numPr>
           <w:ilvl w:val="0"/>
-          <w:numId w:val="1044"/>
+          <w:numId w:val="1045"/>
         </w:numPr>
         <w:pStyle w:val="Compact"/>
       </w:pPr>
@@ -18328,7 +19027,7 @@
       <w:pPr>
         <w:numPr>
           <w:ilvl w:val="0"/>
-          <w:numId w:val="1044"/>
+          <w:numId w:val="1045"/>
         </w:numPr>
         <w:pStyle w:val="Compact"/>
       </w:pPr>
@@ -18336,8 +19035,8 @@
         <w:t xml:space="preserve">Retain the impact record. [Undocumented — architectural judgement]</w:t>
       </w:r>
     </w:p>
-    <w:bookmarkEnd w:id="125"/>
-    <w:bookmarkStart w:id="126" w:name="runbook-c-tier-1-emergency-expansion"/>
+    <w:bookmarkEnd w:id="128"/>
+    <w:bookmarkStart w:id="129" w:name="runbook-c-tier-1-emergency-expansion"/>
     <w:p>
       <w:pPr>
         <w:pStyle w:val="Heading3"/>
@@ -18350,7 +19049,7 @@
       <w:pPr>
         <w:numPr>
           <w:ilvl w:val="0"/>
-          <w:numId w:val="1045"/>
+          <w:numId w:val="1046"/>
         </w:numPr>
         <w:pStyle w:val="Compact"/>
       </w:pPr>
@@ -18374,7 +19073,7 @@
       <w:pPr>
         <w:numPr>
           <w:ilvl w:val="0"/>
-          <w:numId w:val="1045"/>
+          <w:numId w:val="1046"/>
         </w:numPr>
         <w:pStyle w:val="Compact"/>
       </w:pPr>
@@ -18386,7 +19085,7 @@
       <w:pPr>
         <w:numPr>
           <w:ilvl w:val="0"/>
-          <w:numId w:val="1045"/>
+          <w:numId w:val="1046"/>
         </w:numPr>
         <w:pStyle w:val="Compact"/>
       </w:pPr>
@@ -18398,7 +19097,7 @@
       <w:pPr>
         <w:numPr>
           <w:ilvl w:val="0"/>
-          <w:numId w:val="1045"/>
+          <w:numId w:val="1046"/>
         </w:numPr>
         <w:pStyle w:val="Compact"/>
       </w:pPr>
@@ -18410,7 +19109,7 @@
       <w:pPr>
         <w:numPr>
           <w:ilvl w:val="0"/>
-          <w:numId w:val="1045"/>
+          <w:numId w:val="1046"/>
         </w:numPr>
         <w:pStyle w:val="Compact"/>
       </w:pPr>
@@ -18422,7 +19121,7 @@
       <w:pPr>
         <w:numPr>
           <w:ilvl w:val="0"/>
-          <w:numId w:val="1045"/>
+          <w:numId w:val="1046"/>
         </w:numPr>
         <w:pStyle w:val="Compact"/>
       </w:pPr>
@@ -18434,7 +19133,7 @@
       <w:pPr>
         <w:numPr>
           <w:ilvl w:val="0"/>
-          <w:numId w:val="1045"/>
+          <w:numId w:val="1046"/>
         </w:numPr>
         <w:pStyle w:val="Compact"/>
       </w:pPr>
@@ -18446,7 +19145,7 @@
       <w:pPr>
         <w:numPr>
           <w:ilvl w:val="0"/>
-          <w:numId w:val="1045"/>
+          <w:numId w:val="1046"/>
         </w:numPr>
         <w:pStyle w:val="Compact"/>
       </w:pPr>
@@ -18458,7 +19157,7 @@
       <w:pPr>
         <w:numPr>
           <w:ilvl w:val="0"/>
-          <w:numId w:val="1045"/>
+          <w:numId w:val="1046"/>
         </w:numPr>
         <w:pStyle w:val="Compact"/>
       </w:pPr>
@@ -18474,8 +19173,8 @@
         <w:t xml:space="preserve">[Undocumented — architectural judgement]</w:t>
       </w:r>
     </w:p>
-    <w:bookmarkEnd w:id="126"/>
-    <w:bookmarkStart w:id="127" w:name="runbook-d-tier-2-quota-neutral-transfer"/>
+    <w:bookmarkEnd w:id="129"/>
+    <w:bookmarkStart w:id="130" w:name="runbook-d-tier-2-quota-neutral-transfer"/>
     <w:p>
       <w:pPr>
         <w:pStyle w:val="Heading3"/>
@@ -18488,7 +19187,7 @@
       <w:pPr>
         <w:numPr>
           <w:ilvl w:val="0"/>
-          <w:numId w:val="1046"/>
+          <w:numId w:val="1047"/>
         </w:numPr>
         <w:pStyle w:val="Compact"/>
       </w:pPr>
@@ -18500,7 +19199,7 @@
       <w:pPr>
         <w:numPr>
           <w:ilvl w:val="0"/>
-          <w:numId w:val="1046"/>
+          <w:numId w:val="1047"/>
         </w:numPr>
         <w:pStyle w:val="Compact"/>
       </w:pPr>
@@ -18512,7 +19211,7 @@
       <w:pPr>
         <w:numPr>
           <w:ilvl w:val="0"/>
-          <w:numId w:val="1046"/>
+          <w:numId w:val="1047"/>
         </w:numPr>
         <w:pStyle w:val="Compact"/>
       </w:pPr>
@@ -18524,7 +19223,7 @@
       <w:pPr>
         <w:numPr>
           <w:ilvl w:val="0"/>
-          <w:numId w:val="1046"/>
+          <w:numId w:val="1047"/>
         </w:numPr>
         <w:pStyle w:val="Compact"/>
       </w:pPr>
@@ -18536,7 +19235,7 @@
       <w:pPr>
         <w:numPr>
           <w:ilvl w:val="0"/>
-          <w:numId w:val="1046"/>
+          <w:numId w:val="1047"/>
         </w:numPr>
         <w:pStyle w:val="Compact"/>
       </w:pPr>
@@ -18548,7 +19247,7 @@
       <w:pPr>
         <w:numPr>
           <w:ilvl w:val="0"/>
-          <w:numId w:val="1046"/>
+          <w:numId w:val="1047"/>
         </w:numPr>
         <w:pStyle w:val="Compact"/>
       </w:pPr>
@@ -18560,7 +19259,7 @@
       <w:pPr>
         <w:numPr>
           <w:ilvl w:val="0"/>
-          <w:numId w:val="1046"/>
+          <w:numId w:val="1047"/>
         </w:numPr>
         <w:pStyle w:val="Compact"/>
       </w:pPr>
@@ -18572,7 +19271,7 @@
       <w:pPr>
         <w:numPr>
           <w:ilvl w:val="0"/>
-          <w:numId w:val="1046"/>
+          <w:numId w:val="1047"/>
         </w:numPr>
         <w:pStyle w:val="Compact"/>
       </w:pPr>
@@ -18584,7 +19283,7 @@
       <w:pPr>
         <w:numPr>
           <w:ilvl w:val="0"/>
-          <w:numId w:val="1046"/>
+          <w:numId w:val="1047"/>
         </w:numPr>
         <w:pStyle w:val="Compact"/>
       </w:pPr>
@@ -18596,7 +19295,7 @@
       <w:pPr>
         <w:numPr>
           <w:ilvl w:val="0"/>
-          <w:numId w:val="1046"/>
+          <w:numId w:val="1047"/>
         </w:numPr>
         <w:pStyle w:val="Compact"/>
       </w:pPr>
@@ -18612,8 +19311,8 @@
         <w:t xml:space="preserve">[Undocumented — architectural judgement]</w:t>
       </w:r>
     </w:p>
-    <w:bookmarkEnd w:id="127"/>
-    <w:bookmarkStart w:id="128" w:name="runbook-e-failback"/>
+    <w:bookmarkEnd w:id="130"/>
+    <w:bookmarkStart w:id="131" w:name="runbook-e-failback"/>
     <w:p>
       <w:pPr>
         <w:pStyle w:val="Heading3"/>
@@ -18626,7 +19325,7 @@
       <w:pPr>
         <w:numPr>
           <w:ilvl w:val="0"/>
-          <w:numId w:val="1047"/>
+          <w:numId w:val="1048"/>
         </w:numPr>
         <w:pStyle w:val="Compact"/>
       </w:pPr>
@@ -18638,7 +19337,7 @@
       <w:pPr>
         <w:numPr>
           <w:ilvl w:val="0"/>
-          <w:numId w:val="1047"/>
+          <w:numId w:val="1048"/>
         </w:numPr>
         <w:pStyle w:val="Compact"/>
       </w:pPr>
@@ -18650,7 +19349,7 @@
       <w:pPr>
         <w:numPr>
           <w:ilvl w:val="0"/>
-          <w:numId w:val="1047"/>
+          <w:numId w:val="1048"/>
         </w:numPr>
         <w:pStyle w:val="Compact"/>
       </w:pPr>
@@ -18662,7 +19361,7 @@
       <w:pPr>
         <w:numPr>
           <w:ilvl w:val="0"/>
-          <w:numId w:val="1047"/>
+          <w:numId w:val="1048"/>
         </w:numPr>
         <w:pStyle w:val="Compact"/>
       </w:pPr>
@@ -18674,7 +19373,7 @@
       <w:pPr>
         <w:numPr>
           <w:ilvl w:val="0"/>
-          <w:numId w:val="1047"/>
+          <w:numId w:val="1048"/>
         </w:numPr>
         <w:pStyle w:val="Compact"/>
       </w:pPr>
@@ -18686,7 +19385,7 @@
       <w:pPr>
         <w:numPr>
           <w:ilvl w:val="0"/>
-          <w:numId w:val="1047"/>
+          <w:numId w:val="1048"/>
         </w:numPr>
         <w:pStyle w:val="Compact"/>
       </w:pPr>
@@ -18698,7 +19397,7 @@
       <w:pPr>
         <w:numPr>
           <w:ilvl w:val="0"/>
-          <w:numId w:val="1047"/>
+          <w:numId w:val="1048"/>
         </w:numPr>
         <w:pStyle w:val="Compact"/>
       </w:pPr>
@@ -18710,7 +19409,7 @@
       <w:pPr>
         <w:numPr>
           <w:ilvl w:val="0"/>
-          <w:numId w:val="1047"/>
+          <w:numId w:val="1048"/>
         </w:numPr>
         <w:pStyle w:val="Compact"/>
       </w:pPr>
@@ -18722,7 +19421,7 @@
       <w:pPr>
         <w:numPr>
           <w:ilvl w:val="0"/>
-          <w:numId w:val="1047"/>
+          <w:numId w:val="1048"/>
         </w:numPr>
         <w:pStyle w:val="Compact"/>
       </w:pPr>
@@ -18734,7 +19433,7 @@
       <w:pPr>
         <w:numPr>
           <w:ilvl w:val="0"/>
-          <w:numId w:val="1047"/>
+          <w:numId w:val="1048"/>
         </w:numPr>
         <w:pStyle w:val="Compact"/>
       </w:pPr>
@@ -18765,9 +19464,9 @@
         <w:t xml:space="preserve">[Undocumented — architectural judgement]</w:t>
       </w:r>
     </w:p>
-    <w:bookmarkEnd w:id="128"/>
-    <w:bookmarkEnd w:id="129"/>
-    <w:bookmarkStart w:id="131" w:name="poc-and-validation-plan"/>
+    <w:bookmarkEnd w:id="131"/>
+    <w:bookmarkEnd w:id="132"/>
+    <w:bookmarkStart w:id="134" w:name="poc-and-validation-plan"/>
     <w:p>
       <w:pPr>
         <w:pStyle w:val="Heading2"/>
@@ -18784,7 +19483,7 @@
         <w:t xml:space="preserve">The workbook is draft and pending execution; therefore its expected results are not production evidence. [Derived]</w:t>
       </w:r>
     </w:p>
-    <w:bookmarkStart w:id="130" w:name="critical-sequence"/>
+    <w:bookmarkStart w:id="133" w:name="critical-sequence"/>
     <w:p>
       <w:pPr>
         <w:pStyle w:val="Heading3"/>
@@ -18797,7 +19496,7 @@
       <w:pPr>
         <w:numPr>
           <w:ilvl w:val="0"/>
-          <w:numId w:val="1048"/>
+          <w:numId w:val="1049"/>
         </w:numPr>
         <w:pStyle w:val="Compact"/>
       </w:pPr>
@@ -18809,7 +19508,7 @@
       <w:pPr>
         <w:numPr>
           <w:ilvl w:val="0"/>
-          <w:numId w:val="1048"/>
+          <w:numId w:val="1049"/>
         </w:numPr>
         <w:pStyle w:val="Compact"/>
       </w:pPr>
@@ -18821,7 +19520,7 @@
       <w:pPr>
         <w:numPr>
           <w:ilvl w:val="0"/>
-          <w:numId w:val="1048"/>
+          <w:numId w:val="1049"/>
         </w:numPr>
         <w:pStyle w:val="Compact"/>
       </w:pPr>
@@ -18833,7 +19532,7 @@
       <w:pPr>
         <w:numPr>
           <w:ilvl w:val="0"/>
-          <w:numId w:val="1048"/>
+          <w:numId w:val="1049"/>
         </w:numPr>
         <w:pStyle w:val="Compact"/>
       </w:pPr>
@@ -18845,7 +19544,7 @@
       <w:pPr>
         <w:numPr>
           <w:ilvl w:val="0"/>
-          <w:numId w:val="1048"/>
+          <w:numId w:val="1049"/>
         </w:numPr>
         <w:pStyle w:val="Compact"/>
       </w:pPr>
@@ -18857,7 +19556,7 @@
       <w:pPr>
         <w:numPr>
           <w:ilvl w:val="0"/>
-          <w:numId w:val="1048"/>
+          <w:numId w:val="1049"/>
         </w:numPr>
         <w:pStyle w:val="Compact"/>
       </w:pPr>
@@ -18921,7 +19620,7 @@
       <w:pPr>
         <w:numPr>
           <w:ilvl w:val="0"/>
-          <w:numId w:val="1048"/>
+          <w:numId w:val="1049"/>
         </w:numPr>
         <w:pStyle w:val="Compact"/>
       </w:pPr>
@@ -18933,7 +19632,7 @@
       <w:pPr>
         <w:numPr>
           <w:ilvl w:val="0"/>
-          <w:numId w:val="1048"/>
+          <w:numId w:val="1049"/>
         </w:numPr>
         <w:pStyle w:val="Compact"/>
       </w:pPr>
@@ -18945,7 +19644,7 @@
       <w:pPr>
         <w:numPr>
           <w:ilvl w:val="0"/>
-          <w:numId w:val="1048"/>
+          <w:numId w:val="1049"/>
         </w:numPr>
         <w:pStyle w:val="Compact"/>
       </w:pPr>
@@ -18957,7 +19656,7 @@
       <w:pPr>
         <w:numPr>
           <w:ilvl w:val="0"/>
-          <w:numId w:val="1048"/>
+          <w:numId w:val="1049"/>
         </w:numPr>
         <w:pStyle w:val="Compact"/>
       </w:pPr>
@@ -18969,7 +19668,7 @@
       <w:pPr>
         <w:numPr>
           <w:ilvl w:val="0"/>
-          <w:numId w:val="1048"/>
+          <w:numId w:val="1049"/>
         </w:numPr>
         <w:pStyle w:val="Compact"/>
       </w:pPr>
@@ -18981,7 +19680,7 @@
       <w:pPr>
         <w:numPr>
           <w:ilvl w:val="0"/>
-          <w:numId w:val="1048"/>
+          <w:numId w:val="1049"/>
         </w:numPr>
         <w:pStyle w:val="Compact"/>
       </w:pPr>
@@ -18993,7 +19692,7 @@
       <w:pPr>
         <w:numPr>
           <w:ilvl w:val="0"/>
-          <w:numId w:val="1048"/>
+          <w:numId w:val="1049"/>
         </w:numPr>
         <w:pStyle w:val="Compact"/>
       </w:pPr>
@@ -19005,7 +19704,7 @@
       <w:pPr>
         <w:numPr>
           <w:ilvl w:val="0"/>
-          <w:numId w:val="1048"/>
+          <w:numId w:val="1049"/>
         </w:numPr>
         <w:pStyle w:val="Compact"/>
       </w:pPr>
@@ -19017,7 +19716,7 @@
       <w:pPr>
         <w:numPr>
           <w:ilvl w:val="0"/>
-          <w:numId w:val="1048"/>
+          <w:numId w:val="1049"/>
         </w:numPr>
         <w:pStyle w:val="Compact"/>
       </w:pPr>
@@ -19029,7 +19728,7 @@
       <w:pPr>
         <w:numPr>
           <w:ilvl w:val="0"/>
-          <w:numId w:val="1048"/>
+          <w:numId w:val="1049"/>
         </w:numPr>
         <w:pStyle w:val="Compact"/>
       </w:pPr>
@@ -19041,7 +19740,7 @@
       <w:pPr>
         <w:numPr>
           <w:ilvl w:val="0"/>
-          <w:numId w:val="1048"/>
+          <w:numId w:val="1049"/>
         </w:numPr>
         <w:pStyle w:val="Compact"/>
       </w:pPr>
@@ -19053,7 +19752,7 @@
       <w:pPr>
         <w:numPr>
           <w:ilvl w:val="0"/>
-          <w:numId w:val="1048"/>
+          <w:numId w:val="1049"/>
         </w:numPr>
         <w:pStyle w:val="Compact"/>
       </w:pPr>
@@ -19081,7 +19780,7 @@
       <w:pPr>
         <w:numPr>
           <w:ilvl w:val="0"/>
-          <w:numId w:val="1049"/>
+          <w:numId w:val="1050"/>
         </w:numPr>
         <w:pStyle w:val="Compact"/>
       </w:pPr>
@@ -19093,7 +19792,7 @@
       <w:pPr>
         <w:numPr>
           <w:ilvl w:val="0"/>
-          <w:numId w:val="1049"/>
+          <w:numId w:val="1050"/>
         </w:numPr>
         <w:pStyle w:val="Compact"/>
       </w:pPr>
@@ -19105,7 +19804,7 @@
       <w:pPr>
         <w:numPr>
           <w:ilvl w:val="0"/>
-          <w:numId w:val="1049"/>
+          <w:numId w:val="1050"/>
         </w:numPr>
         <w:pStyle w:val="Compact"/>
       </w:pPr>
@@ -19117,7 +19816,7 @@
       <w:pPr>
         <w:numPr>
           <w:ilvl w:val="0"/>
-          <w:numId w:val="1049"/>
+          <w:numId w:val="1050"/>
         </w:numPr>
         <w:pStyle w:val="Compact"/>
       </w:pPr>
@@ -19129,7 +19828,7 @@
       <w:pPr>
         <w:numPr>
           <w:ilvl w:val="0"/>
-          <w:numId w:val="1049"/>
+          <w:numId w:val="1050"/>
         </w:numPr>
         <w:pStyle w:val="Compact"/>
       </w:pPr>
@@ -19141,7 +19840,7 @@
       <w:pPr>
         <w:numPr>
           <w:ilvl w:val="0"/>
-          <w:numId w:val="1049"/>
+          <w:numId w:val="1050"/>
         </w:numPr>
         <w:pStyle w:val="Compact"/>
       </w:pPr>
@@ -19153,7 +19852,7 @@
       <w:pPr>
         <w:numPr>
           <w:ilvl w:val="0"/>
-          <w:numId w:val="1049"/>
+          <w:numId w:val="1050"/>
         </w:numPr>
         <w:pStyle w:val="Compact"/>
       </w:pPr>
@@ -19165,7 +19864,7 @@
       <w:pPr>
         <w:numPr>
           <w:ilvl w:val="0"/>
-          <w:numId w:val="1049"/>
+          <w:numId w:val="1050"/>
         </w:numPr>
         <w:pStyle w:val="Compact"/>
       </w:pPr>
@@ -19177,7 +19876,7 @@
       <w:pPr>
         <w:numPr>
           <w:ilvl w:val="0"/>
-          <w:numId w:val="1049"/>
+          <w:numId w:val="1050"/>
         </w:numPr>
         <w:pStyle w:val="Compact"/>
       </w:pPr>
@@ -19189,7 +19888,7 @@
       <w:pPr>
         <w:numPr>
           <w:ilvl w:val="0"/>
-          <w:numId w:val="1049"/>
+          <w:numId w:val="1050"/>
         </w:numPr>
         <w:pStyle w:val="Compact"/>
       </w:pPr>
@@ -19201,7 +19900,7 @@
       <w:pPr>
         <w:numPr>
           <w:ilvl w:val="0"/>
-          <w:numId w:val="1049"/>
+          <w:numId w:val="1050"/>
         </w:numPr>
         <w:pStyle w:val="Compact"/>
       </w:pPr>
@@ -19217,9 +19916,9 @@
         <w:t xml:space="preserve">[Undocumented — architectural judgement]</w:t>
       </w:r>
     </w:p>
-    <w:bookmarkEnd w:id="130"/>
-    <w:bookmarkEnd w:id="131"/>
-    <w:bookmarkStart w:id="142" w:name="workflow-diagrams"/>
+    <w:bookmarkEnd w:id="133"/>
+    <w:bookmarkEnd w:id="134"/>
+    <w:bookmarkStart w:id="145" w:name="workflow-diagrams"/>
     <w:p>
       <w:pPr>
         <w:pStyle w:val="Heading2"/>
@@ -19228,7 +19927,7 @@
         <w:t xml:space="preserve">43. Workflow Diagrams</w:t>
       </w:r>
     </w:p>
-    <w:bookmarkStart w:id="132" w:name="customer-onboarding"/>
+    <w:bookmarkStart w:id="135" w:name="customer-onboarding"/>
     <w:p>
       <w:pPr>
         <w:pStyle w:val="Heading3"/>
@@ -19365,8 +20064,8 @@
         <w:t xml:space="preserve">    Record --&gt; Ready[Onboarding Ready]</w:t>
       </w:r>
     </w:p>
-    <w:bookmarkEnd w:id="132"/>
-    <w:bookmarkStart w:id="133" w:name="region-selection"/>
+    <w:bookmarkEnd w:id="135"/>
+    <w:bookmarkStart w:id="136" w:name="region-selection"/>
     <w:p>
       <w:pPr>
         <w:pStyle w:val="Heading3"/>
@@ -19476,8 +20175,8 @@
         <w:t xml:space="preserve">    Commit -- Yes --&gt; Assignment[Persist Assignment]</w:t>
       </w:r>
     </w:p>
-    <w:bookmarkEnd w:id="133"/>
-    <w:bookmarkStart w:id="134" w:name="capacity-allocation"/>
+    <w:bookmarkEnd w:id="136"/>
+    <w:bookmarkStart w:id="137" w:name="capacity-allocation"/>
     <w:p>
       <w:pPr>
         <w:pStyle w:val="Heading3"/>
@@ -19578,8 +20277,8 @@
         <w:t xml:space="preserve">    Snapshot --&gt; Complete[Complete Operation]</w:t>
       </w:r>
     </w:p>
-    <w:bookmarkEnd w:id="134"/>
-    <w:bookmarkStart w:id="135" w:name="quota-allocation"/>
+    <w:bookmarkEnd w:id="137"/>
+    <w:bookmarkStart w:id="138" w:name="quota-allocation"/>
     <w:p>
       <w:pPr>
         <w:pStyle w:val="Heading3"/>
@@ -19698,8 +20397,8 @@
         <w:t xml:space="preserve">    Refresh --&gt; Complete</w:t>
       </w:r>
     </w:p>
-    <w:bookmarkEnd w:id="135"/>
-    <w:bookmarkStart w:id="136" w:name="capacity-sharing"/>
+    <w:bookmarkEnd w:id="138"/>
+    <w:bookmarkStart w:id="139" w:name="capacity-sharing"/>
     <w:p>
       <w:pPr>
         <w:pStyle w:val="Heading3"/>
@@ -19791,8 +20490,8 @@
         <w:t xml:space="preserve">    Verify --&gt; Active[Activate Sharing Relationship]</w:t>
       </w:r>
     </w:p>
-    <w:bookmarkEnd w:id="136"/>
-    <w:bookmarkStart w:id="137" w:name="dr-activation"/>
+    <w:bookmarkEnd w:id="139"/>
+    <w:bookmarkStart w:id="140" w:name="dr-activation"/>
     <w:p>
       <w:pPr>
         <w:pStyle w:val="Heading3"/>
@@ -19911,8 +20610,8 @@
         <w:t xml:space="preserve">    Final -- No --&gt; Hold[Enter Incident Hold]</w:t>
       </w:r>
     </w:p>
-    <w:bookmarkEnd w:id="137"/>
-    <w:bookmarkStart w:id="138" w:name="dr-failback"/>
+    <w:bookmarkEnd w:id="140"/>
+    <w:bookmarkStart w:id="141" w:name="dr-failback"/>
     <w:p>
       <w:pPr>
         <w:pStyle w:val="Heading3"/>
@@ -20031,8 +20730,8 @@
         <w:t xml:space="preserve">    Reconcile --&gt; Steady[Set Steady State]</w:t>
       </w:r>
     </w:p>
-    <w:bookmarkEnd w:id="138"/>
-    <w:bookmarkStart w:id="139" w:name="quota-reallocation"/>
+    <w:bookmarkEnd w:id="141"/>
+    <w:bookmarkStart w:id="142" w:name="quota-reallocation"/>
     <w:p>
       <w:pPr>
         <w:pStyle w:val="Heading3"/>
@@ -20142,8 +20841,8 @@
         <w:t xml:space="preserve">    RestorePlan --&gt; Complete[Complete Reallocation]</w:t>
       </w:r>
     </w:p>
-    <w:bookmarkEnd w:id="139"/>
-    <w:bookmarkStart w:id="140" w:name="capacity-exhaustion-handling"/>
+    <w:bookmarkEnd w:id="142"/>
+    <w:bookmarkStart w:id="143" w:name="capacity-exhaustion-handling"/>
     <w:p>
       <w:pPr>
         <w:pStyle w:val="Heading3"/>
@@ -20253,8 +20952,8 @@
         <w:t xml:space="preserve">    Increase --&gt; Reevaluate[Reevaluate After Confirmed Change]</w:t>
       </w:r>
     </w:p>
-    <w:bookmarkEnd w:id="140"/>
-    <w:bookmarkStart w:id="141" w:name="capacity-scaling"/>
+    <w:bookmarkEnd w:id="143"/>
+    <w:bookmarkStart w:id="144" w:name="capacity-scaling"/>
     <w:p>
       <w:pPr>
         <w:pStyle w:val="Heading3"/>
@@ -20382,9 +21081,9 @@
         <w:t xml:space="preserve">    Cooldown --&gt; Complete[Complete Request]</w:t>
       </w:r>
     </w:p>
-    <w:bookmarkEnd w:id="141"/>
-    <w:bookmarkEnd w:id="142"/>
-    <w:bookmarkStart w:id="144" w:name="decision-log-and-board-actions"/>
+    <w:bookmarkEnd w:id="144"/>
+    <w:bookmarkEnd w:id="145"/>
+    <w:bookmarkStart w:id="147" w:name="decision-log-and-board-actions"/>
     <w:p>
       <w:pPr>
         <w:pStyle w:val="Heading2"/>
@@ -20823,7 +21522,7 @@
         </w:tc>
       </w:tr>
     </w:tbl>
-    <w:bookmarkStart w:id="143" w:name="required-board-actions"/>
+    <w:bookmarkStart w:id="146" w:name="required-board-actions"/>
     <w:p>
       <w:pPr>
         <w:pStyle w:val="Heading3"/>
@@ -20836,7 +21535,7 @@
       <w:pPr>
         <w:numPr>
           <w:ilvl w:val="0"/>
-          <w:numId w:val="1050"/>
+          <w:numId w:val="1051"/>
         </w:numPr>
         <w:pStyle w:val="Compact"/>
       </w:pPr>
@@ -20848,7 +21547,7 @@
       <w:pPr>
         <w:numPr>
           <w:ilvl w:val="0"/>
-          <w:numId w:val="1050"/>
+          <w:numId w:val="1051"/>
         </w:numPr>
         <w:pStyle w:val="Compact"/>
       </w:pPr>
@@ -20860,7 +21559,7 @@
       <w:pPr>
         <w:numPr>
           <w:ilvl w:val="0"/>
-          <w:numId w:val="1050"/>
+          <w:numId w:val="1051"/>
         </w:numPr>
         <w:pStyle w:val="Compact"/>
       </w:pPr>
@@ -20872,7 +21571,7 @@
       <w:pPr>
         <w:numPr>
           <w:ilvl w:val="0"/>
-          <w:numId w:val="1050"/>
+          <w:numId w:val="1051"/>
         </w:numPr>
         <w:pStyle w:val="Compact"/>
       </w:pPr>
@@ -20884,7 +21583,7 @@
       <w:pPr>
         <w:numPr>
           <w:ilvl w:val="0"/>
-          <w:numId w:val="1050"/>
+          <w:numId w:val="1051"/>
         </w:numPr>
         <w:pStyle w:val="Compact"/>
       </w:pPr>
@@ -20896,7 +21595,7 @@
       <w:pPr>
         <w:numPr>
           <w:ilvl w:val="0"/>
-          <w:numId w:val="1050"/>
+          <w:numId w:val="1051"/>
         </w:numPr>
         <w:pStyle w:val="Compact"/>
       </w:pPr>
@@ -20908,7 +21607,7 @@
       <w:pPr>
         <w:numPr>
           <w:ilvl w:val="0"/>
-          <w:numId w:val="1050"/>
+          <w:numId w:val="1051"/>
         </w:numPr>
         <w:pStyle w:val="Compact"/>
       </w:pPr>
@@ -20924,9 +21623,9 @@
         <w:t xml:space="preserve">[Undocumented — architectural judgement]</w:t>
       </w:r>
     </w:p>
-    <w:bookmarkEnd w:id="143"/>
-    <w:bookmarkEnd w:id="144"/>
-    <w:bookmarkStart w:id="145" w:name="final-conclusion"/>
+    <w:bookmarkEnd w:id="146"/>
+    <w:bookmarkEnd w:id="147"/>
+    <w:bookmarkStart w:id="148" w:name="final-conclusion"/>
     <w:p>
       <w:pPr>
         <w:pStyle w:val="Heading2"/>
@@ -20955,7 +21654,7 @@
       <w:pPr>
         <w:numPr>
           <w:ilvl w:val="0"/>
-          <w:numId w:val="1051"/>
+          <w:numId w:val="1052"/>
         </w:numPr>
         <w:pStyle w:val="Compact"/>
       </w:pPr>
@@ -20967,7 +21666,7 @@
       <w:pPr>
         <w:numPr>
           <w:ilvl w:val="0"/>
-          <w:numId w:val="1051"/>
+          <w:numId w:val="1052"/>
         </w:numPr>
         <w:pStyle w:val="Compact"/>
       </w:pPr>
@@ -20979,7 +21678,7 @@
       <w:pPr>
         <w:numPr>
           <w:ilvl w:val="0"/>
-          <w:numId w:val="1051"/>
+          <w:numId w:val="1052"/>
         </w:numPr>
         <w:pStyle w:val="Compact"/>
       </w:pPr>
@@ -20991,7 +21690,7 @@
       <w:pPr>
         <w:numPr>
           <w:ilvl w:val="0"/>
-          <w:numId w:val="1051"/>
+          <w:numId w:val="1052"/>
         </w:numPr>
         <w:pStyle w:val="Compact"/>
       </w:pPr>
@@ -21003,7 +21702,7 @@
       <w:pPr>
         <w:numPr>
           <w:ilvl w:val="0"/>
-          <w:numId w:val="1051"/>
+          <w:numId w:val="1052"/>
         </w:numPr>
         <w:pStyle w:val="Compact"/>
       </w:pPr>
@@ -21015,7 +21714,7 @@
       <w:pPr>
         <w:numPr>
           <w:ilvl w:val="0"/>
-          <w:numId w:val="1051"/>
+          <w:numId w:val="1052"/>
         </w:numPr>
         <w:pStyle w:val="Compact"/>
       </w:pPr>
@@ -21027,7 +21726,7 @@
       <w:pPr>
         <w:numPr>
           <w:ilvl w:val="0"/>
-          <w:numId w:val="1051"/>
+          <w:numId w:val="1052"/>
         </w:numPr>
         <w:pStyle w:val="Compact"/>
       </w:pPr>
@@ -21039,7 +21738,7 @@
       <w:pPr>
         <w:numPr>
           <w:ilvl w:val="0"/>
-          <w:numId w:val="1051"/>
+          <w:numId w:val="1052"/>
         </w:numPr>
         <w:pStyle w:val="Compact"/>
       </w:pPr>
@@ -21062,8 +21761,8 @@
         </w:pict>
       </w:r>
     </w:p>
-    <w:bookmarkEnd w:id="145"/>
-    <w:bookmarkStart w:id="146" w:name="sources"/>
+    <w:bookmarkEnd w:id="148"/>
+    <w:bookmarkStart w:id="149" w:name="sources"/>
     <w:p>
       <w:pPr>
         <w:pStyle w:val="Heading2"/>
@@ -21076,7 +21775,7 @@
       <w:pPr>
         <w:numPr>
           <w:ilvl w:val="0"/>
-          <w:numId w:val="1052"/>
+          <w:numId w:val="1053"/>
         </w:numPr>
         <w:pStyle w:val="Compact"/>
       </w:pPr>
@@ -21088,7 +21787,7 @@
       <w:pPr>
         <w:numPr>
           <w:ilvl w:val="0"/>
-          <w:numId w:val="1052"/>
+          <w:numId w:val="1053"/>
         </w:numPr>
         <w:pStyle w:val="Compact"/>
       </w:pPr>
@@ -21100,7 +21799,7 @@
       <w:pPr>
         <w:numPr>
           <w:ilvl w:val="0"/>
-          <w:numId w:val="1052"/>
+          <w:numId w:val="1053"/>
         </w:numPr>
         <w:pStyle w:val="Compact"/>
       </w:pPr>
@@ -21112,7 +21811,7 @@
       <w:pPr>
         <w:numPr>
           <w:ilvl w:val="0"/>
-          <w:numId w:val="1052"/>
+          <w:numId w:val="1053"/>
         </w:numPr>
         <w:pStyle w:val="Compact"/>
       </w:pPr>
@@ -21124,7 +21823,7 @@
       <w:pPr>
         <w:numPr>
           <w:ilvl w:val="0"/>
-          <w:numId w:val="1052"/>
+          <w:numId w:val="1053"/>
         </w:numPr>
         <w:pStyle w:val="Compact"/>
       </w:pPr>
@@ -21132,8 +21831,8 @@
         <w:t xml:space="preserve">azure_cr_poc_test_workbook.md (uploaded document)</w:t>
       </w:r>
     </w:p>
-    <w:bookmarkEnd w:id="146"/>
-    <w:bookmarkEnd w:id="147"/>
+    <w:bookmarkEnd w:id="149"/>
+    <w:bookmarkEnd w:id="150"/>
     <w:sectPr/>
   </w:body>
 </w:document>
@@ -21675,6 +22374,9 @@
     <w:abstractNumId w:val="991"/>
   </w:num>
   <w:num w:numId="1037">
+    <w:abstractNumId w:val="991"/>
+  </w:num>
+  <w:num w:numId="1038">
     <w:abstractNumId w:val="99411"/>
     <w:lvlOverride w:ilvl="0">
       <w:startOverride w:val="1"/>
@@ -21704,9 +22406,6 @@
       <w:startOverride w:val="1"/>
     </w:lvlOverride>
   </w:num>
-  <w:num w:numId="1038">
-    <w:abstractNumId w:val="991"/>
-  </w:num>
   <w:num w:numId="1039">
     <w:abstractNumId w:val="991"/>
   </w:num>
@@ -21717,34 +22416,7 @@
     <w:abstractNumId w:val="991"/>
   </w:num>
   <w:num w:numId="1042">
-    <w:abstractNumId w:val="99411"/>
-    <w:lvlOverride w:ilvl="0">
-      <w:startOverride w:val="1"/>
-    </w:lvlOverride>
-    <w:lvlOverride w:ilvl="1">
-      <w:startOverride w:val="1"/>
-    </w:lvlOverride>
-    <w:lvlOverride w:ilvl="2">
-      <w:startOverride w:val="1"/>
-    </w:lvlOverride>
-    <w:lvlOverride w:ilvl="3">
-      <w:startOverride w:val="1"/>
-    </w:lvlOverride>
-    <w:lvlOverride w:ilvl="4">
-      <w:startOverride w:val="1"/>
-    </w:lvlOverride>
-    <w:lvlOverride w:ilvl="5">
-      <w:startOverride w:val="1"/>
-    </w:lvlOverride>
-    <w:lvlOverride w:ilvl="6">
-      <w:startOverride w:val="1"/>
-    </w:lvlOverride>
-    <w:lvlOverride w:ilvl="7">
-      <w:startOverride w:val="1"/>
-    </w:lvlOverride>
-    <w:lvlOverride w:ilvl="8">
-      <w:startOverride w:val="1"/>
-    </w:lvlOverride>
+    <w:abstractNumId w:val="991"/>
   </w:num>
   <w:num w:numId="1043">
     <w:abstractNumId w:val="99411"/>
@@ -21927,9 +22599,6 @@
     </w:lvlOverride>
   </w:num>
   <w:num w:numId="1049">
-    <w:abstractNumId w:val="991"/>
-  </w:num>
-  <w:num w:numId="1050">
     <w:abstractNumId w:val="99411"/>
     <w:lvlOverride w:ilvl="0">
       <w:startOverride w:val="1"/>
@@ -21959,10 +22628,43 @@
       <w:startOverride w:val="1"/>
     </w:lvlOverride>
   </w:num>
-  <w:num w:numId="1051">
+  <w:num w:numId="1050">
     <w:abstractNumId w:val="991"/>
   </w:num>
+  <w:num w:numId="1051">
+    <w:abstractNumId w:val="99411"/>
+    <w:lvlOverride w:ilvl="0">
+      <w:startOverride w:val="1"/>
+    </w:lvlOverride>
+    <w:lvlOverride w:ilvl="1">
+      <w:startOverride w:val="1"/>
+    </w:lvlOverride>
+    <w:lvlOverride w:ilvl="2">
+      <w:startOverride w:val="1"/>
+    </w:lvlOverride>
+    <w:lvlOverride w:ilvl="3">
+      <w:startOverride w:val="1"/>
+    </w:lvlOverride>
+    <w:lvlOverride w:ilvl="4">
+      <w:startOverride w:val="1"/>
+    </w:lvlOverride>
+    <w:lvlOverride w:ilvl="5">
+      <w:startOverride w:val="1"/>
+    </w:lvlOverride>
+    <w:lvlOverride w:ilvl="6">
+      <w:startOverride w:val="1"/>
+    </w:lvlOverride>
+    <w:lvlOverride w:ilvl="7">
+      <w:startOverride w:val="1"/>
+    </w:lvlOverride>
+    <w:lvlOverride w:ilvl="8">
+      <w:startOverride w:val="1"/>
+    </w:lvlOverride>
+  </w:num>
   <w:num w:numId="1052">
+    <w:abstractNumId w:val="991"/>
+  </w:num>
+  <w:num w:numId="1053">
     <w:abstractNumId w:val="99411"/>
     <w:lvlOverride w:ilvl="0">
       <w:startOverride w:val="1"/>

</xml_diff>

<commit_message>
PRR §27: fix cross-geo extension arrow direction (Saudi Arabia/UAE North → Belgium Central)
</commit_message>
<xml_diff>
--- a/docs/acrme_production_readiness_review_and_architecture.docx
+++ b/docs/acrme_production_readiness_review_and_architecture.docx
@@ -10094,7 +10094,7 @@
               <w:jc w:val="left"/>
             </w:pPr>
             <w:r>
-              <w:t xml:space="preserve">Belgium Central → Saudi Arabia</w:t>
+              <w:t xml:space="preserve">Saudi Arabia → Belgium Central</w:t>
             </w:r>
           </w:p>
         </w:tc>
@@ -10132,7 +10132,7 @@
               <w:jc w:val="left"/>
             </w:pPr>
             <w:r>
-              <w:t xml:space="preserve">Belgium Central → UAE North</w:t>
+              <w:t xml:space="preserve">UAE North → Belgium Central</w:t>
             </w:r>
           </w:p>
         </w:tc>
@@ -10367,7 +10367,7 @@
               <w:jc w:val="left"/>
             </w:pPr>
             <w:r>
-              <w:t xml:space="preserve">Belgium Central → Saudi Arabia, Belgium Central → UAE North</w:t>
+              <w:t xml:space="preserve">Saudi Arabia → Belgium Central, UAE North → Belgium Central</w:t>
             </w:r>
           </w:p>
         </w:tc>
@@ -11650,7 +11650,7 @@
         <w:pStyle w:val="Compact"/>
       </w:pPr>
       <w:r>
-        <w:t xml:space="preserve">The extension paths Belgium Central → Saudi Arabia and Belgium Central → UAE North are the only currently approved Cross-Geo Extension paths. Any additional paths require a</w:t>
+        <w:t xml:space="preserve">The extension paths Saudi Arabia → Belgium Central and UAE North → Belgium Central are the only currently approved Cross-Geo Extension paths. Any additional paths require a</w:t>
       </w:r>
       <w:r>
         <w:t xml:space="preserve"> </w:t>

</xml_diff>

<commit_message>
Add source research documents under docs/research/ and link them from the PRR and README
- Publish 5 research inputs: engine design, multi-region placement design, change summary, traceability review, POC test workbook
- Add docs/research/README.md index
- Update PRR Section 2, HC-1..HC-8 reference, and Sources section with links to docs/research/
- Update repo README layout tree and add Research documents subsection
</commit_message>
<xml_diff>
--- a/docs/acrme_production_readiness_review_and_architecture.docx
+++ b/docs/acrme_production_readiness_review_and_architecture.docx
@@ -24,7 +24,7 @@
       </w:r>
     </w:p>
     <w:bookmarkEnd w:id="20"/>
-    <w:bookmarkStart w:id="70" w:name="part-i-production-readiness-review"/>
+    <w:bookmarkStart w:id="76" w:name="part-i-production-readiness-review"/>
     <w:p>
       <w:pPr>
         <w:pStyle w:val="Heading1"/>
@@ -280,7 +280,7 @@
       </w:r>
     </w:p>
     <w:bookmarkEnd w:id="21"/>
-    <w:bookmarkStart w:id="23" w:name="review-scope-and-evidence-standard"/>
+    <w:bookmarkStart w:id="29" w:name="review-scope-and-evidence-standard"/>
     <w:p>
       <w:pPr>
         <w:pStyle w:val="Heading2"/>
@@ -294,7 +294,94 @@
         <w:pStyle w:val="FirstParagraph"/>
       </w:pPr>
       <w:r>
-        <w:t xml:space="preserve">This review reconciles the original engine design, the final multi-region placement design, the change summary, the requirements traceability review, and the POC workbook. [Derived]</w:t>
+        <w:t xml:space="preserve">This review reconciles the</w:t>
+      </w:r>
+      <w:r>
+        <w:t xml:space="preserve"> </w:t>
+      </w:r>
+      <w:hyperlink r:id="rId22">
+        <w:r>
+          <w:rPr>
+            <w:rStyle w:val="Hyperlink"/>
+          </w:rPr>
+          <w:t xml:space="preserve">original engine design</w:t>
+        </w:r>
+      </w:hyperlink>
+      <w:r>
+        <w:t xml:space="preserve">, the</w:t>
+      </w:r>
+      <w:r>
+        <w:t xml:space="preserve"> </w:t>
+      </w:r>
+      <w:hyperlink r:id="rId23">
+        <w:r>
+          <w:rPr>
+            <w:rStyle w:val="Hyperlink"/>
+          </w:rPr>
+          <w:t xml:space="preserve">final multi-region placement design</w:t>
+        </w:r>
+      </w:hyperlink>
+      <w:r>
+        <w:t xml:space="preserve">, the</w:t>
+      </w:r>
+      <w:r>
+        <w:t xml:space="preserve"> </w:t>
+      </w:r>
+      <w:hyperlink r:id="rId24">
+        <w:r>
+          <w:rPr>
+            <w:rStyle w:val="Hyperlink"/>
+          </w:rPr>
+          <w:t xml:space="preserve">change summary</w:t>
+        </w:r>
+      </w:hyperlink>
+      <w:r>
+        <w:t xml:space="preserve">, the</w:t>
+      </w:r>
+      <w:r>
+        <w:t xml:space="preserve"> </w:t>
+      </w:r>
+      <w:hyperlink r:id="rId25">
+        <w:r>
+          <w:rPr>
+            <w:rStyle w:val="Hyperlink"/>
+          </w:rPr>
+          <w:t xml:space="preserve">requirements traceability review</w:t>
+        </w:r>
+      </w:hyperlink>
+      <w:r>
+        <w:t xml:space="preserve">, and the</w:t>
+      </w:r>
+      <w:r>
+        <w:t xml:space="preserve"> </w:t>
+      </w:r>
+      <w:hyperlink r:id="rId26">
+        <w:r>
+          <w:rPr>
+            <w:rStyle w:val="Hyperlink"/>
+          </w:rPr>
+          <w:t xml:space="preserve">POC workbook</w:t>
+        </w:r>
+      </w:hyperlink>
+      <w:r>
+        <w:t xml:space="preserve">. [Derived] All five source documents are published under</w:t>
+      </w:r>
+      <w:r>
+        <w:t xml:space="preserve"> </w:t>
+      </w:r>
+      <w:hyperlink r:id="rId27">
+        <w:r>
+          <w:rPr>
+            <w:rStyle w:val="VerbatimChar"/>
+          </w:rPr>
+          <w:t xml:space="preserve">docs/research/</w:t>
+        </w:r>
+      </w:hyperlink>
+      <w:r>
+        <w:t xml:space="preserve"> </w:t>
+      </w:r>
+      <w:r>
+        <w:t xml:space="preserve">(see the Sources section). [Derived]</w:t>
       </w:r>
     </w:p>
     <w:p>
@@ -405,7 +492,7 @@
         <w:t xml:space="preserve">The traceability review reports 48 of 49 functional requirements as fully covered, one as partially covered, and significant gaps in scalability testing and sovereign-cloud readiness. [Derived] Design coverage is not the same as implemented, tested, supportable, or production-ready behavior. [Undocumented — architectural judgement]</w:t>
       </w:r>
     </w:p>
-    <w:bookmarkStart w:id="22" w:name="evidence-hierarchy"/>
+    <w:bookmarkStart w:id="28" w:name="evidence-hierarchy"/>
     <w:p>
       <w:pPr>
         <w:pStyle w:val="Heading3"/>
@@ -622,9 +709,9 @@
         <w:t xml:space="preserve">The supplied workbook describes tests through POC-51 while the mandate refers to a 48-POC workbook. [Derived] The reconciliation is that numbering and test count are not interchangeable: the sequence contains gaps and extensions, so the highest identifier does not establish the number of executable test cases. [Derived] The authoritative test inventory must therefore be generated from the workbook index before gate reporting. [Undocumented — architectural judgement]</w:t>
       </w:r>
     </w:p>
-    <w:bookmarkEnd w:id="22"/>
-    <w:bookmarkEnd w:id="23"/>
-    <w:bookmarkStart w:id="26" w:name="original-design-assessment"/>
+    <w:bookmarkEnd w:id="28"/>
+    <w:bookmarkEnd w:id="29"/>
+    <w:bookmarkStart w:id="32" w:name="original-design-assessment"/>
     <w:p>
       <w:pPr>
         <w:pStyle w:val="Heading2"/>
@@ -641,7 +728,7 @@
         <w:t xml:space="preserve">The original design is broad and internally coherent, but it overstates maturity in several places.</w:t>
       </w:r>
     </w:p>
-    <w:bookmarkStart w:id="24" w:name="strengths"/>
+    <w:bookmarkStart w:id="30" w:name="strengths"/>
     <w:p>
       <w:pPr>
         <w:pStyle w:val="Heading3"/>
@@ -710,8 +797,8 @@
         <w:t xml:space="preserve">The original design recognizes that deletion, sharing, and DR operations have different safety properties and should not be handled as generic CRUD. [Derived]</w:t>
       </w:r>
     </w:p>
-    <w:bookmarkEnd w:id="24"/>
-    <w:bookmarkStart w:id="25" w:name="weaknesses"/>
+    <w:bookmarkEnd w:id="30"/>
+    <w:bookmarkStart w:id="31" w:name="weaknesses"/>
     <w:p>
       <w:pPr>
         <w:pStyle w:val="Heading3"/>
@@ -782,9 +869,9 @@
         <w:t xml:space="preserve">The design also states concrete ARM limits, cost-data delays, quota-processing windows, and retry parameters without exposing claim-level official evidence in the supplied material. [Derived] Those figures must be configuration defaults or validation hypotheses, not platform guarantees. [Undocumented — architectural judgement]</w:t>
       </w:r>
     </w:p>
-    <w:bookmarkEnd w:id="25"/>
-    <w:bookmarkEnd w:id="26"/>
-    <w:bookmarkStart w:id="31" w:name="final-multi-region-design-assessment"/>
+    <w:bookmarkEnd w:id="31"/>
+    <w:bookmarkEnd w:id="32"/>
+    <w:bookmarkStart w:id="37" w:name="final-multi-region-design-assessment"/>
     <w:p>
       <w:pPr>
         <w:pStyle w:val="Heading2"/>
@@ -801,7 +888,7 @@
         <w:t xml:space="preserve">The final design improves separation of steady-state and emergency operations, but it introduces concentrated risks.</w:t>
       </w:r>
     </w:p>
-    <w:bookmarkStart w:id="27" w:name="three-crg-model"/>
+    <w:bookmarkStart w:id="33" w:name="three-crg-model"/>
     <w:p>
       <w:pPr>
         <w:pStyle w:val="Heading3"/>
@@ -818,8 +905,8 @@
         <w:t xml:space="preserve">Exactly one Prod CRG, one NonProd CRG, and one DR CRG per region simplifies policy and reporting. [Derived] It may not scale where multiple SKUs, zones, hardware generations, isolation requirements, or customer-specific CRGs are needed. [Derived] A CRG count multiplier must therefore be modeled rather than assuming three CRGs is sufficient for every region. [Undocumented — architectural judgement]</w:t>
       </w:r>
     </w:p>
-    <w:bookmarkEnd w:id="27"/>
-    <w:bookmarkStart w:id="28" w:name="nonprod-and-dr-co-location"/>
+    <w:bookmarkEnd w:id="33"/>
+    <w:bookmarkStart w:id="34" w:name="nonprod-and-dr-co-location"/>
     <w:p>
       <w:pPr>
         <w:pStyle w:val="Heading3"/>
@@ -836,8 +923,8 @@
         <w:t xml:space="preserve">Allowing NonProd and DR to share a region enables capacity reuse but introduces correlated regional loss. [Derived] If both are in the same region, a regional outage can remove both the DR target and the NonProd overflow pool for that customer. [Derived] The co-location rule is therefore acceptable only when the failure-domain policy confirms that the shared region remains independent of Prod and the customer accepts simultaneous NonProd loss. [Undocumented — architectural judgement]</w:t>
       </w:r>
     </w:p>
-    <w:bookmarkEnd w:id="28"/>
-    <w:bookmarkStart w:id="29" w:name="sequential-placement"/>
+    <w:bookmarkEnd w:id="34"/>
+    <w:bookmarkStart w:id="35" w:name="sequential-placement"/>
     <w:p>
       <w:pPr>
         <w:pStyle w:val="Heading3"/>
@@ -854,8 +941,8 @@
         <w:t xml:space="preserve">Sequential selection is transparent, but it is not guaranteed to produce the best portfolio outcome. [Undocumented — architectural judgement] The claim that sequential and joint optimization are nearly always equivalent is not supported by a proof or executed workload study in the supplied evidence. [Derived] The engine should compute both approaches in shadow mode during the pilot and quantify divergence. [Undocumented — architectural judgement]</w:t>
       </w:r>
     </w:p>
-    <w:bookmarkEnd w:id="29"/>
-    <w:bookmarkStart w:id="30" w:name="scoring-formulas"/>
+    <w:bookmarkEnd w:id="35"/>
+    <w:bookmarkStart w:id="36" w:name="scoring-formulas"/>
     <w:p>
       <w:pPr>
         <w:pStyle w:val="Heading3"/>
@@ -970,9 +1057,9 @@
         <w:t xml:space="preserve">The formula is suitable for recommendation experiments, not autonomous placement, until normalized, versioned, replay-tested, and compared against capacity-weighted alternatives. [Undocumented — architectural judgement]</w:t>
       </w:r>
     </w:p>
-    <w:bookmarkEnd w:id="30"/>
-    <w:bookmarkEnd w:id="31"/>
-    <w:bookmarkStart w:id="37" w:name="platform-behavior-validation"/>
+    <w:bookmarkEnd w:id="36"/>
+    <w:bookmarkEnd w:id="37"/>
+    <w:bookmarkStart w:id="43" w:name="platform-behavior-validation"/>
     <w:p>
       <w:pPr>
         <w:pStyle w:val="Heading2"/>
@@ -981,7 +1068,7 @@
         <w:t xml:space="preserve">5. Platform Behavior Validation</w:t>
       </w:r>
     </w:p>
-    <w:bookmarkStart w:id="32" w:name="crg-sharing"/>
+    <w:bookmarkStart w:id="38" w:name="crg-sharing"/>
     <w:p>
       <w:pPr>
         <w:pStyle w:val="Heading3"/>
@@ -1088,8 +1175,8 @@
         <w:t xml:space="preserve">] This must remain a discovery workaround only. [Undocumented — architectural judgement] ARG must not be the immediate consistency source for destructive actions because the workbook itself includes tests to measure indexing delay relative to direct ARM reads. [Derived]</w:t>
       </w:r>
     </w:p>
-    <w:bookmarkEnd w:id="32"/>
-    <w:bookmarkStart w:id="33" w:name="Xc9093264df238be751210d24bed053aadf4f1fe"/>
+    <w:bookmarkEnd w:id="38"/>
+    <w:bookmarkStart w:id="39" w:name="Xc9093264df238be751210d24bed053aadf4f1fe"/>
     <w:p>
       <w:pPr>
         <w:pStyle w:val="Heading3"/>
@@ -1374,8 +1461,8 @@
         <w:t xml:space="preserve">This requirement applies to all shared CRG deployments. Regional (non-zonal) CRGs are not subject to logical zone remapping but are subject to other placement constraints. [Documented]</w:t>
       </w:r>
     </w:p>
-    <w:bookmarkEnd w:id="33"/>
-    <w:bookmarkStart w:id="34" w:name="quota-groups"/>
+    <w:bookmarkEnd w:id="39"/>
+    <w:bookmarkStart w:id="40" w:name="quota-groups"/>
     <w:p>
       <w:pPr>
         <w:pStyle w:val="Heading3"/>
@@ -1416,8 +1503,8 @@
         <w:t xml:space="preserve">There is no documented end-to-end propagation SLA in the supplied evidence for release of quota after CR reduction, group usage refresh, or subsequent availability to another member. [Derived] The system must measure propagation and poll authoritative state rather than invent an RTO. [Undocumented — architectural judgement]</w:t>
       </w:r>
     </w:p>
-    <w:bookmarkEnd w:id="34"/>
-    <w:bookmarkStart w:id="35" w:name="cr-quantity-update-and-zero-reduction"/>
+    <w:bookmarkEnd w:id="40"/>
+    <w:bookmarkStart w:id="41" w:name="cr-quantity-update-and-zero-reduction"/>
     <w:p>
       <w:pPr>
         <w:pStyle w:val="Heading3"/>
@@ -1498,8 +1585,8 @@
         <w:t xml:space="preserve">If a POC observes a running VM continuing after quantity reaches zero, that observation must not be generalized to every VM, VMSS mode, region, SKU, or future API version. [Undocumented — architectural judgement]</w:t>
       </w:r>
     </w:p>
-    <w:bookmarkEnd w:id="35"/>
-    <w:bookmarkStart w:id="36" w:name="regional-dr-and-availability-zones"/>
+    <w:bookmarkEnd w:id="41"/>
+    <w:bookmarkStart w:id="42" w:name="regional-dr-and-availability-zones"/>
     <w:p>
       <w:pPr>
         <w:pStyle w:val="Heading3"/>
@@ -1602,572 +1689,572 @@
       </w:pPr>
       <w:r>
         <w:t xml:space="preserve">No end-to-end DR SLA is established by the supplied evidence. [Derived] The board should approve explicit recovery objectives only after application, data, network, identity, quota, and capacity dependencies have been tested together. [Undocumented — architectural judgement]</w:t>
-      </w:r>
-    </w:p>
-    <w:bookmarkEnd w:id="36"/>
-    <w:bookmarkEnd w:id="37"/>
-    <w:bookmarkStart w:id="41" w:name="aks-vmss-and-workload-integration-review"/>
-    <w:p>
-      <w:pPr>
-        <w:pStyle w:val="Heading2"/>
-      </w:pPr>
-      <w:r>
-        <w:t xml:space="preserve">6. AKS, VMSS, and Workload Integration Review</w:t>
-      </w:r>
-    </w:p>
-    <w:bookmarkStart w:id="38" w:name="aks"/>
-    <w:p>
-      <w:pPr>
-        <w:pStyle w:val="Heading3"/>
-      </w:pPr>
-      <w:r>
-        <w:t xml:space="preserve">AKS</w:t>
-      </w:r>
-    </w:p>
-    <w:p>
-      <w:pPr>
-        <w:pStyle w:val="FirstParagraph"/>
-      </w:pPr>
-      <w:r>
-        <w:t xml:space="preserve">The original design proposes AKS for hosting ACRME, while the workload-integration mandate also requires evaluation of AKS node pools using CRGs. [Derived]</w:t>
-      </w:r>
-    </w:p>
-    <w:p>
-      <w:pPr>
-        <w:pStyle w:val="BodyText"/>
-      </w:pPr>
-      <w:r>
-        <w:t xml:space="preserve">The safe design is:</w:t>
-      </w:r>
-    </w:p>
-    <w:p>
-      <w:pPr>
-        <w:numPr>
-          <w:ilvl w:val="0"/>
-          <w:numId w:val="1008"/>
-        </w:numPr>
-        <w:pStyle w:val="Compact"/>
-      </w:pPr>
-      <w:r>
-        <w:t xml:space="preserve">Use a User Assigned Managed Identity for the deployment controller where cross-subscription CRG access is required. [Undocumented — architectural judgement]</w:t>
-      </w:r>
-    </w:p>
-    <w:p>
-      <w:pPr>
-        <w:numPr>
-          <w:ilvl w:val="0"/>
-          <w:numId w:val="1008"/>
-        </w:numPr>
-        <w:pStyle w:val="Compact"/>
-      </w:pPr>
-      <w:r>
-        <w:t xml:space="preserve">Grant only the precise read and deployment actions required at the CRG and consumer scopes. [Undocumented — architectural judgement]</w:t>
-      </w:r>
-    </w:p>
-    <w:p>
-      <w:pPr>
-        <w:numPr>
-          <w:ilvl w:val="0"/>
-          <w:numId w:val="1008"/>
-        </w:numPr>
-        <w:pStyle w:val="Compact"/>
-      </w:pPr>
-      <w:r>
-        <w:t xml:space="preserve">Validate CRG association at node-pool creation and separately validate any existing-pool update path. [Undocumented — architectural judgement]</w:t>
-      </w:r>
-    </w:p>
-    <w:p>
-      <w:pPr>
-        <w:numPr>
-          <w:ilvl w:val="0"/>
-          <w:numId w:val="1008"/>
-        </w:numPr>
-        <w:pStyle w:val="Compact"/>
-      </w:pPr>
-      <w:r>
-        <w:t xml:space="preserve">Do not assume that changing the CRG reference of an existing node pool updates existing nodes without replacement. [Documented — Microsoft Learn / AKS Node Disruption Policy: changing the CRG on an existing node pool requires node pool recreation or reimage; existing nodes are not updated in-place.]</w:t>
-      </w:r>
-    </w:p>
-    <w:p>
-      <w:pPr>
-        <w:numPr>
-          <w:ilvl w:val="0"/>
-          <w:numId w:val="1008"/>
-        </w:numPr>
-        <w:pStyle w:val="Compact"/>
-      </w:pPr>
-      <w:r>
-        <w:t xml:space="preserve">Treat cluster autoscaler scale-out as dependent on both CR capacity and consumer quota. [Derived]</w:t>
-      </w:r>
-    </w:p>
-    <w:p>
-      <w:pPr>
-        <w:numPr>
-          <w:ilvl w:val="0"/>
-          <w:numId w:val="1008"/>
-        </w:numPr>
-        <w:pStyle w:val="Compact"/>
-      </w:pPr>
-      <w:r>
-        <w:t xml:space="preserve">Add a pre-scale hook or admission check so autoscaler demand does not repeatedly submit impossible scale-out operations. [Undocumented — architectural judgement]</w:t>
-      </w:r>
-    </w:p>
-    <w:p>
-      <w:pPr>
-        <w:pStyle w:val="FirstParagraph"/>
-      </w:pPr>
-      <w:r>
-        <w:t xml:space="preserve">The supplied evidence does not establish a Microsoft propagation or autoscaler recovery SLA for these interactions. [Derived]</w:t>
-      </w:r>
-    </w:p>
-    <w:bookmarkEnd w:id="38"/>
-    <w:bookmarkStart w:id="39" w:name="vmss-uniform-and-flexible"/>
-    <w:p>
-      <w:pPr>
-        <w:pStyle w:val="Heading3"/>
-      </w:pPr>
-      <w:r>
-        <w:t xml:space="preserve">VMSS Uniform and Flexible</w:t>
-      </w:r>
-    </w:p>
-    <w:p>
-      <w:pPr>
-        <w:pStyle w:val="FirstParagraph"/>
-      </w:pPr>
-      <w:r>
-        <w:t xml:space="preserve">The workbook explicitly scopes VMSS behavior because model-level association differs from single-VM association and may require instance update, reimage, or scale operations. [Derived]</w:t>
-      </w:r>
-    </w:p>
-    <w:p>
-      <w:pPr>
-        <w:pStyle w:val="BodyText"/>
-      </w:pPr>
-      <w:r>
-        <w:t xml:space="preserve">Phase 1 must enforce:</w:t>
-      </w:r>
-    </w:p>
-    <w:p>
-      <w:pPr>
-        <w:numPr>
-          <w:ilvl w:val="0"/>
-          <w:numId w:val="1009"/>
-        </w:numPr>
-        <w:pStyle w:val="Compact"/>
-      </w:pPr>
-      <w:r>
-        <w:t xml:space="preserve">No automated Tier 3 disassociation for VMSS Uniform. [Undocumented — architectural judgement]</w:t>
-      </w:r>
-    </w:p>
-    <w:p>
-      <w:pPr>
-        <w:numPr>
-          <w:ilvl w:val="0"/>
-          <w:numId w:val="1009"/>
-        </w:numPr>
-        <w:pStyle w:val="Compact"/>
-      </w:pPr>
-      <w:r>
-        <w:t xml:space="preserve">No automated Tier 3 disassociation for VMSS Flexible until separately tested. [Undocumented — architectural judgement]</w:t>
-      </w:r>
-    </w:p>
-    <w:p>
-      <w:pPr>
-        <w:numPr>
-          <w:ilvl w:val="0"/>
-          <w:numId w:val="1009"/>
-        </w:numPr>
-        <w:pStyle w:val="Compact"/>
-      </w:pPr>
-      <w:r>
-        <w:t xml:space="preserve">VMSS resources are rejected from</w:t>
-      </w:r>
-      <w:r>
-        <w:t xml:space="preserve"> </w:t>
-      </w:r>
-      <w:r>
-        <w:rPr>
-          <w:rStyle w:val="VerbatimChar"/>
-        </w:rPr>
-        <w:t xml:space="preserve">vm_disassociation_list</w:t>
-      </w:r>
-      <w:r>
-        <w:t xml:space="preserve">. [Derived]</w:t>
-      </w:r>
-    </w:p>
-    <w:p>
-      <w:pPr>
-        <w:numPr>
-          <w:ilvl w:val="0"/>
-          <w:numId w:val="1009"/>
-        </w:numPr>
-        <w:pStyle w:val="Compact"/>
-      </w:pPr>
-      <w:r>
-        <w:t xml:space="preserve">Any manual VMSS procedure requires customer notification and an explicit blast-radius record. [Undocumented — architectural judgement]</w:t>
-      </w:r>
-    </w:p>
-    <w:p>
-      <w:pPr>
-        <w:pStyle w:val="FirstParagraph"/>
-      </w:pPr>
-      <w:r>
-        <w:t xml:space="preserve">The engine must not claim that changing the VMSS model immediately removes association from every existing instance. [Undocumented — architectural judgement] Removal behavior must be tested separately for Uniform and Flexible modes, including upgrade policy and instance repair behavior. [Undocumented — architectural judgement]</w:t>
-      </w:r>
-    </w:p>
-    <w:bookmarkEnd w:id="39"/>
-    <w:bookmarkStart w:id="40" w:name="X76d56e58f91109b809e078eef4fe44b8493fe58"/>
-    <w:p>
-      <w:pPr>
-        <w:pStyle w:val="Heading3"/>
-      </w:pPr>
-      <w:r>
-        <w:t xml:space="preserve">VMSS Reprovisioning via Shared CRG During Zone Outage — Preview Limitation (FC-08)</w:t>
-      </w:r>
-    </w:p>
-    <w:p>
-      <w:pPr>
-        <w:pStyle w:val="FirstParagraph"/>
-      </w:pPr>
-      <w:r>
-        <w:t xml:space="preserve">When a Capacity Reservation Group is shared across subscriptions, VMSS reprovisioning behaviour during an Availability Zone outage is a known Preview limitation. [Documented — Microsoft Learn / Azure Capacity Reservation known limitations: reprovisioning through a shared CRG during a zone outage is listed as a Preview limitation and has not been validated at general availability.] This limitation has direct DR implications: if a zone fails and the engine attempts to reprovision VMSS capacity using the shared CRG path, the operation may fail or produce undefined behavior under preview constraints.</w:t>
-      </w:r>
-    </w:p>
-    <w:p>
-      <w:pPr>
-        <w:pStyle w:val="BodyText"/>
-      </w:pPr>
-      <w:r>
-        <w:t xml:space="preserve">Phase 1 engineering constraints derived from this limitation:</w:t>
-      </w:r>
-    </w:p>
-    <w:p>
-      <w:pPr>
-        <w:numPr>
-          <w:ilvl w:val="0"/>
-          <w:numId w:val="1010"/>
-        </w:numPr>
-        <w:pStyle w:val="Compact"/>
-      </w:pPr>
-      <w:r>
-        <w:t xml:space="preserve">VMSS Phase 2 flows that depend on shared CRG reprovisioning during a zone failover must be explicitly blocked until Microsoft confirms GA resolution of this limitation. [Derived]</w:t>
-      </w:r>
-    </w:p>
-    <w:p>
-      <w:pPr>
-        <w:numPr>
-          <w:ilvl w:val="0"/>
-          <w:numId w:val="1010"/>
-        </w:numPr>
-        <w:pStyle w:val="Compact"/>
-      </w:pPr>
-      <w:r>
-        <w:t xml:space="preserve">If shared CRG is required for a VMSS-based DR scenario, an alternative non-shared-CRG path must be designed and documented as the fallback. [Derived]</w:t>
-      </w:r>
-    </w:p>
-    <w:p>
-      <w:pPr>
-        <w:numPr>
-          <w:ilvl w:val="0"/>
-          <w:numId w:val="1010"/>
-        </w:numPr>
-        <w:pStyle w:val="Compact"/>
-      </w:pPr>
-      <w:r>
-        <w:t xml:space="preserve">The POC test matrix (PG-08) must include a zone-outage simulation using a shared CRG and must produce a documented result before any VMSS DR flow is approved for Phase 2 planning. [Undocumented — architectural judgement]</w:t>
-      </w:r>
-    </w:p>
-    <w:p>
-      <w:pPr>
-        <w:numPr>
-          <w:ilvl w:val="0"/>
-          <w:numId w:val="1010"/>
-        </w:numPr>
-        <w:pStyle w:val="Compact"/>
-      </w:pPr>
-      <w:r>
-        <w:t xml:space="preserve">Pilot customers whose DR tier uses VMSS must be explicitly informed of this limitation and must accept it as a known risk before ACRME manages their VMSS capacity. [Undocumented — architectural judgement]</w:t>
-      </w:r>
-    </w:p>
-    <w:bookmarkEnd w:id="40"/>
-    <w:bookmarkEnd w:id="41"/>
-    <w:bookmarkStart w:id="43" w:name="api-rate-retry-and-consistency-review"/>
-    <w:p>
-      <w:pPr>
-        <w:pStyle w:val="Heading2"/>
-      </w:pPr>
-      <w:r>
-        <w:t xml:space="preserve">7. API, Rate, Retry, and Consistency Review</w:t>
-      </w:r>
-    </w:p>
-    <w:p>
-      <w:pPr>
-        <w:pStyle w:val="FirstParagraph"/>
-      </w:pPr>
-      <w:r>
-        <w:t xml:space="preserve">The engine integrates with ARM, Compute, Resource Graph, Authorization, Cost Management, and Quota APIs. [Derived]</w:t>
-      </w:r>
-    </w:p>
-    <w:p>
-      <w:pPr>
-        <w:pStyle w:val="BodyText"/>
-      </w:pPr>
-      <w:r>
-        <w:t xml:space="preserve">A fixed global retry policy is inadequate because services expose different throttling, asynchronous-operation, and consistency behavior. [Undocumented — architectural judgement]</w:t>
-      </w:r>
-    </w:p>
-    <w:p>
-      <w:pPr>
-        <w:pStyle w:val="BodyText"/>
-      </w:pPr>
-      <w:r>
-        <w:t xml:space="preserve">The production client library must implement:</w:t>
-      </w:r>
-    </w:p>
-    <w:p>
-      <w:pPr>
-        <w:numPr>
-          <w:ilvl w:val="0"/>
-          <w:numId w:val="1011"/>
-        </w:numPr>
-        <w:pStyle w:val="Compact"/>
-      </w:pPr>
-      <w:r>
-        <w:t xml:space="preserve">Per-service and per-subscription concurrency budgets. [Undocumented — architectural judgement]</w:t>
-      </w:r>
-    </w:p>
-    <w:p>
-      <w:pPr>
-        <w:numPr>
-          <w:ilvl w:val="0"/>
-          <w:numId w:val="1011"/>
-        </w:numPr>
-        <w:pStyle w:val="Compact"/>
-      </w:pPr>
-      <w:r>
-        <w:t xml:space="preserve">Respect for server-provided retry guidance when present. [Undocumented — architectural judgement]</w:t>
-      </w:r>
-    </w:p>
-    <w:p>
-      <w:pPr>
-        <w:numPr>
-          <w:ilvl w:val="0"/>
-          <w:numId w:val="1011"/>
-        </w:numPr>
-        <w:pStyle w:val="Compact"/>
-      </w:pPr>
-      <w:r>
-        <w:t xml:space="preserve">Exponential backoff with jitter for transient responses. [Derived]</w:t>
-      </w:r>
-    </w:p>
-    <w:p>
-      <w:pPr>
-        <w:numPr>
-          <w:ilvl w:val="0"/>
-          <w:numId w:val="1011"/>
-        </w:numPr>
-        <w:pStyle w:val="Compact"/>
-      </w:pPr>
-      <w:r>
-        <w:t xml:space="preserve">No automatic retry for authorization failures or deterministic validation errors. [Undocumented — architectural judgement]</w:t>
-      </w:r>
-    </w:p>
-    <w:p>
-      <w:pPr>
-        <w:numPr>
-          <w:ilvl w:val="0"/>
-          <w:numId w:val="1011"/>
-        </w:numPr>
-        <w:pStyle w:val="Compact"/>
-      </w:pPr>
-      <w:r>
-        <w:t xml:space="preserve">Idempotency keys for engine commands and conditional writes for engine state. [Derived]</w:t>
-      </w:r>
-    </w:p>
-    <w:p>
-      <w:pPr>
-        <w:numPr>
-          <w:ilvl w:val="0"/>
-          <w:numId w:val="1011"/>
-        </w:numPr>
-        <w:pStyle w:val="Compact"/>
-      </w:pPr>
-      <w:r>
-        <w:t xml:space="preserve">Polling of asynchronous operations using returned operation references. [Undocumented — architectural judgement]</w:t>
-      </w:r>
-    </w:p>
-    <w:p>
-      <w:pPr>
-        <w:numPr>
-          <w:ilvl w:val="0"/>
-          <w:numId w:val="1011"/>
-        </w:numPr>
-        <w:pStyle w:val="Compact"/>
-      </w:pPr>
-      <w:r>
-        <w:t xml:space="preserve">A bounded retry budget rather than a universal promise of five attempts. [Undocumented — architectural judgement]</w:t>
-      </w:r>
-    </w:p>
-    <w:p>
-      <w:pPr>
-        <w:numPr>
-          <w:ilvl w:val="0"/>
-          <w:numId w:val="1011"/>
-        </w:numPr>
-        <w:pStyle w:val="Compact"/>
-      </w:pPr>
-      <w:r>
-        <w:t xml:space="preserve">Resource Graph only for inventory and diagnostics, not immediate mutation confirmation. [Undocumented — architectural judgement]</w:t>
-      </w:r>
-    </w:p>
-    <w:p>
-      <w:pPr>
-        <w:numPr>
-          <w:ilvl w:val="0"/>
-          <w:numId w:val="1011"/>
-        </w:numPr>
-        <w:pStyle w:val="Compact"/>
-      </w:pPr>
-      <w:r>
-        <w:t xml:space="preserve">Direct resource-provider GET confirmation before destructive or DR-critical transitions. [Undocumented — architectural judgement]</w:t>
-      </w:r>
-    </w:p>
-    <w:p>
-      <w:pPr>
-        <w:pStyle w:val="FirstParagraph"/>
-      </w:pPr>
-      <w:r>
-        <w:t xml:space="preserve">No fixed ARM read or write limit should be embedded as a universal platform fact without current claim-level documentation. [Undocumented — architectural judgement] Rate controls must be configurable and adjusted from observed throttling telemetry. [Undocumented — architectural judgement]</w:t>
-      </w:r>
-    </w:p>
-    <w:bookmarkStart w:id="42" w:name="X9d9c345f0c8cfda0d9dd5351eec18f2eba2fa0a"/>
-    <w:p>
-      <w:pPr>
-        <w:pStyle w:val="Heading3"/>
-      </w:pPr>
-      <w:r>
-        <w:t xml:space="preserve">Documented Compute Throttle Baselines — Engineering Starting Configuration (FC-16)</w:t>
-      </w:r>
-    </w:p>
-    <w:p>
-      <w:pPr>
-        <w:pStyle w:val="FirstParagraph"/>
-      </w:pPr>
-      <w:r>
-        <w:t xml:space="preserve">Microsoft publishes documented throttle limits for the Azure Compute resource provider that serve as the engineering starting configuration for the adaptive throttle manager. [Documented — Microsoft Learn / Azure Resource Manager throttling: Compute resource provider read limit is 250 requests per 5 minutes per subscription; write limit is 1,200 requests per hour per subscription. These values are documented baselines, not negotiated guarantees, and may be reduced under sustained contention.] Additional claim-level limits apply for specific Compute operations such as Capacity Reservation create/update, which may carry lower per-operation budgets.</w:t>
-      </w:r>
-    </w:p>
-    <w:p>
-      <w:pPr>
-        <w:pStyle w:val="BodyText"/>
-      </w:pPr>
-      <w:r>
-        <w:t xml:space="preserve">The adaptive throttle manager must be initialised with these documented Compute baselines as its default starting configuration, not with hardcoded universal constants. [Derived] The manager must then:</w:t>
-      </w:r>
-    </w:p>
-    <w:p>
-      <w:pPr>
-        <w:numPr>
-          <w:ilvl w:val="0"/>
-          <w:numId w:val="1012"/>
-        </w:numPr>
-        <w:pStyle w:val="Compact"/>
-      </w:pPr>
-      <w:r>
-        <w:t xml:space="preserve">Detect</w:t>
-      </w:r>
-      <w:r>
-        <w:t xml:space="preserve"> </w:t>
-      </w:r>
-      <w:r>
-        <w:rPr>
-          <w:rStyle w:val="VerbatimChar"/>
-        </w:rPr>
-        <w:t xml:space="preserve">429 TooManyRequests</w:t>
-      </w:r>
-      <w:r>
-        <w:t xml:space="preserve"> </w:t>
-      </w:r>
-      <w:r>
-        <w:t xml:space="preserve">responses and their</w:t>
-      </w:r>
-      <w:r>
-        <w:t xml:space="preserve"> </w:t>
-      </w:r>
-      <w:r>
-        <w:rPr>
-          <w:rStyle w:val="VerbatimChar"/>
-        </w:rPr>
-        <w:t xml:space="preserve">Retry-After</w:t>
-      </w:r>
-      <w:r>
-        <w:t xml:space="preserve"> </w:t>
-      </w:r>
-      <w:r>
-        <w:t xml:space="preserve">headers at the per-subscription, per-resource-provider level. [Documented — Microsoft Learn / ARM throttling:</w:t>
-      </w:r>
-      <w:r>
-        <w:t xml:space="preserve"> </w:t>
-      </w:r>
-      <w:r>
-        <w:rPr>
-          <w:rStyle w:val="VerbatimChar"/>
-        </w:rPr>
-        <w:t xml:space="preserve">x-ms-ratelimit-remaining-*</w:t>
-      </w:r>
-      <w:r>
-        <w:t xml:space="preserve"> </w:t>
-      </w:r>
-      <w:r>
-        <w:t xml:space="preserve">response headers indicate remaining budget per subscription.]</w:t>
-      </w:r>
-    </w:p>
-    <w:p>
-      <w:pPr>
-        <w:numPr>
-          <w:ilvl w:val="0"/>
-          <w:numId w:val="1012"/>
-        </w:numPr>
-        <w:pStyle w:val="Compact"/>
-      </w:pPr>
-      <w:r>
-        <w:t xml:space="preserve">Reduce the active concurrency budget dynamically when throttle signals are received. [Undocumented — architectural judgement]</w:t>
-      </w:r>
-    </w:p>
-    <w:p>
-      <w:pPr>
-        <w:numPr>
-          <w:ilvl w:val="0"/>
-          <w:numId w:val="1012"/>
-        </w:numPr>
-        <w:pStyle w:val="Compact"/>
-      </w:pPr>
-      <w:r>
-        <w:t xml:space="preserve">Recover the budget incrementally after a cooldown period, using observed success rates rather than a fixed timer. [Undocumented — architectural judgement]</w:t>
-      </w:r>
-    </w:p>
-    <w:p>
-      <w:pPr>
-        <w:numPr>
-          <w:ilvl w:val="0"/>
-          <w:numId w:val="1012"/>
-        </w:numPr>
-        <w:pStyle w:val="Compact"/>
-      </w:pPr>
-      <w:r>
-        <w:t xml:space="preserve">Log every throttle event and the resulting budget adjustment to the platform telemetry pipeline for capacity-planning feedback. [Undocumented — architectural judgement]</w:t>
-      </w:r>
-    </w:p>
-    <w:p>
-      <w:pPr>
-        <w:pStyle w:val="FirstParagraph"/>
-      </w:pPr>
-      <w:r>
-        <w:t xml:space="preserve">Engineering teams must treat the documented baselines as the upper bound for new environments and must not assume that the full documented limit is always available in regions under high demand. [Derived] The POC telemetry phase must record observed throttle rates in all target regions before Phase 2 concurrency parameters are set. [Undocumented — architectural judgement]</w:t>
       </w:r>
     </w:p>
     <w:bookmarkEnd w:id="42"/>
     <w:bookmarkEnd w:id="43"/>
-    <w:bookmarkStart w:id="44" w:name="assumption-validation-matrix"/>
+    <w:bookmarkStart w:id="47" w:name="aks-vmss-and-workload-integration-review"/>
+    <w:p>
+      <w:pPr>
+        <w:pStyle w:val="Heading2"/>
+      </w:pPr>
+      <w:r>
+        <w:t xml:space="preserve">6. AKS, VMSS, and Workload Integration Review</w:t>
+      </w:r>
+    </w:p>
+    <w:bookmarkStart w:id="44" w:name="aks"/>
+    <w:p>
+      <w:pPr>
+        <w:pStyle w:val="Heading3"/>
+      </w:pPr>
+      <w:r>
+        <w:t xml:space="preserve">AKS</w:t>
+      </w:r>
+    </w:p>
+    <w:p>
+      <w:pPr>
+        <w:pStyle w:val="FirstParagraph"/>
+      </w:pPr>
+      <w:r>
+        <w:t xml:space="preserve">The original design proposes AKS for hosting ACRME, while the workload-integration mandate also requires evaluation of AKS node pools using CRGs. [Derived]</w:t>
+      </w:r>
+    </w:p>
+    <w:p>
+      <w:pPr>
+        <w:pStyle w:val="BodyText"/>
+      </w:pPr>
+      <w:r>
+        <w:t xml:space="preserve">The safe design is:</w:t>
+      </w:r>
+    </w:p>
+    <w:p>
+      <w:pPr>
+        <w:numPr>
+          <w:ilvl w:val="0"/>
+          <w:numId w:val="1008"/>
+        </w:numPr>
+        <w:pStyle w:val="Compact"/>
+      </w:pPr>
+      <w:r>
+        <w:t xml:space="preserve">Use a User Assigned Managed Identity for the deployment controller where cross-subscription CRG access is required. [Undocumented — architectural judgement]</w:t>
+      </w:r>
+    </w:p>
+    <w:p>
+      <w:pPr>
+        <w:numPr>
+          <w:ilvl w:val="0"/>
+          <w:numId w:val="1008"/>
+        </w:numPr>
+        <w:pStyle w:val="Compact"/>
+      </w:pPr>
+      <w:r>
+        <w:t xml:space="preserve">Grant only the precise read and deployment actions required at the CRG and consumer scopes. [Undocumented — architectural judgement]</w:t>
+      </w:r>
+    </w:p>
+    <w:p>
+      <w:pPr>
+        <w:numPr>
+          <w:ilvl w:val="0"/>
+          <w:numId w:val="1008"/>
+        </w:numPr>
+        <w:pStyle w:val="Compact"/>
+      </w:pPr>
+      <w:r>
+        <w:t xml:space="preserve">Validate CRG association at node-pool creation and separately validate any existing-pool update path. [Undocumented — architectural judgement]</w:t>
+      </w:r>
+    </w:p>
+    <w:p>
+      <w:pPr>
+        <w:numPr>
+          <w:ilvl w:val="0"/>
+          <w:numId w:val="1008"/>
+        </w:numPr>
+        <w:pStyle w:val="Compact"/>
+      </w:pPr>
+      <w:r>
+        <w:t xml:space="preserve">Do not assume that changing the CRG reference of an existing node pool updates existing nodes without replacement. [Documented — Microsoft Learn / AKS Node Disruption Policy: changing the CRG on an existing node pool requires node pool recreation or reimage; existing nodes are not updated in-place.]</w:t>
+      </w:r>
+    </w:p>
+    <w:p>
+      <w:pPr>
+        <w:numPr>
+          <w:ilvl w:val="0"/>
+          <w:numId w:val="1008"/>
+        </w:numPr>
+        <w:pStyle w:val="Compact"/>
+      </w:pPr>
+      <w:r>
+        <w:t xml:space="preserve">Treat cluster autoscaler scale-out as dependent on both CR capacity and consumer quota. [Derived]</w:t>
+      </w:r>
+    </w:p>
+    <w:p>
+      <w:pPr>
+        <w:numPr>
+          <w:ilvl w:val="0"/>
+          <w:numId w:val="1008"/>
+        </w:numPr>
+        <w:pStyle w:val="Compact"/>
+      </w:pPr>
+      <w:r>
+        <w:t xml:space="preserve">Add a pre-scale hook or admission check so autoscaler demand does not repeatedly submit impossible scale-out operations. [Undocumented — architectural judgement]</w:t>
+      </w:r>
+    </w:p>
+    <w:p>
+      <w:pPr>
+        <w:pStyle w:val="FirstParagraph"/>
+      </w:pPr>
+      <w:r>
+        <w:t xml:space="preserve">The supplied evidence does not establish a Microsoft propagation or autoscaler recovery SLA for these interactions. [Derived]</w:t>
+      </w:r>
+    </w:p>
+    <w:bookmarkEnd w:id="44"/>
+    <w:bookmarkStart w:id="45" w:name="vmss-uniform-and-flexible"/>
+    <w:p>
+      <w:pPr>
+        <w:pStyle w:val="Heading3"/>
+      </w:pPr>
+      <w:r>
+        <w:t xml:space="preserve">VMSS Uniform and Flexible</w:t>
+      </w:r>
+    </w:p>
+    <w:p>
+      <w:pPr>
+        <w:pStyle w:val="FirstParagraph"/>
+      </w:pPr>
+      <w:r>
+        <w:t xml:space="preserve">The workbook explicitly scopes VMSS behavior because model-level association differs from single-VM association and may require instance update, reimage, or scale operations. [Derived]</w:t>
+      </w:r>
+    </w:p>
+    <w:p>
+      <w:pPr>
+        <w:pStyle w:val="BodyText"/>
+      </w:pPr>
+      <w:r>
+        <w:t xml:space="preserve">Phase 1 must enforce:</w:t>
+      </w:r>
+    </w:p>
+    <w:p>
+      <w:pPr>
+        <w:numPr>
+          <w:ilvl w:val="0"/>
+          <w:numId w:val="1009"/>
+        </w:numPr>
+        <w:pStyle w:val="Compact"/>
+      </w:pPr>
+      <w:r>
+        <w:t xml:space="preserve">No automated Tier 3 disassociation for VMSS Uniform. [Undocumented — architectural judgement]</w:t>
+      </w:r>
+    </w:p>
+    <w:p>
+      <w:pPr>
+        <w:numPr>
+          <w:ilvl w:val="0"/>
+          <w:numId w:val="1009"/>
+        </w:numPr>
+        <w:pStyle w:val="Compact"/>
+      </w:pPr>
+      <w:r>
+        <w:t xml:space="preserve">No automated Tier 3 disassociation for VMSS Flexible until separately tested. [Undocumented — architectural judgement]</w:t>
+      </w:r>
+    </w:p>
+    <w:p>
+      <w:pPr>
+        <w:numPr>
+          <w:ilvl w:val="0"/>
+          <w:numId w:val="1009"/>
+        </w:numPr>
+        <w:pStyle w:val="Compact"/>
+      </w:pPr>
+      <w:r>
+        <w:t xml:space="preserve">VMSS resources are rejected from</w:t>
+      </w:r>
+      <w:r>
+        <w:t xml:space="preserve"> </w:t>
+      </w:r>
+      <w:r>
+        <w:rPr>
+          <w:rStyle w:val="VerbatimChar"/>
+        </w:rPr>
+        <w:t xml:space="preserve">vm_disassociation_list</w:t>
+      </w:r>
+      <w:r>
+        <w:t xml:space="preserve">. [Derived]</w:t>
+      </w:r>
+    </w:p>
+    <w:p>
+      <w:pPr>
+        <w:numPr>
+          <w:ilvl w:val="0"/>
+          <w:numId w:val="1009"/>
+        </w:numPr>
+        <w:pStyle w:val="Compact"/>
+      </w:pPr>
+      <w:r>
+        <w:t xml:space="preserve">Any manual VMSS procedure requires customer notification and an explicit blast-radius record. [Undocumented — architectural judgement]</w:t>
+      </w:r>
+    </w:p>
+    <w:p>
+      <w:pPr>
+        <w:pStyle w:val="FirstParagraph"/>
+      </w:pPr>
+      <w:r>
+        <w:t xml:space="preserve">The engine must not claim that changing the VMSS model immediately removes association from every existing instance. [Undocumented — architectural judgement] Removal behavior must be tested separately for Uniform and Flexible modes, including upgrade policy and instance repair behavior. [Undocumented — architectural judgement]</w:t>
+      </w:r>
+    </w:p>
+    <w:bookmarkEnd w:id="45"/>
+    <w:bookmarkStart w:id="46" w:name="X76d56e58f91109b809e078eef4fe44b8493fe58"/>
+    <w:p>
+      <w:pPr>
+        <w:pStyle w:val="Heading3"/>
+      </w:pPr>
+      <w:r>
+        <w:t xml:space="preserve">VMSS Reprovisioning via Shared CRG During Zone Outage — Preview Limitation (FC-08)</w:t>
+      </w:r>
+    </w:p>
+    <w:p>
+      <w:pPr>
+        <w:pStyle w:val="FirstParagraph"/>
+      </w:pPr>
+      <w:r>
+        <w:t xml:space="preserve">When a Capacity Reservation Group is shared across subscriptions, VMSS reprovisioning behaviour during an Availability Zone outage is a known Preview limitation. [Documented — Microsoft Learn / Azure Capacity Reservation known limitations: reprovisioning through a shared CRG during a zone outage is listed as a Preview limitation and has not been validated at general availability.] This limitation has direct DR implications: if a zone fails and the engine attempts to reprovision VMSS capacity using the shared CRG path, the operation may fail or produce undefined behavior under preview constraints.</w:t>
+      </w:r>
+    </w:p>
+    <w:p>
+      <w:pPr>
+        <w:pStyle w:val="BodyText"/>
+      </w:pPr>
+      <w:r>
+        <w:t xml:space="preserve">Phase 1 engineering constraints derived from this limitation:</w:t>
+      </w:r>
+    </w:p>
+    <w:p>
+      <w:pPr>
+        <w:numPr>
+          <w:ilvl w:val="0"/>
+          <w:numId w:val="1010"/>
+        </w:numPr>
+        <w:pStyle w:val="Compact"/>
+      </w:pPr>
+      <w:r>
+        <w:t xml:space="preserve">VMSS Phase 2 flows that depend on shared CRG reprovisioning during a zone failover must be explicitly blocked until Microsoft confirms GA resolution of this limitation. [Derived]</w:t>
+      </w:r>
+    </w:p>
+    <w:p>
+      <w:pPr>
+        <w:numPr>
+          <w:ilvl w:val="0"/>
+          <w:numId w:val="1010"/>
+        </w:numPr>
+        <w:pStyle w:val="Compact"/>
+      </w:pPr>
+      <w:r>
+        <w:t xml:space="preserve">If shared CRG is required for a VMSS-based DR scenario, an alternative non-shared-CRG path must be designed and documented as the fallback. [Derived]</w:t>
+      </w:r>
+    </w:p>
+    <w:p>
+      <w:pPr>
+        <w:numPr>
+          <w:ilvl w:val="0"/>
+          <w:numId w:val="1010"/>
+        </w:numPr>
+        <w:pStyle w:val="Compact"/>
+      </w:pPr>
+      <w:r>
+        <w:t xml:space="preserve">The POC test matrix (PG-08) must include a zone-outage simulation using a shared CRG and must produce a documented result before any VMSS DR flow is approved for Phase 2 planning. [Undocumented — architectural judgement]</w:t>
+      </w:r>
+    </w:p>
+    <w:p>
+      <w:pPr>
+        <w:numPr>
+          <w:ilvl w:val="0"/>
+          <w:numId w:val="1010"/>
+        </w:numPr>
+        <w:pStyle w:val="Compact"/>
+      </w:pPr>
+      <w:r>
+        <w:t xml:space="preserve">Pilot customers whose DR tier uses VMSS must be explicitly informed of this limitation and must accept it as a known risk before ACRME manages their VMSS capacity. [Undocumented — architectural judgement]</w:t>
+      </w:r>
+    </w:p>
+    <w:bookmarkEnd w:id="46"/>
+    <w:bookmarkEnd w:id="47"/>
+    <w:bookmarkStart w:id="49" w:name="api-rate-retry-and-consistency-review"/>
+    <w:p>
+      <w:pPr>
+        <w:pStyle w:val="Heading2"/>
+      </w:pPr>
+      <w:r>
+        <w:t xml:space="preserve">7. API, Rate, Retry, and Consistency Review</w:t>
+      </w:r>
+    </w:p>
+    <w:p>
+      <w:pPr>
+        <w:pStyle w:val="FirstParagraph"/>
+      </w:pPr>
+      <w:r>
+        <w:t xml:space="preserve">The engine integrates with ARM, Compute, Resource Graph, Authorization, Cost Management, and Quota APIs. [Derived]</w:t>
+      </w:r>
+    </w:p>
+    <w:p>
+      <w:pPr>
+        <w:pStyle w:val="BodyText"/>
+      </w:pPr>
+      <w:r>
+        <w:t xml:space="preserve">A fixed global retry policy is inadequate because services expose different throttling, asynchronous-operation, and consistency behavior. [Undocumented — architectural judgement]</w:t>
+      </w:r>
+    </w:p>
+    <w:p>
+      <w:pPr>
+        <w:pStyle w:val="BodyText"/>
+      </w:pPr>
+      <w:r>
+        <w:t xml:space="preserve">The production client library must implement:</w:t>
+      </w:r>
+    </w:p>
+    <w:p>
+      <w:pPr>
+        <w:numPr>
+          <w:ilvl w:val="0"/>
+          <w:numId w:val="1011"/>
+        </w:numPr>
+        <w:pStyle w:val="Compact"/>
+      </w:pPr>
+      <w:r>
+        <w:t xml:space="preserve">Per-service and per-subscription concurrency budgets. [Undocumented — architectural judgement]</w:t>
+      </w:r>
+    </w:p>
+    <w:p>
+      <w:pPr>
+        <w:numPr>
+          <w:ilvl w:val="0"/>
+          <w:numId w:val="1011"/>
+        </w:numPr>
+        <w:pStyle w:val="Compact"/>
+      </w:pPr>
+      <w:r>
+        <w:t xml:space="preserve">Respect for server-provided retry guidance when present. [Undocumented — architectural judgement]</w:t>
+      </w:r>
+    </w:p>
+    <w:p>
+      <w:pPr>
+        <w:numPr>
+          <w:ilvl w:val="0"/>
+          <w:numId w:val="1011"/>
+        </w:numPr>
+        <w:pStyle w:val="Compact"/>
+      </w:pPr>
+      <w:r>
+        <w:t xml:space="preserve">Exponential backoff with jitter for transient responses. [Derived]</w:t>
+      </w:r>
+    </w:p>
+    <w:p>
+      <w:pPr>
+        <w:numPr>
+          <w:ilvl w:val="0"/>
+          <w:numId w:val="1011"/>
+        </w:numPr>
+        <w:pStyle w:val="Compact"/>
+      </w:pPr>
+      <w:r>
+        <w:t xml:space="preserve">No automatic retry for authorization failures or deterministic validation errors. [Undocumented — architectural judgement]</w:t>
+      </w:r>
+    </w:p>
+    <w:p>
+      <w:pPr>
+        <w:numPr>
+          <w:ilvl w:val="0"/>
+          <w:numId w:val="1011"/>
+        </w:numPr>
+        <w:pStyle w:val="Compact"/>
+      </w:pPr>
+      <w:r>
+        <w:t xml:space="preserve">Idempotency keys for engine commands and conditional writes for engine state. [Derived]</w:t>
+      </w:r>
+    </w:p>
+    <w:p>
+      <w:pPr>
+        <w:numPr>
+          <w:ilvl w:val="0"/>
+          <w:numId w:val="1011"/>
+        </w:numPr>
+        <w:pStyle w:val="Compact"/>
+      </w:pPr>
+      <w:r>
+        <w:t xml:space="preserve">Polling of asynchronous operations using returned operation references. [Undocumented — architectural judgement]</w:t>
+      </w:r>
+    </w:p>
+    <w:p>
+      <w:pPr>
+        <w:numPr>
+          <w:ilvl w:val="0"/>
+          <w:numId w:val="1011"/>
+        </w:numPr>
+        <w:pStyle w:val="Compact"/>
+      </w:pPr>
+      <w:r>
+        <w:t xml:space="preserve">A bounded retry budget rather than a universal promise of five attempts. [Undocumented — architectural judgement]</w:t>
+      </w:r>
+    </w:p>
+    <w:p>
+      <w:pPr>
+        <w:numPr>
+          <w:ilvl w:val="0"/>
+          <w:numId w:val="1011"/>
+        </w:numPr>
+        <w:pStyle w:val="Compact"/>
+      </w:pPr>
+      <w:r>
+        <w:t xml:space="preserve">Resource Graph only for inventory and diagnostics, not immediate mutation confirmation. [Undocumented — architectural judgement]</w:t>
+      </w:r>
+    </w:p>
+    <w:p>
+      <w:pPr>
+        <w:numPr>
+          <w:ilvl w:val="0"/>
+          <w:numId w:val="1011"/>
+        </w:numPr>
+        <w:pStyle w:val="Compact"/>
+      </w:pPr>
+      <w:r>
+        <w:t xml:space="preserve">Direct resource-provider GET confirmation before destructive or DR-critical transitions. [Undocumented — architectural judgement]</w:t>
+      </w:r>
+    </w:p>
+    <w:p>
+      <w:pPr>
+        <w:pStyle w:val="FirstParagraph"/>
+      </w:pPr>
+      <w:r>
+        <w:t xml:space="preserve">No fixed ARM read or write limit should be embedded as a universal platform fact without current claim-level documentation. [Undocumented — architectural judgement] Rate controls must be configurable and adjusted from observed throttling telemetry. [Undocumented — architectural judgement]</w:t>
+      </w:r>
+    </w:p>
+    <w:bookmarkStart w:id="48" w:name="X9d9c345f0c8cfda0d9dd5351eec18f2eba2fa0a"/>
+    <w:p>
+      <w:pPr>
+        <w:pStyle w:val="Heading3"/>
+      </w:pPr>
+      <w:r>
+        <w:t xml:space="preserve">Documented Compute Throttle Baselines — Engineering Starting Configuration (FC-16)</w:t>
+      </w:r>
+    </w:p>
+    <w:p>
+      <w:pPr>
+        <w:pStyle w:val="FirstParagraph"/>
+      </w:pPr>
+      <w:r>
+        <w:t xml:space="preserve">Microsoft publishes documented throttle limits for the Azure Compute resource provider that serve as the engineering starting configuration for the adaptive throttle manager. [Documented — Microsoft Learn / Azure Resource Manager throttling: Compute resource provider read limit is 250 requests per 5 minutes per subscription; write limit is 1,200 requests per hour per subscription. These values are documented baselines, not negotiated guarantees, and may be reduced under sustained contention.] Additional claim-level limits apply for specific Compute operations such as Capacity Reservation create/update, which may carry lower per-operation budgets.</w:t>
+      </w:r>
+    </w:p>
+    <w:p>
+      <w:pPr>
+        <w:pStyle w:val="BodyText"/>
+      </w:pPr>
+      <w:r>
+        <w:t xml:space="preserve">The adaptive throttle manager must be initialised with these documented Compute baselines as its default starting configuration, not with hardcoded universal constants. [Derived] The manager must then:</w:t>
+      </w:r>
+    </w:p>
+    <w:p>
+      <w:pPr>
+        <w:numPr>
+          <w:ilvl w:val="0"/>
+          <w:numId w:val="1012"/>
+        </w:numPr>
+        <w:pStyle w:val="Compact"/>
+      </w:pPr>
+      <w:r>
+        <w:t xml:space="preserve">Detect</w:t>
+      </w:r>
+      <w:r>
+        <w:t xml:space="preserve"> </w:t>
+      </w:r>
+      <w:r>
+        <w:rPr>
+          <w:rStyle w:val="VerbatimChar"/>
+        </w:rPr>
+        <w:t xml:space="preserve">429 TooManyRequests</w:t>
+      </w:r>
+      <w:r>
+        <w:t xml:space="preserve"> </w:t>
+      </w:r>
+      <w:r>
+        <w:t xml:space="preserve">responses and their</w:t>
+      </w:r>
+      <w:r>
+        <w:t xml:space="preserve"> </w:t>
+      </w:r>
+      <w:r>
+        <w:rPr>
+          <w:rStyle w:val="VerbatimChar"/>
+        </w:rPr>
+        <w:t xml:space="preserve">Retry-After</w:t>
+      </w:r>
+      <w:r>
+        <w:t xml:space="preserve"> </w:t>
+      </w:r>
+      <w:r>
+        <w:t xml:space="preserve">headers at the per-subscription, per-resource-provider level. [Documented — Microsoft Learn / ARM throttling:</w:t>
+      </w:r>
+      <w:r>
+        <w:t xml:space="preserve"> </w:t>
+      </w:r>
+      <w:r>
+        <w:rPr>
+          <w:rStyle w:val="VerbatimChar"/>
+        </w:rPr>
+        <w:t xml:space="preserve">x-ms-ratelimit-remaining-*</w:t>
+      </w:r>
+      <w:r>
+        <w:t xml:space="preserve"> </w:t>
+      </w:r>
+      <w:r>
+        <w:t xml:space="preserve">response headers indicate remaining budget per subscription.]</w:t>
+      </w:r>
+    </w:p>
+    <w:p>
+      <w:pPr>
+        <w:numPr>
+          <w:ilvl w:val="0"/>
+          <w:numId w:val="1012"/>
+        </w:numPr>
+        <w:pStyle w:val="Compact"/>
+      </w:pPr>
+      <w:r>
+        <w:t xml:space="preserve">Reduce the active concurrency budget dynamically when throttle signals are received. [Undocumented — architectural judgement]</w:t>
+      </w:r>
+    </w:p>
+    <w:p>
+      <w:pPr>
+        <w:numPr>
+          <w:ilvl w:val="0"/>
+          <w:numId w:val="1012"/>
+        </w:numPr>
+        <w:pStyle w:val="Compact"/>
+      </w:pPr>
+      <w:r>
+        <w:t xml:space="preserve">Recover the budget incrementally after a cooldown period, using observed success rates rather than a fixed timer. [Undocumented — architectural judgement]</w:t>
+      </w:r>
+    </w:p>
+    <w:p>
+      <w:pPr>
+        <w:numPr>
+          <w:ilvl w:val="0"/>
+          <w:numId w:val="1012"/>
+        </w:numPr>
+        <w:pStyle w:val="Compact"/>
+      </w:pPr>
+      <w:r>
+        <w:t xml:space="preserve">Log every throttle event and the resulting budget adjustment to the platform telemetry pipeline for capacity-planning feedback. [Undocumented — architectural judgement]</w:t>
+      </w:r>
+    </w:p>
+    <w:p>
+      <w:pPr>
+        <w:pStyle w:val="FirstParagraph"/>
+      </w:pPr>
+      <w:r>
+        <w:t xml:space="preserve">Engineering teams must treat the documented baselines as the upper bound for new environments and must not assume that the full documented limit is always available in regions under high demand. [Derived] The POC telemetry phase must record observed throttle rates in all target regions before Phase 2 concurrency parameters are set. [Undocumented — architectural judgement]</w:t>
+      </w:r>
+    </w:p>
+    <w:bookmarkEnd w:id="48"/>
+    <w:bookmarkEnd w:id="49"/>
+    <w:bookmarkStart w:id="50" w:name="assumption-validation-matrix"/>
     <w:p>
       <w:pPr>
         <w:pStyle w:val="Heading2"/>
@@ -3495,8 +3582,8 @@
         </w:tc>
       </w:tr>
     </w:tbl>
-    <w:bookmarkEnd w:id="44"/>
-    <w:bookmarkStart w:id="51" w:name="hidden-risks-and-corner-cases"/>
+    <w:bookmarkEnd w:id="50"/>
+    <w:bookmarkStart w:id="57" w:name="hidden-risks-and-corner-cases"/>
     <w:p>
       <w:pPr>
         <w:pStyle w:val="Heading2"/>
@@ -3505,7 +3592,7 @@
         <w:t xml:space="preserve">9. Hidden Risks and Corner Cases</w:t>
       </w:r>
     </w:p>
-    <w:bookmarkStart w:id="45" w:name="platform"/>
+    <w:bookmarkStart w:id="51" w:name="platform"/>
     <w:p>
       <w:pPr>
         <w:pStyle w:val="Heading3"/>
@@ -3586,8 +3673,8 @@
         <w:t xml:space="preserve">A zero-denominator scoring guard can convert an unknown state into a misleading zero or one. [Derived]</w:t>
       </w:r>
     </w:p>
-    <w:bookmarkEnd w:id="45"/>
-    <w:bookmarkStart w:id="46" w:name="operating-model"/>
+    <w:bookmarkEnd w:id="51"/>
+    <w:bookmarkStart w:id="52" w:name="operating-model"/>
     <w:p>
       <w:pPr>
         <w:pStyle w:val="Heading3"/>
@@ -3656,8 +3743,8 @@
         <w:t xml:space="preserve">Customer owners may revoke delegated RBAC during an incident. [Derived]</w:t>
       </w:r>
     </w:p>
-    <w:bookmarkEnd w:id="46"/>
-    <w:bookmarkStart w:id="47" w:name="capacity-and-quota"/>
+    <w:bookmarkEnd w:id="52"/>
+    <w:bookmarkStart w:id="53" w:name="capacity-and-quota"/>
     <w:p>
       <w:pPr>
         <w:pStyle w:val="Heading3"/>
@@ -3756,8 +3843,8 @@
         <w:t xml:space="preserve">A shared NonProd plus DR group can suffer internal starvation even when group headroom appears healthy. [Derived]</w:t>
       </w:r>
     </w:p>
-    <w:bookmarkEnd w:id="47"/>
-    <w:bookmarkStart w:id="48" w:name="dr"/>
+    <w:bookmarkEnd w:id="53"/>
+    <w:bookmarkStart w:id="54" w:name="dr"/>
     <w:p>
       <w:pPr>
         <w:pStyle w:val="Heading3"/>
@@ -3814,8 +3901,8 @@
         <w:t xml:space="preserve">Failback may destroy the only healthy application instance if primary validation is incomplete. [Derived]</w:t>
       </w:r>
     </w:p>
-    <w:bookmarkEnd w:id="48"/>
-    <w:bookmarkStart w:id="49" w:name="placement"/>
+    <w:bookmarkEnd w:id="54"/>
+    <w:bookmarkStart w:id="55" w:name="placement"/>
     <w:p>
       <w:pPr>
         <w:pStyle w:val="Heading3"/>
@@ -3872,8 +3959,8 @@
         <w:t xml:space="preserve">A cached snapshot can be internally inconsistent if CR, quota, and sharing fields have different observation times. [Derived]</w:t>
       </w:r>
     </w:p>
-    <w:bookmarkEnd w:id="49"/>
-    <w:bookmarkStart w:id="50" w:name="onboarding-and-subscription-lifecycle"/>
+    <w:bookmarkEnd w:id="55"/>
+    <w:bookmarkStart w:id="56" w:name="onboarding-and-subscription-lifecycle"/>
     <w:p>
       <w:pPr>
         <w:pStyle w:val="Heading3"/>
@@ -3942,9 +4029,9 @@
         <w:t xml:space="preserve">A customer can exceed the 100-consumer CRG limit through lifecycle drift if the engine only checks on create. [Derived]</w:t>
       </w:r>
     </w:p>
-    <w:bookmarkEnd w:id="50"/>
-    <w:bookmarkEnd w:id="51"/>
-    <w:bookmarkStart w:id="56" w:name="scaling-and-reconciliation-analysis"/>
+    <w:bookmarkEnd w:id="56"/>
+    <w:bookmarkEnd w:id="57"/>
+    <w:bookmarkStart w:id="62" w:name="scaling-and-reconciliation-analysis"/>
     <w:p>
       <w:pPr>
         <w:pStyle w:val="Heading2"/>
@@ -3953,7 +4040,7 @@
         <w:t xml:space="preserve">10. Scaling and Reconciliation Analysis</w:t>
       </w:r>
     </w:p>
-    <w:bookmarkStart w:id="52" w:name="cardinality-model"/>
+    <w:bookmarkStart w:id="58" w:name="cardinality-model"/>
     <w:p>
       <w:pPr>
         <w:pStyle w:val="Heading3"/>
@@ -4222,8 +4309,8 @@
         <w:t xml:space="preserve">are measured estate multipliers. [Derived]</w:t>
       </w:r>
     </w:p>
-    <w:bookmarkEnd w:id="52"/>
-    <w:bookmarkStart w:id="53" w:name="scenario-envelope"/>
+    <w:bookmarkEnd w:id="58"/>
+    <w:bookmarkStart w:id="59" w:name="scenario-envelope"/>
     <w:p>
       <w:pPr>
         <w:pStyle w:val="Heading3"/>
@@ -4445,8 +4532,8 @@
         <w:t xml:space="preserve">These lower bounds are illustrative calculations, not platform sizing commitments. [Derived]</w:t>
       </w:r>
     </w:p>
-    <w:bookmarkEnd w:id="53"/>
-    <w:bookmarkStart w:id="54" w:name="five-minute-request-demand-model"/>
+    <w:bookmarkEnd w:id="59"/>
+    <w:bookmarkStart w:id="60" w:name="five-minute-request-demand-model"/>
     <w:p>
       <w:pPr>
         <w:pStyle w:val="Heading3"/>
@@ -4512,8 +4599,8 @@
         <w:t xml:space="preserve">This excludes pagination, retries, quota dimensions, VM associations, Resource Graph queries, and write remediation. [Derived] A universal full scan every five minutes is therefore not a safe production design. [Undocumented — architectural judgement]</w:t>
       </w:r>
     </w:p>
-    <w:bookmarkEnd w:id="54"/>
-    <w:bookmarkStart w:id="55" w:name="adaptive-reconciliation"/>
+    <w:bookmarkEnd w:id="60"/>
+    <w:bookmarkStart w:id="61" w:name="adaptive-reconciliation"/>
     <w:p>
       <w:pPr>
         <w:pStyle w:val="Heading3"/>
@@ -4646,9 +4733,9 @@
         <w:t xml:space="preserve">Cosmos DB throughput must be established through measured command, event, audit, and snapshot workloads. [Undocumented — architectural judgement] Any RU target in this phase is a design hypothesis, not a cost or capacity fact. [Undocumented — architectural judgement]</w:t>
       </w:r>
     </w:p>
-    <w:bookmarkEnd w:id="55"/>
-    <w:bookmarkEnd w:id="56"/>
-    <w:bookmarkStart w:id="58" w:name="security-and-credential-review"/>
+    <w:bookmarkEnd w:id="61"/>
+    <w:bookmarkEnd w:id="62"/>
+    <w:bookmarkStart w:id="64" w:name="security-and-credential-review"/>
     <w:p>
       <w:pPr>
         <w:pStyle w:val="Heading2"/>
@@ -4665,7 +4752,7 @@
         <w:t xml:space="preserve">The design requires cross-subscription access for CRG management, sharing, quota queries, role assignments, and potentially VM mutation. [Derived]</w:t>
       </w:r>
     </w:p>
-    <w:bookmarkStart w:id="57" w:name="required-corrections"/>
+    <w:bookmarkStart w:id="63" w:name="required-corrections"/>
     <w:p>
       <w:pPr>
         <w:pStyle w:val="Heading3"/>
@@ -4766,9 +4853,9 @@
         <w:t xml:space="preserve">The credential model is a production blocker because Tier 3 cannot safely call the consumer Compute API without a governed principal, narrow role, consent record, and tested revocation model. [Undocumented — architectural judgement]</w:t>
       </w:r>
     </w:p>
-    <w:bookmarkEnd w:id="57"/>
-    <w:bookmarkEnd w:id="58"/>
-    <w:bookmarkStart w:id="59" w:name="reliability-and-dr-review"/>
+    <w:bookmarkEnd w:id="63"/>
+    <w:bookmarkEnd w:id="64"/>
+    <w:bookmarkStart w:id="65" w:name="reliability-and-dr-review"/>
     <w:p>
       <w:pPr>
         <w:pStyle w:val="Heading2"/>
@@ -4936,8 +5023,8 @@
         <w:t xml:space="preserve">[Derived]</w:t>
       </w:r>
     </w:p>
-    <w:bookmarkEnd w:id="59"/>
-    <w:bookmarkStart w:id="60" w:name="performance-and-cost-review"/>
+    <w:bookmarkEnd w:id="65"/>
+    <w:bookmarkStart w:id="66" w:name="performance-and-cost-review"/>
     <w:p>
       <w:pPr>
         <w:pStyle w:val="Heading2"/>
@@ -5048,8 +5135,8 @@
         <w:t xml:space="preserve">A cost review must compare the operational value of each managed service against a smaller pilot architecture. [Undocumented — architectural judgement] Running Cosmos DB, PostgreSQL, Redis, Service Bus, Event Hubs, Event Grid, AKS, APIM, Grafana, and multiple security services from day one may be justified later, but it is not yet proven necessary for pilot volume. [Derived]</w:t>
       </w:r>
     </w:p>
-    <w:bookmarkEnd w:id="60"/>
-    <w:bookmarkStart w:id="61" w:name="production-readiness-scorecard"/>
+    <w:bookmarkEnd w:id="66"/>
+    <w:bookmarkStart w:id="67" w:name="production-readiness-scorecard"/>
     <w:p>
       <w:pPr>
         <w:pStyle w:val="Heading2"/>
@@ -5992,8 +6079,8 @@
         <w:t xml:space="preserve">The system is not production ready for unrestricted DR automation. [Undocumented — architectural judgement] It can enter a controlled pilot for non-destructive, validated scenarios if preview risk is accepted, the pilot identity model is approved, every mutation is operator-gated, and rollback is tested. [Undocumented — architectural judgement]</w:t>
       </w:r>
     </w:p>
-    <w:bookmarkEnd w:id="61"/>
-    <w:bookmarkStart w:id="66" w:name="risk-treatment-decision"/>
+    <w:bookmarkEnd w:id="67"/>
+    <w:bookmarkStart w:id="72" w:name="risk-treatment-decision"/>
     <w:p>
       <w:pPr>
         <w:pStyle w:val="Heading2"/>
@@ -6002,7 +6089,7 @@
         <w:t xml:space="preserve">15. Risk Treatment Decision</w:t>
       </w:r>
     </w:p>
-    <w:bookmarkStart w:id="62" w:name="accepted-risks"/>
+    <w:bookmarkStart w:id="68" w:name="accepted-risks"/>
     <w:p>
       <w:pPr>
         <w:pStyle w:val="Heading3"/>
@@ -6155,8 +6242,8 @@
         </w:tc>
       </w:tr>
     </w:tbl>
-    <w:bookmarkEnd w:id="62"/>
-    <w:bookmarkStart w:id="63" w:name="unacceptable-risks"/>
+    <w:bookmarkEnd w:id="68"/>
+    <w:bookmarkStart w:id="69" w:name="unacceptable-risks"/>
     <w:p>
       <w:pPr>
         <w:pStyle w:val="Heading3"/>
@@ -6361,8 +6448,8 @@
         </w:tc>
       </w:tr>
     </w:tbl>
-    <w:bookmarkEnd w:id="63"/>
-    <w:bookmarkStart w:id="64" w:name="mitigated-risks"/>
+    <w:bookmarkEnd w:id="69"/>
+    <w:bookmarkStart w:id="70" w:name="mitigated-risks"/>
     <w:p>
       <w:pPr>
         <w:pStyle w:val="Heading3"/>
@@ -6541,8 +6628,8 @@
         </w:tc>
       </w:tr>
     </w:tbl>
-    <w:bookmarkEnd w:id="64"/>
-    <w:bookmarkStart w:id="65" w:name="residual-risks"/>
+    <w:bookmarkEnd w:id="70"/>
+    <w:bookmarkStart w:id="71" w:name="residual-risks"/>
     <w:p>
       <w:pPr>
         <w:pStyle w:val="Heading3"/>
@@ -6559,9 +6646,9 @@
         <w:t xml:space="preserve">Even after controls, Azure capacity acquisition can fail, quota updates can be delayed, cross-subscription authorization can drift, and application recovery can fail independently of capacity. [Derived] These residual risks must be reflected in customer recovery commitments and operational exercises. [Undocumented — architectural judgement]</w:t>
       </w:r>
     </w:p>
-    <w:bookmarkEnd w:id="65"/>
-    <w:bookmarkEnd w:id="66"/>
-    <w:bookmarkStart w:id="67" w:name="conditional-pilot-readiness"/>
+    <w:bookmarkEnd w:id="71"/>
+    <w:bookmarkEnd w:id="72"/>
+    <w:bookmarkStart w:id="73" w:name="conditional-pilot-readiness"/>
     <w:p>
       <w:pPr>
         <w:pStyle w:val="Heading2"/>
@@ -6710,8 +6797,8 @@
         <w:t xml:space="preserve">Pilot customers accept preview and non-paired-region risks. [Undocumented — architectural judgement]</w:t>
       </w:r>
     </w:p>
-    <w:bookmarkEnd w:id="67"/>
-    <w:bookmarkStart w:id="68" w:name="production-entry-gates"/>
+    <w:bookmarkEnd w:id="73"/>
+    <w:bookmarkStart w:id="74" w:name="production-entry-gates"/>
     <w:p>
       <w:pPr>
         <w:pStyle w:val="Heading2"/>
@@ -7153,8 +7240,8 @@
         </w:tc>
       </w:tr>
     </w:tbl>
-    <w:bookmarkEnd w:id="68"/>
-    <w:bookmarkStart w:id="69" w:name="council-recommendation"/>
+    <w:bookmarkEnd w:id="74"/>
+    <w:bookmarkStart w:id="75" w:name="council-recommendation"/>
     <w:p>
       <w:pPr>
         <w:pStyle w:val="Heading2"/>
@@ -7223,9 +7310,9 @@
         <w:t xml:space="preserve">Do not approve unrestricted autonomous DR, destructive capacity transfer, or VMSS emergency automation at this time. [Undocumented — architectural judgement]</w:t>
       </w:r>
     </w:p>
-    <w:bookmarkEnd w:id="69"/>
-    <w:bookmarkEnd w:id="70"/>
-    <w:bookmarkStart w:id="139" w:name="part-ii-final-architecture"/>
+    <w:bookmarkEnd w:id="75"/>
+    <w:bookmarkEnd w:id="76"/>
+    <w:bookmarkStart w:id="145" w:name="part-ii-final-architecture"/>
     <w:p>
       <w:pPr>
         <w:pStyle w:val="Heading1"/>
@@ -7234,7 +7321,7 @@
         <w:t xml:space="preserve">Part II — Final Architecture</w:t>
       </w:r>
     </w:p>
-    <w:bookmarkStart w:id="71" w:name="business-drivers"/>
+    <w:bookmarkStart w:id="77" w:name="business-drivers"/>
     <w:p>
       <w:pPr>
         <w:pStyle w:val="Heading2"/>
@@ -7319,8 +7406,8 @@
         <w:t xml:space="preserve">The architecture is not intended to replace application orchestration, data replication, networking recovery, or business-continuity governance. [Undocumented — architectural judgement]</w:t>
       </w:r>
     </w:p>
-    <w:bookmarkEnd w:id="71"/>
-    <w:bookmarkStart w:id="72" w:name="design-principles-and-rationale"/>
+    <w:bookmarkEnd w:id="77"/>
+    <w:bookmarkStart w:id="78" w:name="design-principles-and-rationale"/>
     <w:p>
       <w:pPr>
         <w:pStyle w:val="Heading2"/>
@@ -7549,8 +7636,8 @@
         <w:t xml:space="preserve">Operators can recover without the engine. [Undocumented — architectural judgement]</w:t>
       </w:r>
     </w:p>
-    <w:bookmarkEnd w:id="72"/>
-    <w:bookmarkStart w:id="75" w:name="assumptions-and-constraints"/>
+    <w:bookmarkEnd w:id="78"/>
+    <w:bookmarkStart w:id="81" w:name="assumptions-and-constraints"/>
     <w:p>
       <w:pPr>
         <w:pStyle w:val="Heading2"/>
@@ -7559,7 +7646,7 @@
         <w:t xml:space="preserve">21. Assumptions and Constraints</w:t>
       </w:r>
     </w:p>
-    <w:bookmarkStart w:id="73" w:name="numbered-assumptions"/>
+    <w:bookmarkStart w:id="79" w:name="numbered-assumptions"/>
     <w:p>
       <w:pPr>
         <w:pStyle w:val="Heading3"/>
@@ -7788,8 +7875,8 @@
         <w:t xml:space="preserve">Direct ARM state is required before safety-critical commit. [Undocumented — architectural judgement]</w:t>
       </w:r>
     </w:p>
-    <w:bookmarkEnd w:id="73"/>
-    <w:bookmarkStart w:id="74" w:name="constraints"/>
+    <w:bookmarkEnd w:id="79"/>
+    <w:bookmarkStart w:id="80" w:name="constraints"/>
     <w:p>
       <w:pPr>
         <w:pStyle w:val="Heading3"/>
@@ -7882,9 +7969,9 @@
         <w:t xml:space="preserve">There is no presumed propagation SLA. [Undocumented — architectural judgement]</w:t>
       </w:r>
     </w:p>
-    <w:bookmarkEnd w:id="74"/>
-    <w:bookmarkEnd w:id="75"/>
-    <w:bookmarkStart w:id="79" w:name="requirements-priority"/>
+    <w:bookmarkEnd w:id="80"/>
+    <w:bookmarkEnd w:id="81"/>
+    <w:bookmarkStart w:id="85" w:name="requirements-priority"/>
     <w:p>
       <w:pPr>
         <w:pStyle w:val="Heading2"/>
@@ -7893,7 +7980,7 @@
         <w:t xml:space="preserve">22. Requirements Priority</w:t>
       </w:r>
     </w:p>
-    <w:bookmarkStart w:id="76" w:name="must"/>
+    <w:bookmarkStart w:id="82" w:name="must"/>
     <w:p>
       <w:pPr>
         <w:pStyle w:val="Heading3"/>
@@ -8090,8 +8177,8 @@
         <w:t xml:space="preserve">[Undocumented — architectural judgement]</w:t>
       </w:r>
     </w:p>
-    <w:bookmarkEnd w:id="76"/>
-    <w:bookmarkStart w:id="77" w:name="should"/>
+    <w:bookmarkEnd w:id="82"/>
+    <w:bookmarkStart w:id="83" w:name="should"/>
     <w:p>
       <w:pPr>
         <w:pStyle w:val="Heading3"/>
@@ -8204,8 +8291,8 @@
         <w:t xml:space="preserve">[Undocumented — architectural judgement]</w:t>
       </w:r>
     </w:p>
-    <w:bookmarkEnd w:id="77"/>
-    <w:bookmarkStart w:id="78" w:name="could"/>
+    <w:bookmarkEnd w:id="83"/>
+    <w:bookmarkStart w:id="84" w:name="could"/>
     <w:p>
       <w:pPr>
         <w:pStyle w:val="Heading3"/>
@@ -8294,9 +8381,9 @@
         <w:t xml:space="preserve">[Undocumented — architectural judgement]</w:t>
       </w:r>
     </w:p>
-    <w:bookmarkEnd w:id="78"/>
-    <w:bookmarkEnd w:id="79"/>
-    <w:bookmarkStart w:id="80" w:name="logical-component-architecture"/>
+    <w:bookmarkEnd w:id="84"/>
+    <w:bookmarkEnd w:id="85"/>
+    <w:bookmarkStart w:id="86" w:name="logical-component-architecture"/>
     <w:p>
       <w:pPr>
         <w:pStyle w:val="Heading2"/>
@@ -8585,8 +8672,8 @@
         <w:t xml:space="preserve">The buildable core separates commands from queries and isolates Azure API adapters by provider. [Undocumented — architectural judgement] The state database is authoritative for engine intent, while Azure resource providers remain authoritative for Azure resource state. [Undocumented — architectural judgement]</w:t>
       </w:r>
     </w:p>
-    <w:bookmarkEnd w:id="80"/>
-    <w:bookmarkStart w:id="81" w:name="Xbc835c1b1373736e06ed0f11b02b24f9249b0eb"/>
+    <w:bookmarkEnd w:id="86"/>
+    <w:bookmarkStart w:id="87" w:name="Xbc835c1b1373736e06ed0f11b02b24f9249b0eb"/>
     <w:p>
       <w:pPr>
         <w:pStyle w:val="Heading2"/>
@@ -8749,8 +8836,8 @@
         <w:t xml:space="preserve">Management-group placement is a governance choice, not a requirement that every customer share the same hierarchy. [Undocumented — architectural judgement] Quota-group scope and eligibility must be validated for the actual tenant and billing structure. [Undocumented — architectural judgement]</w:t>
       </w:r>
     </w:p>
-    <w:bookmarkEnd w:id="81"/>
-    <w:bookmarkStart w:id="83" w:name="crg-hierarchy-and-sharing-architecture"/>
+    <w:bookmarkEnd w:id="87"/>
+    <w:bookmarkStart w:id="89" w:name="crg-hierarchy-and-sharing-architecture"/>
     <w:p>
       <w:pPr>
         <w:pStyle w:val="Heading2"/>
@@ -8886,7 +8973,7 @@
         <w:t xml:space="preserve">rule is a policy default rather than an assertion that three Azure resources can represent every estate shape. [Undocumented — architectural judgement]</w:t>
       </w:r>
     </w:p>
-    <w:bookmarkStart w:id="82" w:name="sharing-sequence"/>
+    <w:bookmarkStart w:id="88" w:name="sharing-sequence"/>
     <w:p>
       <w:pPr>
         <w:pStyle w:val="Heading3"/>
@@ -9022,9 +9109,9 @@
         <w:t xml:space="preserve">Sharing is complete only after all steps are read back and recorded. [Undocumented — architectural judgement]</w:t>
       </w:r>
     </w:p>
-    <w:bookmarkEnd w:id="82"/>
-    <w:bookmarkEnd w:id="83"/>
-    <w:bookmarkStart w:id="87" w:name="quota-group-architecture"/>
+    <w:bookmarkEnd w:id="88"/>
+    <w:bookmarkEnd w:id="89"/>
+    <w:bookmarkStart w:id="93" w:name="quota-group-architecture"/>
     <w:p>
       <w:pPr>
         <w:pStyle w:val="Heading2"/>
@@ -9134,7 +9221,7 @@
         <w:t xml:space="preserve">    EngineFloor --&gt; NonProdCeiling[Effective NonProd Ceiling]</w:t>
       </w:r>
     </w:p>
-    <w:bookmarkStart w:id="84" w:name="formulas"/>
+    <w:bookmarkStart w:id="90" w:name="formulas"/>
     <w:p>
       <w:pPr>
         <w:pStyle w:val="Heading3"/>
@@ -9227,8 +9314,8 @@
         <w:t xml:space="preserve">These formulas are engine accounting controls. [Derived] They do not create a native Azure sub-reservation. [Assumed]</w:t>
       </w:r>
     </w:p>
-    <w:bookmarkEnd w:id="84"/>
-    <w:bookmarkStart w:id="85" w:name="exact-controls"/>
+    <w:bookmarkEnd w:id="90"/>
+    <w:bookmarkStart w:id="91" w:name="exact-controls"/>
     <w:p>
       <w:pPr>
         <w:pStyle w:val="Heading3"/>
@@ -9297,8 +9384,8 @@
         <w:t xml:space="preserve">Group propagation is polled; no fixed SLA is assumed. [Undocumented — architectural judgement]</w:t>
       </w:r>
     </w:p>
-    <w:bookmarkEnd w:id="85"/>
-    <w:bookmarkStart w:id="86" w:name="Xf87c30f63046dea1344dcf7faf724f258ccc67d"/>
+    <w:bookmarkEnd w:id="91"/>
+    <w:bookmarkStart w:id="92" w:name="Xf87c30f63046dea1344dcf7faf724f258ccc67d"/>
     <w:p>
       <w:pPr>
         <w:pStyle w:val="Heading3"/>
@@ -9454,9 +9541,9 @@
         <w:t xml:space="preserve">semantics are stable across Azure API versions. Pin the exact preview API version in all quota-group management calls and add version-drift detection to the platform health check. [Undocumented — architectural judgement]</w:t>
       </w:r>
     </w:p>
-    <w:bookmarkEnd w:id="86"/>
-    <w:bookmarkEnd w:id="87"/>
-    <w:bookmarkStart w:id="106" w:name="region-selection-architecture"/>
+    <w:bookmarkEnd w:id="92"/>
+    <w:bookmarkEnd w:id="93"/>
+    <w:bookmarkStart w:id="112" w:name="region-selection-architecture"/>
     <w:p>
       <w:pPr>
         <w:pStyle w:val="Heading2"/>
@@ -9465,7 +9552,7 @@
         <w:t xml:space="preserve">27. Region Selection Architecture</w:t>
       </w:r>
     </w:p>
-    <w:bookmarkStart w:id="88" w:name="terminology-note"/>
+    <w:bookmarkStart w:id="94" w:name="terminology-note"/>
     <w:p>
       <w:pPr>
         <w:pStyle w:val="Heading3"/>
@@ -9520,8 +9607,8 @@
         </w:pict>
       </w:r>
     </w:p>
-    <w:bookmarkEnd w:id="88"/>
-    <w:bookmarkStart w:id="92" w:name="region-classification-model"/>
+    <w:bookmarkEnd w:id="94"/>
+    <w:bookmarkStart w:id="98" w:name="region-classification-model"/>
     <w:p>
       <w:pPr>
         <w:pStyle w:val="Heading3"/>
@@ -9553,7 +9640,7 @@
         <w:t xml:space="preserve">(config-as-code, versioned and auditable) and flows through the same policy-versioning and replay path as the scoring weights. [Undocumented — architectural judgement]</w:t>
       </w:r>
     </w:p>
-    <w:bookmarkStart w:id="89" w:name="standard-capacity-regions"/>
+    <w:bookmarkStart w:id="95" w:name="standard-capacity-regions"/>
     <w:p>
       <w:pPr>
         <w:pStyle w:val="Heading4"/>
@@ -9714,8 +9801,8 @@
         </w:tc>
       </w:tr>
     </w:tbl>
-    <w:bookmarkEnd w:id="89"/>
-    <w:bookmarkStart w:id="90" w:name="restricted-capacity-regions"/>
+    <w:bookmarkEnd w:id="95"/>
+    <w:bookmarkStart w:id="96" w:name="restricted-capacity-regions"/>
     <w:p>
       <w:pPr>
         <w:pStyle w:val="Heading4"/>
@@ -10015,8 +10102,8 @@
         <w:t xml:space="preserve">— these regions never reach the scoring pipeline. [Undocumented — architectural judgement]</w:t>
       </w:r>
     </w:p>
-    <w:bookmarkEnd w:id="90"/>
-    <w:bookmarkStart w:id="91" w:name="cross-geo-extension-regions"/>
+    <w:bookmarkEnd w:id="96"/>
+    <w:bookmarkStart w:id="97" w:name="cross-geo-extension-regions"/>
     <w:p>
       <w:pPr>
         <w:pStyle w:val="Heading4"/>
@@ -10192,9 +10279,9 @@
         </w:pict>
       </w:r>
     </w:p>
-    <w:bookmarkEnd w:id="91"/>
-    <w:bookmarkEnd w:id="92"/>
-    <w:bookmarkStart w:id="93" w:name="region-distribution-model-by-geography"/>
+    <w:bookmarkEnd w:id="97"/>
+    <w:bookmarkEnd w:id="98"/>
+    <w:bookmarkStart w:id="99" w:name="region-distribution-model-by-geography"/>
     <w:p>
       <w:pPr>
         <w:pStyle w:val="Heading3"/>
@@ -10388,8 +10475,8 @@
         </w:pict>
       </w:r>
     </w:p>
-    <w:bookmarkEnd w:id="93"/>
-    <w:bookmarkStart w:id="94" w:name="region-eligibility-decision-tree"/>
+    <w:bookmarkEnd w:id="99"/>
+    <w:bookmarkStart w:id="100" w:name="region-eligibility-decision-tree"/>
     <w:p>
       <w:pPr>
         <w:pStyle w:val="Heading3"/>
@@ -10611,8 +10698,8 @@
         </w:pict>
       </w:r>
     </w:p>
-    <w:bookmarkEnd w:id="94"/>
-    <w:bookmarkStart w:id="97" w:name="prod-region-input-modes"/>
+    <w:bookmarkEnd w:id="100"/>
+    <w:bookmarkStart w:id="103" w:name="prod-region-input-modes"/>
     <w:p>
       <w:pPr>
         <w:pStyle w:val="Heading3"/>
@@ -10901,7 +10988,7 @@
         <w:t xml:space="preserve">    Anchor --&gt; SeqSelect[Sequential CVAL then DR selection]</w:t>
       </w:r>
     </w:p>
-    <w:bookmarkStart w:id="95" w:name="scenario-1-derivation-semantics"/>
+    <w:bookmarkStart w:id="101" w:name="scenario-1-derivation-semantics"/>
     <w:p>
       <w:pPr>
         <w:pStyle w:val="Heading4"/>
@@ -11059,8 +11146,8 @@
         <w:t xml:space="preserve">if no Standard Capacity Region in the geography is eligible the request is rejected with a geography-scoped exhaustion error; the engine never silently falls back to a region outside the geography or to a Restricted Capacity Region. [Derived]</w:t>
       </w:r>
     </w:p>
-    <w:bookmarkEnd w:id="95"/>
-    <w:bookmarkStart w:id="96" w:name="automated-placement-flow"/>
+    <w:bookmarkEnd w:id="101"/>
+    <w:bookmarkStart w:id="102" w:name="automated-placement-flow"/>
     <w:p>
       <w:pPr>
         <w:pStyle w:val="Heading4"/>
@@ -11222,9 +11309,9 @@
         </w:pict>
       </w:r>
     </w:p>
-    <w:bookmarkEnd w:id="96"/>
-    <w:bookmarkEnd w:id="97"/>
-    <w:bookmarkStart w:id="101" w:name="middle-east-special-handling"/>
+    <w:bookmarkEnd w:id="102"/>
+    <w:bookmarkEnd w:id="103"/>
+    <w:bookmarkStart w:id="107" w:name="middle-east-special-handling"/>
     <w:p>
       <w:pPr>
         <w:pStyle w:val="Heading3"/>
@@ -11254,7 +11341,7 @@
         <w:t xml:space="preserve">: only two Standard Capacity Regions exist in-geo (Saudi Arabia, UAE North). The three-region minimum required for Prod + CVAL + DR cannot be satisfied within the geography boundary alone. The engine resolves this via the approved Cross-Geo Extension Group. [Undocumented — architectural judgement]</w:t>
       </w:r>
     </w:p>
-    <w:bookmarkStart w:id="98" w:name="Xe0fdf66ba60539b5ea37249a7d5ba1850edcfb0"/>
+    <w:bookmarkStart w:id="104" w:name="Xe0fdf66ba60539b5ea37249a7d5ba1850edcfb0"/>
     <w:p>
       <w:pPr>
         <w:pStyle w:val="Heading4"/>
@@ -11475,8 +11562,8 @@
         <w:t xml:space="preserve">. The weighted model selects one for Prod; the other is assigned CVAL deterministically (only one remaining in-geo candidate exists). [Undocumented — architectural judgement]</w:t>
       </w:r>
     </w:p>
-    <w:bookmarkEnd w:id="98"/>
-    <w:bookmarkStart w:id="99" w:name="middle-east-placement-flow"/>
+    <w:bookmarkEnd w:id="104"/>
+    <w:bookmarkStart w:id="105" w:name="middle-east-placement-flow"/>
     <w:p>
       <w:pPr>
         <w:pStyle w:val="Heading4"/>
@@ -11595,8 +11682,8 @@
         <w:t xml:space="preserve">    DRAssign --&gt; Complete</w:t>
       </w:r>
     </w:p>
-    <w:bookmarkEnd w:id="99"/>
-    <w:bookmarkStart w:id="100" w:name="cross-geo-extension-constraints"/>
+    <w:bookmarkEnd w:id="105"/>
+    <w:bookmarkStart w:id="106" w:name="cross-geo-extension-constraints"/>
     <w:p>
       <w:pPr>
         <w:pStyle w:val="Heading4"/>
@@ -11675,9 +11762,9 @@
         </w:pict>
       </w:r>
     </w:p>
-    <w:bookmarkEnd w:id="100"/>
-    <w:bookmarkEnd w:id="101"/>
-    <w:bookmarkStart w:id="102" w:name="Xbe55cd5d6461f83ac1ca72144b8b476d13e9f8f"/>
+    <w:bookmarkEnd w:id="106"/>
+    <w:bookmarkEnd w:id="107"/>
+    <w:bookmarkStart w:id="108" w:name="Xbe55cd5d6461f83ac1ca72144b8b476d13e9f8f"/>
     <w:p>
       <w:pPr>
         <w:pStyle w:val="Heading3"/>
@@ -12039,8 +12126,8 @@
         </w:pict>
       </w:r>
     </w:p>
-    <w:bookmarkEnd w:id="102"/>
-    <w:bookmarkStart w:id="103" w:name="validation-rule-framework"/>
+    <w:bookmarkEnd w:id="108"/>
+    <w:bookmarkStart w:id="109" w:name="validation-rule-framework"/>
     <w:p>
       <w:pPr>
         <w:pStyle w:val="Heading3"/>
@@ -12687,8 +12774,8 @@
         </w:pict>
       </w:r>
     </w:p>
-    <w:bookmarkEnd w:id="103"/>
-    <w:bookmarkStart w:id="104" w:name="governance-and-compliance-controls"/>
+    <w:bookmarkEnd w:id="109"/>
+    <w:bookmarkStart w:id="110" w:name="governance-and-compliance-controls"/>
     <w:p>
       <w:pPr>
         <w:pStyle w:val="Heading3"/>
@@ -12812,8 +12899,8 @@
         </w:pict>
       </w:r>
     </w:p>
-    <w:bookmarkEnd w:id="104"/>
-    <w:bookmarkStart w:id="105" w:name="hard-constraints-hc-1-through-hc-10"/>
+    <w:bookmarkEnd w:id="110"/>
+    <w:bookmarkStart w:id="111" w:name="hard-constraints-hc-1-through-hc-10"/>
     <w:p>
       <w:pPr>
         <w:pStyle w:val="Heading3"/>
@@ -12827,19 +12914,33 @@
         <w:pStyle w:val="FirstParagraph"/>
       </w:pPr>
       <w:r>
-        <w:t xml:space="preserve">HC-1 through HC-8 are defined in</w:t>
+        <w:t xml:space="preserve">HC-1 through HC-8 are defined in the</w:t>
       </w:r>
       <w:r>
         <w:t xml:space="preserve"> </w:t>
       </w:r>
-      <w:r>
-        <w:rPr>
-          <w:rStyle w:val="VerbatimChar"/>
-        </w:rPr>
-        <w:t xml:space="preserve">multi_region_placement_design.md</w:t>
-      </w:r>
-      <w:r>
-        <w:t xml:space="preserve">. HC-9 and HC-10 are added by this section.</w:t>
+      <w:hyperlink r:id="rId23">
+        <w:r>
+          <w:rPr>
+            <w:rStyle w:val="Hyperlink"/>
+          </w:rPr>
+          <w:t xml:space="preserve">Multi-Region Placement Design</w:t>
+        </w:r>
+      </w:hyperlink>
+      <w:r>
+        <w:t xml:space="preserve"> </w:t>
+      </w:r>
+      <w:r>
+        <w:t xml:space="preserve">(</w:t>
+      </w:r>
+      <w:r>
+        <w:rPr>
+          <w:rStyle w:val="VerbatimChar"/>
+        </w:rPr>
+        <w:t xml:space="preserve">docs/research/multi_region_placement_design.md</w:t>
+      </w:r>
+      <w:r>
+        <w:t xml:space="preserve">). HC-9 and HC-10 are added by this section.</w:t>
       </w:r>
     </w:p>
     <w:p>
@@ -13057,9 +13158,9 @@
         <w:t xml:space="preserve">A capacity hold must be acquired before assignment commit. [Undocumented — architectural judgement]</w:t>
       </w:r>
     </w:p>
-    <w:bookmarkEnd w:id="105"/>
-    <w:bookmarkEnd w:id="106"/>
-    <w:bookmarkStart w:id="109" w:name="placement-scoring-and-forecasting"/>
+    <w:bookmarkEnd w:id="111"/>
+    <w:bookmarkEnd w:id="112"/>
+    <w:bookmarkStart w:id="115" w:name="placement-scoring-and-forecasting"/>
     <w:p>
       <w:pPr>
         <w:pStyle w:val="Heading2"/>
@@ -13255,7 +13356,7 @@
         <w:t xml:space="preserve">    Score --&gt; Audit[Persist Inputs and Policy Version]</w:t>
       </w:r>
     </w:p>
-    <w:bookmarkStart w:id="107" w:name="corrected-scoring-model"/>
+    <w:bookmarkStart w:id="113" w:name="corrected-scoring-model"/>
     <w:p>
       <w:pPr>
         <w:pStyle w:val="Heading3"/>
@@ -13380,8 +13481,8 @@
         <w:t xml:space="preserve">[Undocumented — architectural judgement]</w:t>
       </w:r>
     </w:p>
-    <w:bookmarkEnd w:id="107"/>
-    <w:bookmarkStart w:id="108" w:name="forecast-formula"/>
+    <w:bookmarkEnd w:id="113"/>
+    <w:bookmarkStart w:id="114" w:name="forecast-formula"/>
     <w:p>
       <w:pPr>
         <w:pStyle w:val="Heading3"/>
@@ -13497,9 +13598,9 @@
         <w:t xml:space="preserve">Forecast recommendations remain advisory until model accuracy and false-positive rates are measured. [Undocumented — architectural judgement]</w:t>
       </w:r>
     </w:p>
-    <w:bookmarkEnd w:id="108"/>
-    <w:bookmarkEnd w:id="109"/>
-    <w:bookmarkStart w:id="113" w:name="state-model-and-concurrency-controls"/>
+    <w:bookmarkEnd w:id="114"/>
+    <w:bookmarkEnd w:id="115"/>
+    <w:bookmarkStart w:id="119" w:name="state-model-and-concurrency-controls"/>
     <w:p>
       <w:pPr>
         <w:pStyle w:val="Heading2"/>
@@ -13508,7 +13609,7 @@
         <w:t xml:space="preserve">29. State Model and Concurrency Controls</w:t>
       </w:r>
     </w:p>
-    <w:bookmarkStart w:id="110" w:name="engine-state-machine"/>
+    <w:bookmarkStart w:id="116" w:name="engine-state-machine"/>
     <w:p>
       <w:pPr>
         <w:pStyle w:val="Heading3"/>
@@ -13635,8 +13736,8 @@
         <w:t xml:space="preserve">The engine state machine is a production blocker until this model is implemented with conditional writes, transition guards, and recovery tests. [Undocumented — architectural judgement]</w:t>
       </w:r>
     </w:p>
-    <w:bookmarkEnd w:id="110"/>
-    <w:bookmarkStart w:id="111" w:name="state-entity"/>
+    <w:bookmarkEnd w:id="116"/>
+    <w:bookmarkStart w:id="117" w:name="state-entity"/>
     <w:p>
       <w:pPr>
         <w:pStyle w:val="Heading3"/>
@@ -13802,8 +13903,8 @@
         <w:t xml:space="preserve">[Undocumented — architectural judgement]</w:t>
       </w:r>
     </w:p>
-    <w:bookmarkEnd w:id="111"/>
-    <w:bookmarkStart w:id="112" w:name="capacity-holds"/>
+    <w:bookmarkEnd w:id="117"/>
+    <w:bookmarkStart w:id="118" w:name="capacity-holds"/>
     <w:p>
       <w:pPr>
         <w:pStyle w:val="Heading3"/>
@@ -13820,9 +13921,9 @@
         <w:t xml:space="preserve">Before returning a committed assignment, the engine creates a hold keyed by region, SKU, zone, environment, and policy version. [Undocumented — architectural judgement] The hold uses optimistic concurrency and expires if Azure provisioning does not begin. [Undocumented — architectural judgement] This closes concurrent placement race B-7. [Derived]</w:t>
       </w:r>
     </w:p>
-    <w:bookmarkEnd w:id="112"/>
-    <w:bookmarkEnd w:id="113"/>
-    <w:bookmarkStart w:id="114" w:name="steady-state-capacity-lifecycle"/>
+    <w:bookmarkEnd w:id="118"/>
+    <w:bookmarkEnd w:id="119"/>
+    <w:bookmarkStart w:id="120" w:name="steady-state-capacity-lifecycle"/>
     <w:p>
       <w:pPr>
         <w:pStyle w:val="Heading2"/>
@@ -13995,8 +14096,8 @@
         <w:t xml:space="preserve">Auto-decrease is excluded from Phase 1 because it can remove future capacity and interact with running VMs. [Undocumented — architectural judgement]</w:t>
       </w:r>
     </w:p>
-    <w:bookmarkEnd w:id="114"/>
-    <w:bookmarkStart w:id="115" w:name="dr-activation-architecture"/>
+    <w:bookmarkEnd w:id="120"/>
+    <w:bookmarkStart w:id="121" w:name="dr-activation-architecture"/>
     <w:p>
       <w:pPr>
         <w:pStyle w:val="Heading2"/>
@@ -14177,8 +14278,8 @@
         <w:t xml:space="preserve">DR activation does not automatically authorize Tier 2 or Tier 3. [Undocumented — architectural judgement] It establishes the operating mode in which separately governed emergency operations may be evaluated. [Undocumented — architectural judgement]</w:t>
       </w:r>
     </w:p>
-    <w:bookmarkEnd w:id="115"/>
-    <w:bookmarkStart w:id="116" w:name="tier-escalation-architecture"/>
+    <w:bookmarkEnd w:id="121"/>
+    <w:bookmarkStart w:id="122" w:name="tier-escalation-architecture"/>
     <w:p>
       <w:pPr>
         <w:pStyle w:val="Heading2"/>
@@ -14322,8 +14423,8 @@
         <w:t xml:space="preserve">Tier 3 is not automated in Phase 1. [Undocumented — architectural judgement]</w:t>
       </w:r>
     </w:p>
-    <w:bookmarkEnd w:id="116"/>
-    <w:bookmarkStart w:id="119" w:name="aks-and-vmss-integration-architecture"/>
+    <w:bookmarkEnd w:id="122"/>
+    <w:bookmarkStart w:id="125" w:name="aks-and-vmss-integration-architecture"/>
     <w:p>
       <w:pPr>
         <w:pStyle w:val="Heading2"/>
@@ -14332,7 +14433,7 @@
         <w:t xml:space="preserve">33. AKS and VMSS Integration Architecture</w:t>
       </w:r>
     </w:p>
-    <w:bookmarkStart w:id="117" w:name="aks-controls"/>
+    <w:bookmarkStart w:id="123" w:name="aks-controls"/>
     <w:p>
       <w:pPr>
         <w:pStyle w:val="Heading3"/>
@@ -14401,8 +14502,8 @@
         <w:t xml:space="preserve">A failed scale-out must not trigger unbounded retries. [Undocumented — architectural judgement]</w:t>
       </w:r>
     </w:p>
-    <w:bookmarkEnd w:id="117"/>
-    <w:bookmarkStart w:id="118" w:name="vmss-controls"/>
+    <w:bookmarkEnd w:id="123"/>
+    <w:bookmarkStart w:id="124" w:name="vmss-controls"/>
     <w:p>
       <w:pPr>
         <w:pStyle w:val="Heading3"/>
@@ -14685,9 +14786,9 @@
         <w:t xml:space="preserve">[Undocumented — architectural judgement]</w:t>
       </w:r>
     </w:p>
-    <w:bookmarkEnd w:id="118"/>
-    <w:bookmarkEnd w:id="119"/>
-    <w:bookmarkStart w:id="122" w:name="data-architecture"/>
+    <w:bookmarkEnd w:id="124"/>
+    <w:bookmarkEnd w:id="125"/>
+    <w:bookmarkStart w:id="128" w:name="data-architecture"/>
     <w:p>
       <w:pPr>
         <w:pStyle w:val="Heading2"/>
@@ -14696,7 +14797,7 @@
         <w:t xml:space="preserve">34. Data Architecture</w:t>
       </w:r>
     </w:p>
-    <w:bookmarkStart w:id="120" w:name="authoritative-entities"/>
+    <w:bookmarkStart w:id="126" w:name="authoritative-entities"/>
     <w:p>
       <w:pPr>
         <w:pStyle w:val="Heading3"/>
@@ -14917,8 +15018,8 @@
         <w:t xml:space="preserve">[Derived]</w:t>
       </w:r>
     </w:p>
-    <w:bookmarkEnd w:id="120"/>
-    <w:bookmarkStart w:id="121" w:name="open-gap-closures"/>
+    <w:bookmarkEnd w:id="126"/>
+    <w:bookmarkStart w:id="127" w:name="open-gap-closures"/>
     <w:p>
       <w:pPr>
         <w:pStyle w:val="Heading3"/>
@@ -15017,9 +15118,9 @@
         <w:t xml:space="preserve">in the canonical API, schema, authorization model, audit model, and backlog before implementation begins. [Undocumented — architectural judgement]</w:t>
       </w:r>
     </w:p>
-    <w:bookmarkEnd w:id="121"/>
-    <w:bookmarkEnd w:id="122"/>
-    <w:bookmarkStart w:id="124" w:name="api-architecture"/>
+    <w:bookmarkEnd w:id="127"/>
+    <w:bookmarkEnd w:id="128"/>
+    <w:bookmarkStart w:id="130" w:name="api-architecture"/>
     <w:p>
       <w:pPr>
         <w:pStyle w:val="Heading2"/>
@@ -15036,7 +15137,7 @@
         <w:t xml:space="preserve">All state-changing endpoints return an operation resource rather than implying synchronous Azure completion. [Undocumented — architectural judgement]</w:t>
       </w:r>
     </w:p>
-    <w:bookmarkStart w:id="123" w:name="core-endpoints"/>
+    <w:bookmarkStart w:id="129" w:name="core-endpoints"/>
     <w:p>
       <w:pPr>
         <w:pStyle w:val="Heading3"/>
@@ -15428,9 +15529,9 @@
         <w:t xml:space="preserve">[Undocumented — architectural judgement]</w:t>
       </w:r>
     </w:p>
-    <w:bookmarkEnd w:id="123"/>
-    <w:bookmarkEnd w:id="124"/>
-    <w:bookmarkStart w:id="127" w:name="rbac-and-managed-identity-model"/>
+    <w:bookmarkEnd w:id="129"/>
+    <w:bookmarkEnd w:id="130"/>
+    <w:bookmarkStart w:id="133" w:name="rbac-and-managed-identity-model"/>
     <w:p>
       <w:pPr>
         <w:pStyle w:val="Heading2"/>
@@ -15439,7 +15540,7 @@
         <w:t xml:space="preserve">36. RBAC and Managed Identity Model</w:t>
       </w:r>
     </w:p>
-    <w:bookmarkStart w:id="125" w:name="rbac-matrix"/>
+    <w:bookmarkStart w:id="131" w:name="rbac-matrix"/>
     <w:p>
       <w:pPr>
         <w:pStyle w:val="Heading3"/>
@@ -15972,8 +16073,8 @@
         <w:t xml:space="preserve">[Undocumented — architectural judgement]</w:t>
       </w:r>
     </w:p>
-    <w:bookmarkEnd w:id="125"/>
-    <w:bookmarkStart w:id="126" w:name="managed-identity-scope"/>
+    <w:bookmarkEnd w:id="131"/>
+    <w:bookmarkStart w:id="132" w:name="managed-identity-scope"/>
     <w:p>
       <w:pPr>
         <w:pStyle w:val="Heading3"/>
@@ -15998,9 +16099,9 @@
         <w:t xml:space="preserve">If the minimum custom action set cannot be established, Tier 3 remains blocked. [Undocumented — architectural judgement]</w:t>
       </w:r>
     </w:p>
-    <w:bookmarkEnd w:id="126"/>
-    <w:bookmarkEnd w:id="127"/>
-    <w:bookmarkStart w:id="131" w:name="observability-dashboards-and-alerts"/>
+    <w:bookmarkEnd w:id="132"/>
+    <w:bookmarkEnd w:id="133"/>
+    <w:bookmarkStart w:id="137" w:name="observability-dashboards-and-alerts"/>
     <w:p>
       <w:pPr>
         <w:pStyle w:val="Heading2"/>
@@ -16009,7 +16110,7 @@
         <w:t xml:space="preserve">37. Observability, Dashboards, and Alerts</w:t>
       </w:r>
     </w:p>
-    <w:bookmarkStart w:id="128" w:name="proposed-sli-and-slo-targets"/>
+    <w:bookmarkStart w:id="134" w:name="proposed-sli-and-slo-targets"/>
     <w:p>
       <w:pPr>
         <w:pStyle w:val="Heading3"/>
@@ -16274,8 +16375,8 @@
         </w:tc>
       </w:tr>
     </w:tbl>
-    <w:bookmarkEnd w:id="128"/>
-    <w:bookmarkStart w:id="129" w:name="dashboards"/>
+    <w:bookmarkEnd w:id="134"/>
+    <w:bookmarkStart w:id="135" w:name="dashboards"/>
     <w:p>
       <w:pPr>
         <w:pStyle w:val="Heading3"/>
@@ -16412,8 +16513,8 @@
         <w:t xml:space="preserve">[Undocumented — architectural judgement]</w:t>
       </w:r>
     </w:p>
-    <w:bookmarkEnd w:id="129"/>
-    <w:bookmarkStart w:id="130" w:name="alert-catalog"/>
+    <w:bookmarkEnd w:id="135"/>
+    <w:bookmarkStart w:id="136" w:name="alert-catalog"/>
     <w:p>
       <w:pPr>
         <w:pStyle w:val="Heading3"/>
@@ -17053,9 +17154,9 @@
         <w:t xml:space="preserve">[Undocumented — architectural judgement]</w:t>
       </w:r>
     </w:p>
-    <w:bookmarkEnd w:id="130"/>
-    <w:bookmarkEnd w:id="131"/>
-    <w:bookmarkStart w:id="137" w:name="well-architected-framework-assessment"/>
+    <w:bookmarkEnd w:id="136"/>
+    <w:bookmarkEnd w:id="137"/>
+    <w:bookmarkStart w:id="143" w:name="well-architected-framework-assessment"/>
     <w:p>
       <w:pPr>
         <w:pStyle w:val="Heading2"/>
@@ -17064,7 +17165,7 @@
         <w:t xml:space="preserve">38. Well-Architected Framework Assessment</w:t>
       </w:r>
     </w:p>
-    <w:bookmarkStart w:id="132" w:name="reliability"/>
+    <w:bookmarkStart w:id="138" w:name="reliability"/>
     <w:p>
       <w:pPr>
         <w:pStyle w:val="Heading3"/>
@@ -17081,8 +17182,8 @@
         <w:t xml:space="preserve">The architecture uses persisted sagas, idempotency, conditional state transitions, manual fallback, and adaptive reconciliation. [Undocumented — architectural judgement] Reliability remains constrained by preview dependencies, unknown propagation, and untested end-to-end DR. [Derived]</w:t>
       </w:r>
     </w:p>
-    <w:bookmarkEnd w:id="132"/>
-    <w:bookmarkStart w:id="133" w:name="performance-efficiency"/>
+    <w:bookmarkEnd w:id="138"/>
+    <w:bookmarkStart w:id="139" w:name="performance-efficiency"/>
     <w:p>
       <w:pPr>
         <w:pStyle w:val="Heading3"/>
@@ -17099,8 +17200,8 @@
         <w:t xml:space="preserve">Cached reads support low-latency recommendations, but fresh validation is required before commit. [Undocumented — architectural judgement] The design trades some placement latency for correctness on safety-critical operations. [Undocumented — architectural judgement]</w:t>
       </w:r>
     </w:p>
-    <w:bookmarkEnd w:id="133"/>
-    <w:bookmarkStart w:id="134" w:name="cost-optimization"/>
+    <w:bookmarkEnd w:id="139"/>
+    <w:bookmarkStart w:id="140" w:name="cost-optimization"/>
     <w:p>
       <w:pPr>
         <w:pStyle w:val="Heading3"/>
@@ -17143,8 +17244,8 @@
         <w:t xml:space="preserve">FinOps engineering must validate the reservation discount scope for every provider–consumer subscription pair before cost modelling is presented to customers. [Derived] Cost models that assume the consumer subscription benefits from the provider’s RI discount without validating scope configuration will overstate the cost benefit of the shared CRG arrangement. [Derived] This constraint must be reviewed during customer onboarding and documented in the capacity reservation cost summary. [Undocumented — architectural judgement]</w:t>
       </w:r>
     </w:p>
-    <w:bookmarkEnd w:id="134"/>
-    <w:bookmarkStart w:id="135" w:name="security"/>
+    <w:bookmarkEnd w:id="140"/>
+    <w:bookmarkStart w:id="141" w:name="security"/>
     <w:p>
       <w:pPr>
         <w:pStyle w:val="Heading3"/>
@@ -17161,8 +17262,8 @@
         <w:t xml:space="preserve">Split identities, customer consent, narrow custom roles, approval separation, and immutable audit reduce privilege concentration. [Undocumented — architectural judgement] G-14 remains the primary unresolved security blocker. [Derived]</w:t>
       </w:r>
     </w:p>
-    <w:bookmarkEnd w:id="135"/>
-    <w:bookmarkStart w:id="136" w:name="operational-excellence"/>
+    <w:bookmarkEnd w:id="141"/>
+    <w:bookmarkStart w:id="142" w:name="operational-excellence"/>
     <w:p>
       <w:pPr>
         <w:pStyle w:val="Heading3"/>
@@ -17179,9 +17280,9 @@
         <w:t xml:space="preserve">Versioned policy, replayable scoring, dry runs, structured operations, and runbooks improve auditability. [Undocumented — architectural judgement] Operational maturity must be demonstrated through exercises rather than inferred from documentation. [Undocumented — architectural judgement]</w:t>
       </w:r>
     </w:p>
-    <w:bookmarkEnd w:id="136"/>
-    <w:bookmarkEnd w:id="137"/>
-    <w:bookmarkStart w:id="138" w:name="gap-closure-plan"/>
+    <w:bookmarkEnd w:id="142"/>
+    <w:bookmarkEnd w:id="143"/>
+    <w:bookmarkStart w:id="144" w:name="gap-closure-plan"/>
     <w:p>
       <w:pPr>
         <w:pStyle w:val="Heading2"/>
@@ -17749,9 +17850,9 @@
         </w:tc>
       </w:tr>
     </w:tbl>
-    <w:bookmarkEnd w:id="138"/>
-    <w:bookmarkEnd w:id="139"/>
-    <w:bookmarkStart w:id="164" w:name="part-iii-supporting-artifacts"/>
+    <w:bookmarkEnd w:id="144"/>
+    <w:bookmarkEnd w:id="145"/>
+    <w:bookmarkStart w:id="170" w:name="part-iii-supporting-artifacts"/>
     <w:p>
       <w:pPr>
         <w:pStyle w:val="Heading1"/>
@@ -17760,7 +17861,7 @@
         <w:t xml:space="preserve">Part III — Supporting Artifacts</w:t>
       </w:r>
     </w:p>
-    <w:bookmarkStart w:id="140" w:name="complete-risk-register"/>
+    <w:bookmarkStart w:id="146" w:name="complete-risk-register"/>
     <w:p>
       <w:pPr>
         <w:pStyle w:val="Heading2"/>
@@ -21658,8 +21759,8 @@
         </w:tc>
       </w:tr>
     </w:tbl>
-    <w:bookmarkEnd w:id="140"/>
-    <w:bookmarkStart w:id="146" w:name="operational-runbooks"/>
+    <w:bookmarkEnd w:id="146"/>
+    <w:bookmarkStart w:id="152" w:name="operational-runbooks"/>
     <w:p>
       <w:pPr>
         <w:pStyle w:val="Heading2"/>
@@ -21668,7 +21769,7 @@
         <w:t xml:space="preserve">41. Operational Runbooks</w:t>
       </w:r>
     </w:p>
-    <w:bookmarkStart w:id="141" w:name="runbook-a-capacity-exhaustion"/>
+    <w:bookmarkStart w:id="147" w:name="runbook-a-capacity-exhaustion"/>
     <w:p>
       <w:pPr>
         <w:pStyle w:val="Heading3"/>
@@ -21761,8 +21862,8 @@
         <w:t xml:space="preserve">Re-evaluate after confirmed state change; do not rely on elapsed time alone. [Undocumented — architectural judgement]</w:t>
       </w:r>
     </w:p>
-    <w:bookmarkEnd w:id="141"/>
-    <w:bookmarkStart w:id="142" w:name="runbook-b-forced-unsharing-request"/>
+    <w:bookmarkEnd w:id="147"/>
+    <w:bookmarkStart w:id="148" w:name="runbook-b-forced-unsharing-request"/>
     <w:p>
       <w:pPr>
         <w:pStyle w:val="Heading3"/>
@@ -21855,8 +21956,8 @@
         <w:t xml:space="preserve">Retain the impact record. [Undocumented — architectural judgement]</w:t>
       </w:r>
     </w:p>
-    <w:bookmarkEnd w:id="142"/>
-    <w:bookmarkStart w:id="143" w:name="runbook-c-tier-1-emergency-expansion"/>
+    <w:bookmarkEnd w:id="148"/>
+    <w:bookmarkStart w:id="149" w:name="runbook-c-tier-1-emergency-expansion"/>
     <w:p>
       <w:pPr>
         <w:pStyle w:val="Heading3"/>
@@ -21993,8 +22094,8 @@
         <w:t xml:space="preserve">[Undocumented — architectural judgement]</w:t>
       </w:r>
     </w:p>
-    <w:bookmarkEnd w:id="143"/>
-    <w:bookmarkStart w:id="144" w:name="runbook-d-tier-2-quota-neutral-transfer"/>
+    <w:bookmarkEnd w:id="149"/>
+    <w:bookmarkStart w:id="150" w:name="runbook-d-tier-2-quota-neutral-transfer"/>
     <w:p>
       <w:pPr>
         <w:pStyle w:val="Heading3"/>
@@ -22131,8 +22232,8 @@
         <w:t xml:space="preserve">[Undocumented — architectural judgement]</w:t>
       </w:r>
     </w:p>
-    <w:bookmarkEnd w:id="144"/>
-    <w:bookmarkStart w:id="145" w:name="runbook-e-failback"/>
+    <w:bookmarkEnd w:id="150"/>
+    <w:bookmarkStart w:id="151" w:name="runbook-e-failback"/>
     <w:p>
       <w:pPr>
         <w:pStyle w:val="Heading3"/>
@@ -22284,9 +22385,9 @@
         <w:t xml:space="preserve">[Undocumented — architectural judgement]</w:t>
       </w:r>
     </w:p>
-    <w:bookmarkEnd w:id="145"/>
-    <w:bookmarkEnd w:id="146"/>
-    <w:bookmarkStart w:id="148" w:name="poc-and-validation-plan"/>
+    <w:bookmarkEnd w:id="151"/>
+    <w:bookmarkEnd w:id="152"/>
+    <w:bookmarkStart w:id="154" w:name="poc-and-validation-plan"/>
     <w:p>
       <w:pPr>
         <w:pStyle w:val="Heading2"/>
@@ -22303,7 +22404,7 @@
         <w:t xml:space="preserve">The workbook is draft and pending execution; therefore its expected results are not production evidence. [Derived]</w:t>
       </w:r>
     </w:p>
-    <w:bookmarkStart w:id="147" w:name="critical-sequence"/>
+    <w:bookmarkStart w:id="153" w:name="critical-sequence"/>
     <w:p>
       <w:pPr>
         <w:pStyle w:val="Heading3"/>
@@ -22736,9 +22837,9 @@
         <w:t xml:space="preserve">[Undocumented — architectural judgement]</w:t>
       </w:r>
     </w:p>
-    <w:bookmarkEnd w:id="147"/>
-    <w:bookmarkEnd w:id="148"/>
-    <w:bookmarkStart w:id="159" w:name="workflow-diagrams"/>
+    <w:bookmarkEnd w:id="153"/>
+    <w:bookmarkEnd w:id="154"/>
+    <w:bookmarkStart w:id="165" w:name="workflow-diagrams"/>
     <w:p>
       <w:pPr>
         <w:pStyle w:val="Heading2"/>
@@ -22747,7 +22848,7 @@
         <w:t xml:space="preserve">43. Workflow Diagrams</w:t>
       </w:r>
     </w:p>
-    <w:bookmarkStart w:id="149" w:name="customer-onboarding"/>
+    <w:bookmarkStart w:id="155" w:name="customer-onboarding"/>
     <w:p>
       <w:pPr>
         <w:pStyle w:val="Heading3"/>
@@ -22884,8 +22985,8 @@
         <w:t xml:space="preserve">    Record --&gt; Ready[Onboarding Ready]</w:t>
       </w:r>
     </w:p>
-    <w:bookmarkEnd w:id="149"/>
-    <w:bookmarkStart w:id="150" w:name="region-selection"/>
+    <w:bookmarkEnd w:id="155"/>
+    <w:bookmarkStart w:id="156" w:name="region-selection"/>
     <w:p>
       <w:pPr>
         <w:pStyle w:val="Heading3"/>
@@ -22995,8 +23096,8 @@
         <w:t xml:space="preserve">    Commit -- Yes --&gt; Assignment[Persist Assignment]</w:t>
       </w:r>
     </w:p>
-    <w:bookmarkEnd w:id="150"/>
-    <w:bookmarkStart w:id="151" w:name="capacity-allocation"/>
+    <w:bookmarkEnd w:id="156"/>
+    <w:bookmarkStart w:id="157" w:name="capacity-allocation"/>
     <w:p>
       <w:pPr>
         <w:pStyle w:val="Heading3"/>
@@ -23097,8 +23198,8 @@
         <w:t xml:space="preserve">    Snapshot --&gt; Complete[Complete Operation]</w:t>
       </w:r>
     </w:p>
-    <w:bookmarkEnd w:id="151"/>
-    <w:bookmarkStart w:id="152" w:name="quota-allocation"/>
+    <w:bookmarkEnd w:id="157"/>
+    <w:bookmarkStart w:id="158" w:name="quota-allocation"/>
     <w:p>
       <w:pPr>
         <w:pStyle w:val="Heading3"/>
@@ -23217,8 +23318,8 @@
         <w:t xml:space="preserve">    Refresh --&gt; Complete</w:t>
       </w:r>
     </w:p>
-    <w:bookmarkEnd w:id="152"/>
-    <w:bookmarkStart w:id="153" w:name="capacity-sharing"/>
+    <w:bookmarkEnd w:id="158"/>
+    <w:bookmarkStart w:id="159" w:name="capacity-sharing"/>
     <w:p>
       <w:pPr>
         <w:pStyle w:val="Heading3"/>
@@ -23310,8 +23411,8 @@
         <w:t xml:space="preserve">    Verify --&gt; Active[Activate Sharing Relationship]</w:t>
       </w:r>
     </w:p>
-    <w:bookmarkEnd w:id="153"/>
-    <w:bookmarkStart w:id="154" w:name="dr-activation"/>
+    <w:bookmarkEnd w:id="159"/>
+    <w:bookmarkStart w:id="160" w:name="dr-activation"/>
     <w:p>
       <w:pPr>
         <w:pStyle w:val="Heading3"/>
@@ -23430,8 +23531,8 @@
         <w:t xml:space="preserve">    Final -- No --&gt; Hold[Enter Incident Hold]</w:t>
       </w:r>
     </w:p>
-    <w:bookmarkEnd w:id="154"/>
-    <w:bookmarkStart w:id="155" w:name="dr-failback"/>
+    <w:bookmarkEnd w:id="160"/>
+    <w:bookmarkStart w:id="161" w:name="dr-failback"/>
     <w:p>
       <w:pPr>
         <w:pStyle w:val="Heading3"/>
@@ -23550,8 +23651,8 @@
         <w:t xml:space="preserve">    Reconcile --&gt; Steady[Set Steady State]</w:t>
       </w:r>
     </w:p>
-    <w:bookmarkEnd w:id="155"/>
-    <w:bookmarkStart w:id="156" w:name="quota-reallocation"/>
+    <w:bookmarkEnd w:id="161"/>
+    <w:bookmarkStart w:id="162" w:name="quota-reallocation"/>
     <w:p>
       <w:pPr>
         <w:pStyle w:val="Heading3"/>
@@ -23661,8 +23762,8 @@
         <w:t xml:space="preserve">    RestorePlan --&gt; Complete[Complete Reallocation]</w:t>
       </w:r>
     </w:p>
-    <w:bookmarkEnd w:id="156"/>
-    <w:bookmarkStart w:id="157" w:name="capacity-exhaustion-handling"/>
+    <w:bookmarkEnd w:id="162"/>
+    <w:bookmarkStart w:id="163" w:name="capacity-exhaustion-handling"/>
     <w:p>
       <w:pPr>
         <w:pStyle w:val="Heading3"/>
@@ -23772,8 +23873,8 @@
         <w:t xml:space="preserve">    Increase --&gt; Reevaluate[Reevaluate After Confirmed Change]</w:t>
       </w:r>
     </w:p>
-    <w:bookmarkEnd w:id="157"/>
-    <w:bookmarkStart w:id="158" w:name="capacity-scaling"/>
+    <w:bookmarkEnd w:id="163"/>
+    <w:bookmarkStart w:id="164" w:name="capacity-scaling"/>
     <w:p>
       <w:pPr>
         <w:pStyle w:val="Heading3"/>
@@ -23901,9 +24002,9 @@
         <w:t xml:space="preserve">    Cooldown --&gt; Complete[Complete Request]</w:t>
       </w:r>
     </w:p>
-    <w:bookmarkEnd w:id="158"/>
-    <w:bookmarkEnd w:id="159"/>
-    <w:bookmarkStart w:id="161" w:name="decision-log-and-board-actions"/>
+    <w:bookmarkEnd w:id="164"/>
+    <w:bookmarkEnd w:id="165"/>
+    <w:bookmarkStart w:id="167" w:name="decision-log-and-board-actions"/>
     <w:p>
       <w:pPr>
         <w:pStyle w:val="Heading2"/>
@@ -24342,7 +24443,7 @@
         </w:tc>
       </w:tr>
     </w:tbl>
-    <w:bookmarkStart w:id="160" w:name="required-board-actions"/>
+    <w:bookmarkStart w:id="166" w:name="required-board-actions"/>
     <w:p>
       <w:pPr>
         <w:pStyle w:val="Heading3"/>
@@ -24443,9 +24544,9 @@
         <w:t xml:space="preserve">[Undocumented — architectural judgement]</w:t>
       </w:r>
     </w:p>
-    <w:bookmarkEnd w:id="160"/>
-    <w:bookmarkEnd w:id="161"/>
-    <w:bookmarkStart w:id="162" w:name="final-conclusion"/>
+    <w:bookmarkEnd w:id="166"/>
+    <w:bookmarkEnd w:id="167"/>
+    <w:bookmarkStart w:id="168" w:name="final-conclusion"/>
     <w:p>
       <w:pPr>
         <w:pStyle w:val="Heading2"/>
@@ -24581,8 +24682,8 @@
         </w:pict>
       </w:r>
     </w:p>
-    <w:bookmarkEnd w:id="162"/>
-    <w:bookmarkStart w:id="163" w:name="sources"/>
+    <w:bookmarkEnd w:id="168"/>
+    <w:bookmarkStart w:id="169" w:name="sources"/>
     <w:p>
       <w:pPr>
         <w:pStyle w:val="Heading2"/>
@@ -24593,14 +24694,56 @@
     </w:p>
     <w:p>
       <w:pPr>
+        <w:pStyle w:val="FirstParagraph"/>
+      </w:pPr>
+      <w:r>
+        <w:t xml:space="preserve">The source research documents that this Production Readiness Review reconciles are published in this repository under</w:t>
+      </w:r>
+      <w:r>
+        <w:t xml:space="preserve"> </w:t>
+      </w:r>
+      <w:hyperlink r:id="rId27">
+        <w:r>
+          <w:rPr>
+            <w:rStyle w:val="VerbatimChar"/>
+          </w:rPr>
+          <w:t xml:space="preserve">docs/research/</w:t>
+        </w:r>
+      </w:hyperlink>
+      <w:r>
+        <w:t xml:space="preserve">:</w:t>
+      </w:r>
+    </w:p>
+    <w:p>
+      <w:pPr>
         <w:numPr>
           <w:ilvl w:val="0"/>
           <w:numId w:val="1055"/>
         </w:numPr>
         <w:pStyle w:val="Compact"/>
       </w:pPr>
-      <w:r>
-        <w:t xml:space="preserve">multi_region_placement_design.md (uploaded document)</w:t>
+      <w:hyperlink r:id="rId23">
+        <w:r>
+          <w:rPr>
+            <w:rStyle w:val="Hyperlink"/>
+          </w:rPr>
+          <w:t xml:space="preserve">Multi-Region Placement Design</w:t>
+        </w:r>
+      </w:hyperlink>
+      <w:r>
+        <w:t xml:space="preserve"> </w:t>
+      </w:r>
+      <w:r>
+        <w:t xml:space="preserve">—</w:t>
+      </w:r>
+      <w:r>
+        <w:t xml:space="preserve"> </w:t>
+      </w:r>
+      <w:r>
+        <w:rPr>
+          <w:rStyle w:val="VerbatimChar"/>
+        </w:rPr>
+        <w:t xml:space="preserve">docs/research/multi_region_placement_design.md</w:t>
       </w:r>
     </w:p>
     <w:p>
@@ -24611,8 +24754,28 @@
         </w:numPr>
         <w:pStyle w:val="Compact"/>
       </w:pPr>
-      <w:r>
-        <w:t xml:space="preserve">design_change_summary.md (uploaded document)</w:t>
+      <w:hyperlink r:id="rId24">
+        <w:r>
+          <w:rPr>
+            <w:rStyle w:val="Hyperlink"/>
+          </w:rPr>
+          <w:t xml:space="preserve">Design Change Summary</w:t>
+        </w:r>
+      </w:hyperlink>
+      <w:r>
+        <w:t xml:space="preserve"> </w:t>
+      </w:r>
+      <w:r>
+        <w:t xml:space="preserve">—</w:t>
+      </w:r>
+      <w:r>
+        <w:t xml:space="preserve"> </w:t>
+      </w:r>
+      <w:r>
+        <w:rPr>
+          <w:rStyle w:val="VerbatimChar"/>
+        </w:rPr>
+        <w:t xml:space="preserve">docs/research/design_change_summary.md</w:t>
       </w:r>
     </w:p>
     <w:p>
@@ -24623,8 +24786,28 @@
         </w:numPr>
         <w:pStyle w:val="Compact"/>
       </w:pPr>
-      <w:r>
-        <w:t xml:space="preserve">acrme_requirements_traceability_review.md (uploaded document)</w:t>
+      <w:hyperlink r:id="rId25">
+        <w:r>
+          <w:rPr>
+            <w:rStyle w:val="Hyperlink"/>
+          </w:rPr>
+          <w:t xml:space="preserve">Requirements Traceability Review</w:t>
+        </w:r>
+      </w:hyperlink>
+      <w:r>
+        <w:t xml:space="preserve"> </w:t>
+      </w:r>
+      <w:r>
+        <w:t xml:space="preserve">—</w:t>
+      </w:r>
+      <w:r>
+        <w:t xml:space="preserve"> </w:t>
+      </w:r>
+      <w:r>
+        <w:rPr>
+          <w:rStyle w:val="VerbatimChar"/>
+        </w:rPr>
+        <w:t xml:space="preserve">docs/research/acrme_requirements_traceability_review.md</w:t>
       </w:r>
     </w:p>
     <w:p>
@@ -24635,8 +24818,28 @@
         </w:numPr>
         <w:pStyle w:val="Compact"/>
       </w:pPr>
-      <w:r>
-        <w:t xml:space="preserve">azure_cr_management_engine_design.md (uploaded document)</w:t>
+      <w:hyperlink r:id="rId22">
+        <w:r>
+          <w:rPr>
+            <w:rStyle w:val="Hyperlink"/>
+          </w:rPr>
+          <w:t xml:space="preserve">Azure CR Management Engine Design</w:t>
+        </w:r>
+      </w:hyperlink>
+      <w:r>
+        <w:t xml:space="preserve"> </w:t>
+      </w:r>
+      <w:r>
+        <w:t xml:space="preserve">—</w:t>
+      </w:r>
+      <w:r>
+        <w:t xml:space="preserve"> </w:t>
+      </w:r>
+      <w:r>
+        <w:rPr>
+          <w:rStyle w:val="VerbatimChar"/>
+        </w:rPr>
+        <w:t xml:space="preserve">docs/research/azure_cr_management_engine_design.md</w:t>
       </w:r>
     </w:p>
     <w:p>
@@ -24647,12 +24850,32 @@
         </w:numPr>
         <w:pStyle w:val="Compact"/>
       </w:pPr>
-      <w:r>
-        <w:t xml:space="preserve">azure_cr_poc_test_workbook.md (uploaded document)</w:t>
-      </w:r>
-    </w:p>
-    <w:bookmarkEnd w:id="163"/>
-    <w:bookmarkEnd w:id="164"/>
+      <w:hyperlink r:id="rId26">
+        <w:r>
+          <w:rPr>
+            <w:rStyle w:val="Hyperlink"/>
+          </w:rPr>
+          <w:t xml:space="preserve">Azure CR POC Test Workbook</w:t>
+        </w:r>
+      </w:hyperlink>
+      <w:r>
+        <w:t xml:space="preserve"> </w:t>
+      </w:r>
+      <w:r>
+        <w:t xml:space="preserve">—</w:t>
+      </w:r>
+      <w:r>
+        <w:t xml:space="preserve"> </w:t>
+      </w:r>
+      <w:r>
+        <w:rPr>
+          <w:rStyle w:val="VerbatimChar"/>
+        </w:rPr>
+        <w:t xml:space="preserve">docs/research/azure_cr_poc_test_workbook.md</w:t>
+      </w:r>
+    </w:p>
+    <w:bookmarkEnd w:id="169"/>
+    <w:bookmarkEnd w:id="170"/>
     <w:sectPr/>
   </w:body>
 </w:document>

</xml_diff>